<commit_message>
Add do codigo gerado
</commit_message>
<xml_diff>
--- a/docs/RELATORIO_TechChallenge_FASE3.docx
+++ b/docs/RELATORIO_TechChallenge_FASE3.docx
@@ -2219,7 +2219,7 @@
           <v:shape id="_x0000_i1026" type="#_x0000_t75" style="width:77.9pt;height:47.8pt" o:ole="">
             <v:imagedata r:id="rId11" o:title=""/>
           </v:shape>
-          <o:OLEObject Type="Embed" ProgID="Word.Document.12" ShapeID="_x0000_i1026" DrawAspect="Icon" ObjectID="_1838616709" r:id="rId12">
+          <o:OLEObject Type="Embed" ProgID="Word.Document.12" ShapeID="_x0000_i1026" DrawAspect="Icon" ObjectID="_1838703944" r:id="rId12">
             <o:FieldCodes>\s</o:FieldCodes>
           </o:OLEObject>
         </w:object>
@@ -2277,6 +2277,7 @@
           <w:color w:val="404040" w:themeColor="text1" w:themeTint="BF"/>
         </w:rPr>
       </w:pPr>
+      <w:proofErr w:type="gramStart"/>
       <w:r>
         <w:rPr>
           <w:rStyle w:val="nfaseSutil"/>
@@ -2297,6 +2298,7 @@
         </w:rPr>
         <w:t xml:space="preserve"> :</w:t>
       </w:r>
+      <w:proofErr w:type="gramEnd"/>
       <w:r>
         <w:rPr>
           <w:rStyle w:val="nfaseSutil"/>
@@ -2347,11 +2349,16 @@
         <w:t xml:space="preserve">(versão do </w:t>
       </w:r>
       <w:r>
-        <w:t>Google Colab</w:t>
+        <w:t xml:space="preserve">Google </w:t>
+      </w:r>
+      <w:proofErr w:type="gramStart"/>
+      <w:r>
+        <w:t>Colab</w:t>
       </w:r>
       <w:r>
         <w:t>(</w:t>
       </w:r>
+      <w:proofErr w:type="gramEnd"/>
       <w:r>
         <w:rPr>
           <w:noProof/>
@@ -2516,12 +2523,27 @@
         <w:t>Rainbow CSV</w:t>
       </w:r>
     </w:p>
+    <w:p>
+      <w:pPr>
+        <w:pStyle w:val="PargrafodaLista"/>
+        <w:numPr>
+          <w:ilvl w:val="0"/>
+          <w:numId w:val="1"/>
+        </w:numPr>
+      </w:pPr>
+      <w:bookmarkStart w:id="6" w:name="_Toc227556091"/>
+      <w:r>
+        <w:rPr>
+          <w:highlight w:val="red"/>
+        </w:rPr>
+        <w:t>&lt;COMPLETAR&gt;</w:t>
+      </w:r>
+    </w:p>
     <w:p/>
     <w:p>
       <w:pPr>
         <w:pStyle w:val="Ttulo2"/>
       </w:pPr>
-      <w:bookmarkStart w:id="6" w:name="_Toc227556091"/>
       <w:r>
         <w:t>Ambiente do GIT</w:t>
       </w:r>
@@ -2533,19 +2555,7 @@
           <w:rPr>
             <w:rStyle w:val="Hyperlink"/>
           </w:rPr>
-          <w:t>https://github.com/elberga</w:t>
-        </w:r>
-        <w:r>
-          <w:rPr>
-            <w:rStyle w:val="Hyperlink"/>
-          </w:rPr>
-          <w:t>l</w:t>
-        </w:r>
-        <w:r>
-          <w:rPr>
-            <w:rStyle w:val="Hyperlink"/>
-          </w:rPr>
-          <w:t>iza/Tech-Challenge-FIAP-FASE3</w:t>
+          <w:t>https://github.com/elbergaliza/Tech-Challenge-FIAP-FASE3</w:t>
         </w:r>
       </w:hyperlink>
     </w:p>
@@ -2579,7 +2589,10 @@
         <w:t xml:space="preserve"> &lt;dir&gt;</w:t>
       </w:r>
       <w:r>
-        <w:t>\Tech-Challenge-FIAP-FASE2</w:t>
+        <w:t>\Tech-Challenge-FIAP-FASE</w:t>
+      </w:r>
+      <w:r>
+        <w:t>3</w:t>
       </w:r>
       <w:r>
         <w:t xml:space="preserve">: </w:t>
@@ -2607,7 +2620,7 @@
         <w:t>\</w:t>
       </w:r>
       <w:r>
-        <w:t>ag</w:t>
+        <w:t>tunning</w:t>
       </w:r>
       <w:r>
         <w:t xml:space="preserve"> </w:t>
@@ -2616,10 +2629,27 @@
         <w:sym w:font="Wingdings" w:char="F0E0"/>
       </w:r>
       <w:r>
-        <w:t xml:space="preserve"> contem os fontes</w:t>
-      </w:r>
-      <w:r>
-        <w:t xml:space="preserve"> principais</w:t>
+        <w:t xml:space="preserve"> </w:t>
+      </w:r>
+      <w:r>
+        <w:t>contém</w:t>
+      </w:r>
+      <w:r>
+        <w:t xml:space="preserve"> </w:t>
+      </w:r>
+      <w:proofErr w:type="gramStart"/>
+      <w:r>
+        <w:t>os</w:t>
+      </w:r>
+      <w:r>
+        <w:t xml:space="preserve"> fontes</w:t>
+      </w:r>
+      <w:proofErr w:type="gramEnd"/>
+      <w:r>
+        <w:t xml:space="preserve"> </w:t>
+      </w:r>
+      <w:r>
+        <w:t>para o fine tunning</w:t>
       </w:r>
     </w:p>
     <w:p>
@@ -2635,10 +2665,49 @@
         <w:t>\</w:t>
       </w:r>
       <w:r>
-        <w:t>ag</w:t>
-      </w:r>
-      <w:r>
-        <w:t>\modelos --&gt; contém as classes</w:t>
+        <w:t xml:space="preserve">data </w:t>
+      </w:r>
+      <w:r>
+        <w:sym w:font="Wingdings" w:char="F0E0"/>
+      </w:r>
+      <w:r>
+        <w:t xml:space="preserve"> </w:t>
+      </w:r>
+      <w:r>
+        <w:t>contém</w:t>
+      </w:r>
+      <w:r>
+        <w:t xml:space="preserve"> o </w:t>
+      </w:r>
+      <w:r>
+        <w:t xml:space="preserve">Fundation Model, </w:t>
+      </w:r>
+      <w:r>
+        <w:t>modelo</w:t>
+      </w:r>
+      <w:r>
+        <w:t xml:space="preserve"> intermediarios</w:t>
+      </w:r>
+      <w:r>
+        <w:t xml:space="preserve">, metadados do modelo (informações estatísticas e </w:t>
+      </w:r>
+      <w:r>
+        <w:t>última</w:t>
+      </w:r>
+      <w:r>
+        <w:t xml:space="preserve"> data de treinamento) </w:t>
+      </w:r>
+      <w:r>
+        <w:rPr>
+          <w:color w:val="EE0000"/>
+        </w:rPr>
+        <w:t xml:space="preserve">e </w:t>
+      </w:r>
+      <w:r>
+        <w:rPr>
+          <w:color w:val="EE0000"/>
+        </w:rPr>
+        <w:t>os dados de treino e testes.</w:t>
       </w:r>
     </w:p>
     <w:p>
@@ -2651,75 +2720,16 @@
         <w:t>&lt;base&gt;</w:t>
       </w:r>
       <w:r>
-        <w:t>\</w:t>
-      </w:r>
-      <w:r>
-        <w:t xml:space="preserve">data </w:t>
+        <w:t>\docs</w:t>
+      </w:r>
+      <w:r>
+        <w:t xml:space="preserve"> </w:t>
       </w:r>
       <w:r>
         <w:sym w:font="Wingdings" w:char="F0E0"/>
       </w:r>
       <w:r>
-        <w:t xml:space="preserve"> </w:t>
-      </w:r>
-      <w:r>
-        <w:t>contém</w:t>
-      </w:r>
-      <w:r>
-        <w:t xml:space="preserve"> o modelo, metadados do modelo (informações estatísticas e </w:t>
-      </w:r>
-      <w:r>
-        <w:t>última</w:t>
-      </w:r>
-      <w:r>
-        <w:t xml:space="preserve"> data de treinamento) e </w:t>
-      </w:r>
-      <w:r>
-        <w:t>os dados de treino e testes.</w:t>
-      </w:r>
-    </w:p>
-    <w:p>
-      <w:r>
-        <w:rPr>
-          <w:i/>
-          <w:iCs/>
-          <w:color w:val="EE0000"/>
-        </w:rPr>
-        <w:t>&lt;base&gt;</w:t>
-      </w:r>
-      <w:r>
-        <w:t>\docs</w:t>
-      </w:r>
-      <w:r>
-        <w:t xml:space="preserve"> </w:t>
-      </w:r>
-      <w:r>
-        <w:sym w:font="Wingdings" w:char="F0E0"/>
-      </w:r>
-      <w:r>
         <w:t xml:space="preserve"> documentação do projeto</w:t>
-      </w:r>
-    </w:p>
-    <w:p>
-      <w:r>
-        <w:rPr>
-          <w:i/>
-          <w:iCs/>
-          <w:color w:val="EE0000"/>
-        </w:rPr>
-        <w:t>&lt;base&gt;</w:t>
-      </w:r>
-      <w:r>
-        <w:t>\tests</w:t>
-      </w:r>
-      <w:r>
-        <w:t xml:space="preserve"> </w:t>
-      </w:r>
-      <w:r>
-        <w:sym w:font="Wingdings" w:char="F0E0"/>
-      </w:r>
-      <w:r>
-        <w:t xml:space="preserve"> testes unitários</w:t>
       </w:r>
     </w:p>
     <w:p/>
@@ -3019,14 +3029,22 @@
         <w:rPr>
           <w:lang w:val="en-US"/>
         </w:rPr>
-        <w:t xml:space="preserve"> 1 </w:t>
+        <w:t xml:space="preserve">1 </w:t>
       </w:r>
       <w:r>
         <w:rPr>
           <w:lang w:val="en-US"/>
         </w:rPr>
-        <w:t>fine tunning</w:t>
-      </w:r>
+        <w:t xml:space="preserve">fine </w:t>
+      </w:r>
+      <w:proofErr w:type="gramStart"/>
+      <w:r>
+        <w:rPr>
+          <w:lang w:val="en-US"/>
+        </w:rPr>
+        <w:t>tunning</w:t>
+      </w:r>
+      <w:proofErr w:type="gramEnd"/>
     </w:p>
     <w:p>
       <w:pPr>
@@ -3130,6 +3148,26 @@
       </w:pPr>
       <w:r>
         <w:t>Outras métricas serão colocadas em outras mentorias</w:t>
+      </w:r>
+    </w:p>
+    <w:p>
+      <w:pPr>
+        <w:pStyle w:val="PargrafodaLista"/>
+        <w:numPr>
+          <w:ilvl w:val="1"/>
+          <w:numId w:val="8"/>
+        </w:numPr>
+        <w:spacing w:after="210"/>
+      </w:pPr>
+      <w:r>
+        <w:t xml:space="preserve">Durante o treinamento plotar em um gráfico a variação do </w:t>
+      </w:r>
+      <w:r>
+        <w:rPr>
+          <w:b/>
+          <w:bCs/>
+        </w:rPr>
+        <w:t>Training Loss</w:t>
       </w:r>
     </w:p>
     <w:p>
@@ -3566,8 +3604,13 @@
         </w:numPr>
       </w:pPr>
       <w:bookmarkStart w:id="13" w:name="_Toc227556097"/>
-      <w:r>
-        <w:t>TITULO 2</w:t>
+      <w:proofErr w:type="gramStart"/>
+      <w:r>
+        <w:t>TITULO</w:t>
+      </w:r>
+      <w:proofErr w:type="gramEnd"/>
+      <w:r>
+        <w:t xml:space="preserve"> 2</w:t>
       </w:r>
       <w:bookmarkEnd w:id="13"/>
     </w:p>
@@ -3600,12 +3643,21 @@
         </w:rPr>
       </w:pPr>
       <w:bookmarkStart w:id="14" w:name="_Toc227556098"/>
+      <w:proofErr w:type="gramStart"/>
       <w:r>
         <w:rPr>
           <w:b/>
           <w:bCs/>
         </w:rPr>
-        <w:t>TITULO 3</w:t>
+        <w:t>TITULO</w:t>
+      </w:r>
+      <w:proofErr w:type="gramEnd"/>
+      <w:r>
+        <w:rPr>
+          <w:b/>
+          <w:bCs/>
+        </w:rPr>
+        <w:t xml:space="preserve"> 3</w:t>
       </w:r>
       <w:bookmarkEnd w:id="14"/>
     </w:p>
@@ -3691,8 +3743,13 @@
         <w:pStyle w:val="Ttulo1"/>
       </w:pPr>
       <w:bookmarkStart w:id="16" w:name="_Toc227556100"/>
-      <w:r>
-        <w:t>TITULO 1</w:t>
+      <w:proofErr w:type="gramStart"/>
+      <w:r>
+        <w:t>TITULO</w:t>
+      </w:r>
+      <w:proofErr w:type="gramEnd"/>
+      <w:r>
+        <w:t xml:space="preserve"> 1</w:t>
       </w:r>
       <w:bookmarkEnd w:id="16"/>
     </w:p>
@@ -3712,8 +3769,13 @@
         </w:numPr>
       </w:pPr>
       <w:bookmarkStart w:id="17" w:name="_Toc227556101"/>
-      <w:r>
-        <w:t>TITULO 2</w:t>
+      <w:proofErr w:type="gramStart"/>
+      <w:r>
+        <w:t>TITULO</w:t>
+      </w:r>
+      <w:proofErr w:type="gramEnd"/>
+      <w:r>
+        <w:t xml:space="preserve"> 2</w:t>
       </w:r>
       <w:bookmarkEnd w:id="17"/>
     </w:p>
@@ -3746,12 +3808,21 @@
         </w:rPr>
       </w:pPr>
       <w:bookmarkStart w:id="18" w:name="_Toc227556102"/>
+      <w:proofErr w:type="gramStart"/>
       <w:r>
         <w:rPr>
           <w:b/>
           <w:bCs/>
         </w:rPr>
-        <w:t>TITULO 3</w:t>
+        <w:t>TITULO</w:t>
+      </w:r>
+      <w:proofErr w:type="gramEnd"/>
+      <w:r>
+        <w:rPr>
+          <w:b/>
+          <w:bCs/>
+        </w:rPr>
+        <w:t xml:space="preserve"> 3</w:t>
       </w:r>
       <w:bookmarkEnd w:id="18"/>
     </w:p>
@@ -3822,17 +3893,24 @@
         <w:pStyle w:val="Ttulo"/>
         <w:jc w:val="center"/>
       </w:pPr>
+      <w:proofErr w:type="gramStart"/>
       <w:r>
         <w:t>TITULO</w:t>
       </w:r>
+      <w:proofErr w:type="gramEnd"/>
     </w:p>
     <w:p>
       <w:pPr>
         <w:pStyle w:val="Ttulo1"/>
       </w:pPr>
       <w:bookmarkStart w:id="19" w:name="_Toc227556103"/>
-      <w:r>
-        <w:t>TITULO 1</w:t>
+      <w:proofErr w:type="gramStart"/>
+      <w:r>
+        <w:t>TITULO</w:t>
+      </w:r>
+      <w:proofErr w:type="gramEnd"/>
+      <w:r>
+        <w:t xml:space="preserve"> 1</w:t>
       </w:r>
       <w:bookmarkEnd w:id="19"/>
     </w:p>
@@ -3852,8 +3930,13 @@
         </w:numPr>
       </w:pPr>
       <w:bookmarkStart w:id="20" w:name="_Toc227556104"/>
-      <w:r>
-        <w:t>TITULO 2</w:t>
+      <w:proofErr w:type="gramStart"/>
+      <w:r>
+        <w:t>TITULO</w:t>
+      </w:r>
+      <w:proofErr w:type="gramEnd"/>
+      <w:r>
+        <w:t xml:space="preserve"> 2</w:t>
       </w:r>
       <w:bookmarkEnd w:id="20"/>
     </w:p>
@@ -3886,12 +3969,21 @@
         </w:rPr>
       </w:pPr>
       <w:bookmarkStart w:id="21" w:name="_Toc227556105"/>
+      <w:proofErr w:type="gramStart"/>
       <w:r>
         <w:rPr>
           <w:b/>
           <w:bCs/>
         </w:rPr>
-        <w:t>TITULO 3</w:t>
+        <w:t>TITULO</w:t>
+      </w:r>
+      <w:proofErr w:type="gramEnd"/>
+      <w:r>
+        <w:rPr>
+          <w:b/>
+          <w:bCs/>
+        </w:rPr>
+        <w:t xml:space="preserve"> 3</w:t>
       </w:r>
       <w:bookmarkEnd w:id="21"/>
     </w:p>
@@ -5812,7 +5904,7 @@
   <w:style w:type="paragraph" w:default="1" w:styleId="Normal">
     <w:name w:val="Normal"/>
     <w:qFormat/>
-    <w:rsid w:val="00C57B38"/>
+    <w:rsid w:val="000A7C7F"/>
   </w:style>
   <w:style w:type="paragraph" w:styleId="Ttulo1">
     <w:name w:val="heading 1"/>
@@ -6013,7 +6105,6 @@
   <w:style w:type="character" w:default="1" w:styleId="Fontepargpadro">
     <w:name w:val="Default Paragraph Font"/>
     <w:uiPriority w:val="1"/>
-    <w:semiHidden/>
     <w:unhideWhenUsed/>
   </w:style>
   <w:style w:type="table" w:default="1" w:styleId="Tabelanormal">

</xml_diff>

<commit_message>
Em 01: Acerto dos comentarios no codigo e no relatorio tecnico. Em 02: Correcao dos erros de imports.
</commit_message>
<xml_diff>
--- a/docs/RELATORIO_TechChallenge_FASE3.docx
+++ b/docs/RELATORIO_TechChallenge_FASE3.docx
@@ -61,15 +61,7 @@
         <w:jc w:val="center"/>
       </w:pPr>
       <w:r>
-        <w:t xml:space="preserve">Tech </w:t>
-      </w:r>
-      <w:proofErr w:type="spellStart"/>
-      <w:r>
-        <w:t>Challenge</w:t>
-      </w:r>
-      <w:proofErr w:type="spellEnd"/>
-      <w:r>
-        <w:t xml:space="preserve"> – Fase </w:t>
+        <w:t xml:space="preserve">Tech Challenge – Fase </w:t>
       </w:r>
       <w:r>
         <w:t>3</w:t>
@@ -138,15 +130,7 @@
         </w:numPr>
       </w:pPr>
       <w:r>
-        <w:t xml:space="preserve">Guilherme Lima </w:t>
-      </w:r>
-      <w:proofErr w:type="spellStart"/>
-      <w:r>
-        <w:t>Montanhini</w:t>
-      </w:r>
-      <w:proofErr w:type="spellEnd"/>
-      <w:r>
-        <w:t xml:space="preserve"> – guilherme.lima.montanhini@gmail.com</w:t>
+        <w:t>Guilherme Lima Montanhini – guilherme.lima.montanhini@gmail.com</w:t>
       </w:r>
     </w:p>
     <w:p>
@@ -156,13 +140,8 @@
           <w:numId w:val="3"/>
         </w:numPr>
       </w:pPr>
-      <w:proofErr w:type="spellStart"/>
-      <w:r>
-        <w:t>Thalles</w:t>
-      </w:r>
-      <w:proofErr w:type="spellEnd"/>
-      <w:r>
-        <w:t xml:space="preserve"> Lopes Mendonça de Freitas – lopthalles@gmail.com</w:t>
+      <w:r>
+        <w:t>Thalles Lopes Mendonça de Freitas – lopthalles@gmail.com</w:t>
       </w:r>
     </w:p>
     <w:p>
@@ -1855,13 +1834,8 @@
         <w:t xml:space="preserve">relatório técnico </w:t>
       </w:r>
       <w:r>
-        <w:t xml:space="preserve">do Tech </w:t>
-      </w:r>
-      <w:proofErr w:type="spellStart"/>
-      <w:r>
-        <w:t>Challenge</w:t>
-      </w:r>
-      <w:proofErr w:type="spellEnd"/>
+        <w:t>do Tech Challenge</w:t>
+      </w:r>
       <w:r>
         <w:t xml:space="preserve"> </w:t>
       </w:r>
@@ -1937,7 +1911,6 @@
       <w:r>
         <w:t xml:space="preserve"> ideia é organizar fluxos de decisão automatizados e seguros, onde, por exemplo, ao receber informações sobre um paciente, o sistema possa acionar diferentes etapas, como verificar exames pendentes, sugerir tratamentos e emitir alertas para a equipe médica — tudo isso coordenado com </w:t>
       </w:r>
-      <w:proofErr w:type="spellStart"/>
       <w:r>
         <w:rPr>
           <w:b/>
@@ -1945,7 +1918,6 @@
         </w:rPr>
         <w:t>LangChain</w:t>
       </w:r>
-      <w:proofErr w:type="spellEnd"/>
       <w:r>
         <w:t>.</w:t>
       </w:r>
@@ -2247,7 +2219,7 @@
           <v:shape id="_x0000_i1026" type="#_x0000_t75" style="width:79.2pt;height:50.4pt" o:ole="">
             <v:imagedata r:id="rId11" o:title=""/>
           </v:shape>
-          <o:OLEObject Type="Embed" ProgID="Word.Document.12" ShapeID="_x0000_i1026" DrawAspect="Icon" ObjectID="_1838869483" r:id="rId12">
+          <o:OLEObject Type="Embed" ProgID="Word.Document.12" ShapeID="_x0000_i1026" DrawAspect="Icon" ObjectID="_1839224588" r:id="rId12">
             <o:FieldCodes>\s</o:FieldCodes>
           </o:OLEObject>
         </w:object>
@@ -2305,8 +2277,6 @@
           <w:color w:val="404040" w:themeColor="text1" w:themeTint="BF"/>
         </w:rPr>
       </w:pPr>
-      <w:proofErr w:type="spellStart"/>
-      <w:proofErr w:type="gramStart"/>
       <w:r>
         <w:rPr>
           <w:rStyle w:val="nfaseSutil"/>
@@ -2319,7 +2289,6 @@
         </w:rPr>
         <w:t>ypy</w:t>
       </w:r>
-      <w:proofErr w:type="spellEnd"/>
       <w:r>
         <w:rPr>
           <w:rStyle w:val="nfaseSutil"/>
@@ -2328,7 +2297,6 @@
         </w:rPr>
         <w:t xml:space="preserve"> :</w:t>
       </w:r>
-      <w:proofErr w:type="gramEnd"/>
       <w:r>
         <w:rPr>
           <w:rStyle w:val="nfaseSutil"/>
@@ -2340,32 +2308,11 @@
       <w:r>
         <w:t xml:space="preserve">verifica os </w:t>
       </w:r>
-      <w:proofErr w:type="spellStart"/>
-      <w:r>
-        <w:t>type</w:t>
-      </w:r>
-      <w:proofErr w:type="spellEnd"/>
-      <w:r>
-        <w:t xml:space="preserve"> </w:t>
-      </w:r>
-      <w:proofErr w:type="spellStart"/>
-      <w:r>
-        <w:t>hints</w:t>
-      </w:r>
-      <w:proofErr w:type="spellEnd"/>
-      <w:r>
-        <w:t xml:space="preserve">, </w:t>
-      </w:r>
-      <w:r>
-        <w:t xml:space="preserve">capaz de detectar muitos erros de programação analisando seu programa, sem precisar executá-lo. O </w:t>
-      </w:r>
-      <w:proofErr w:type="spellStart"/>
-      <w:r>
-        <w:t>mypy</w:t>
-      </w:r>
-      <w:proofErr w:type="spellEnd"/>
-      <w:r>
-        <w:t xml:space="preserve"> possui um sistema de tipos robusto com recursos como inferência de tipos, tipagem gradual, genéricos e tipos de união.</w:t>
+      <w:r>
+        <w:t xml:space="preserve">type hints, </w:t>
+      </w:r>
+      <w:r>
+        <w:t>capaz de detectar muitos erros de programação analisando seu programa, sem precisar executá-lo. O mypy possui um sistema de tipos robusto com recursos como inferência de tipos, tipagem gradual, genéricos e tipos de união.</w:t>
       </w:r>
     </w:p>
     <w:p>
@@ -2400,16 +2347,11 @@
         <w:t xml:space="preserve">(versão do </w:t>
       </w:r>
       <w:r>
-        <w:t xml:space="preserve">Google </w:t>
-      </w:r>
-      <w:proofErr w:type="gramStart"/>
-      <w:r>
-        <w:t>Colab</w:t>
+        <w:t>Google Colab</w:t>
       </w:r>
       <w:r>
         <w:t>(</w:t>
       </w:r>
-      <w:proofErr w:type="gramEnd"/>
       <w:r>
         <w:rPr>
           <w:noProof/>
@@ -2493,13 +2435,8 @@
         </w:numPr>
       </w:pPr>
       <w:r>
-        <w:t xml:space="preserve">Todo </w:t>
-      </w:r>
-      <w:proofErr w:type="spellStart"/>
-      <w:r>
-        <w:t>Tree</w:t>
-      </w:r>
-      <w:proofErr w:type="spellEnd"/>
+        <w:t>Todo Tree</w:t>
+      </w:r>
     </w:p>
     <w:p>
       <w:pPr>
@@ -2519,19 +2456,9 @@
           <w:numId w:val="1"/>
         </w:numPr>
       </w:pPr>
-      <w:proofErr w:type="spellStart"/>
-      <w:r>
-        <w:t>Jupyter</w:t>
-      </w:r>
-      <w:proofErr w:type="spellEnd"/>
-      <w:r>
-        <w:t xml:space="preserve"> </w:t>
-      </w:r>
-      <w:proofErr w:type="spellStart"/>
-      <w:r>
-        <w:t>Keymap</w:t>
-      </w:r>
-      <w:proofErr w:type="spellEnd"/>
+      <w:r>
+        <w:t>Jupyter Keymap</w:t>
+      </w:r>
     </w:p>
     <w:p>
       <w:pPr>
@@ -2541,21 +2468,9 @@
         </w:numPr>
       </w:pPr>
       <w:r>
-        <w:t xml:space="preserve">Material </w:t>
-      </w:r>
-      <w:proofErr w:type="spellStart"/>
-      <w:r>
-        <w:t>Icon</w:t>
-      </w:r>
-      <w:proofErr w:type="spellEnd"/>
-      <w:r>
-        <w:t xml:space="preserve"> </w:t>
-      </w:r>
-      <w:proofErr w:type="spellStart"/>
-      <w:r>
-        <w:t>Theme</w:t>
-      </w:r>
-      <w:proofErr w:type="spellEnd"/>
+        <w:lastRenderedPageBreak/>
+        <w:t>Material Icon Theme</w:t>
+      </w:r>
     </w:p>
     <w:p>
       <w:pPr>
@@ -2564,12 +2479,9 @@
           <w:numId w:val="1"/>
         </w:numPr>
       </w:pPr>
-      <w:proofErr w:type="spellStart"/>
-      <w:r>
-        <w:lastRenderedPageBreak/>
+      <w:r>
         <w:t>Pylace</w:t>
       </w:r>
-      <w:proofErr w:type="spellEnd"/>
     </w:p>
     <w:p>
       <w:pPr>
@@ -2590,13 +2502,8 @@
         </w:numPr>
       </w:pPr>
       <w:r>
-        <w:t xml:space="preserve">Python </w:t>
-      </w:r>
-      <w:proofErr w:type="spellStart"/>
-      <w:r>
-        <w:t>Debugger</w:t>
-      </w:r>
-      <w:proofErr w:type="spellEnd"/>
+        <w:t>Python Debugger</w:t>
+      </w:r>
     </w:p>
     <w:p>
       <w:pPr>
@@ -2672,15 +2579,7 @@
         <w:sym w:font="Wingdings" w:char="F0E0"/>
       </w:r>
       <w:r>
-        <w:t xml:space="preserve"> &lt;</w:t>
-      </w:r>
-      <w:proofErr w:type="spellStart"/>
-      <w:r>
-        <w:t>dir</w:t>
-      </w:r>
-      <w:proofErr w:type="spellEnd"/>
-      <w:r>
-        <w:t>&gt;</w:t>
+        <w:t xml:space="preserve"> &lt;dir&gt;</w:t>
       </w:r>
       <w:r>
         <w:t>\Tech-Challenge-FIAP-FASE</w:t>
@@ -2713,11 +2612,9 @@
       <w:r>
         <w:t>\</w:t>
       </w:r>
-      <w:proofErr w:type="spellStart"/>
       <w:r>
         <w:t>tunning</w:t>
       </w:r>
-      <w:proofErr w:type="spellEnd"/>
       <w:r>
         <w:t xml:space="preserve"> </w:t>
       </w:r>
@@ -2733,25 +2630,15 @@
       <w:r>
         <w:t xml:space="preserve"> </w:t>
       </w:r>
-      <w:proofErr w:type="gramStart"/>
-      <w:r>
-        <w:t>os</w:t>
-      </w:r>
-      <w:r>
-        <w:t xml:space="preserve"> fontes</w:t>
-      </w:r>
-      <w:proofErr w:type="gramEnd"/>
+      <w:r>
+        <w:t>as fontes</w:t>
+      </w:r>
       <w:r>
         <w:t xml:space="preserve"> </w:t>
       </w:r>
       <w:r>
-        <w:t xml:space="preserve">para o fine </w:t>
-      </w:r>
-      <w:proofErr w:type="spellStart"/>
-      <w:r>
-        <w:t>tunning</w:t>
-      </w:r>
-      <w:proofErr w:type="spellEnd"/>
+        <w:t>para o fine tunning</w:t>
+      </w:r>
     </w:p>
     <w:p>
       <w:r>
@@ -2801,88 +2688,16 @@
         <w:t>\</w:t>
       </w:r>
       <w:r>
-        <w:t>data</w:t>
-      </w:r>
-      <w:r>
-        <w:t>\</w:t>
-      </w:r>
-      <w:proofErr w:type="spellStart"/>
-      <w:r>
-        <w:t>processed</w:t>
-      </w:r>
-      <w:proofErr w:type="spellEnd"/>
-    </w:p>
-    <w:p>
-      <w:pPr>
-        <w:ind w:left="708"/>
-      </w:pPr>
-      <w:proofErr w:type="spellStart"/>
-      <w:r>
-        <w:t>medpt_qa_</w:t>
-      </w:r>
-      <w:proofErr w:type="gramStart"/>
-      <w:r>
-        <w:t>manifest.jsonl</w:t>
-      </w:r>
-      <w:proofErr w:type="spellEnd"/>
-      <w:proofErr w:type="gramEnd"/>
-      <w:r>
-        <w:t xml:space="preserve"> </w:t>
+        <w:t xml:space="preserve">data\processed </w:t>
       </w:r>
       <w:r>
         <w:sym w:font="Wingdings" w:char="F0E0"/>
       </w:r>
       <w:r>
-        <w:t xml:space="preserve"> dataset </w:t>
-      </w:r>
-      <w:r>
-        <w:t xml:space="preserve">em formato </w:t>
-      </w:r>
-      <w:proofErr w:type="spellStart"/>
-      <w:r>
-        <w:t>json</w:t>
-      </w:r>
-      <w:proofErr w:type="spellEnd"/>
-      <w:r>
-        <w:t xml:space="preserve"> </w:t>
-      </w:r>
-      <w:r>
-        <w:rPr>
-          <w:highlight w:val="red"/>
-        </w:rPr>
-        <w:t>(?????????</w:t>
-      </w:r>
-      <w:r>
-        <w:t>)</w:t>
-      </w:r>
-    </w:p>
-    <w:p>
-      <w:pPr>
-        <w:ind w:left="708"/>
-      </w:pPr>
-      <w:proofErr w:type="spellStart"/>
-      <w:r>
-        <w:t>medpt_qa_</w:t>
-      </w:r>
-      <w:proofErr w:type="gramStart"/>
-      <w:r>
-        <w:t>report.json</w:t>
-      </w:r>
-      <w:proofErr w:type="spellEnd"/>
-      <w:proofErr w:type="gramEnd"/>
-      <w:r>
-        <w:t xml:space="preserve"> -&gt; </w:t>
-      </w:r>
-      <w:proofErr w:type="spellStart"/>
-      <w:r>
-        <w:t>relatorio</w:t>
-      </w:r>
-      <w:proofErr w:type="spellEnd"/>
-      <w:r>
-        <w:t xml:space="preserve"> do</w:t>
-      </w:r>
-      <w:r>
-        <w:t xml:space="preserve"> processamento do dataset.</w:t>
+        <w:t xml:space="preserve"> resultado da limpeza e separação do dataset</w:t>
+      </w:r>
+      <w:r>
+        <w:t>. VIDE ABAIXO.</w:t>
       </w:r>
     </w:p>
     <w:p>
@@ -2898,64 +2713,15 @@
         <w:t>\</w:t>
       </w:r>
       <w:r>
-        <w:t>data\</w:t>
-      </w:r>
-      <w:proofErr w:type="spellStart"/>
-      <w:r>
-        <w:t>processed</w:t>
-      </w:r>
-      <w:proofErr w:type="spellEnd"/>
-      <w:r>
-        <w:t>\</w:t>
-      </w:r>
-      <w:proofErr w:type="spellStart"/>
-      <w:r>
-        <w:t>med</w:t>
-      </w:r>
-      <w:r>
-        <w:t>pt_</w:t>
-      </w:r>
-      <w:r>
-        <w:t>qa</w:t>
-      </w:r>
-      <w:proofErr w:type="spellEnd"/>
-      <w:r>
-        <w:t xml:space="preserve"> </w:t>
+        <w:t xml:space="preserve">data\rag </w:t>
       </w:r>
       <w:r>
         <w:sym w:font="Wingdings" w:char="F0E0"/>
       </w:r>
       <w:r>
-        <w:t xml:space="preserve"> </w:t>
-      </w:r>
-      <w:proofErr w:type="gramStart"/>
-      <w:r>
-        <w:t>contem</w:t>
-      </w:r>
-      <w:proofErr w:type="gramEnd"/>
-      <w:r>
-        <w:t xml:space="preserve"> </w:t>
-      </w:r>
-      <w:r>
-        <w:t xml:space="preserve">o dataset separado em validação, teste e treino nos diretórios. </w:t>
-      </w:r>
-      <w:r>
-        <w:rPr>
-          <w:highlight w:val="red"/>
-        </w:rPr>
-        <w:t xml:space="preserve">VERIFICAR OS ARQUIVOS EM CADA UM </w:t>
-      </w:r>
-      <w:proofErr w:type="gramStart"/>
-      <w:r>
-        <w:rPr>
-          <w:highlight w:val="red"/>
-        </w:rPr>
-        <w:t>DELES !!!</w:t>
-      </w:r>
-      <w:proofErr w:type="gramEnd"/>
-    </w:p>
-    <w:p/>
-    <w:p/>
+        <w:t>arquivos a serem consumidos para o RAG</w:t>
+      </w:r>
+    </w:p>
     <w:p>
       <w:r>
         <w:rPr>
@@ -2966,19 +2732,8 @@
         <w:t>&lt;base&gt;</w:t>
       </w:r>
       <w:r>
-        <w:t>\</w:t>
-      </w:r>
-      <w:r>
-        <w:t>data</w:t>
-      </w:r>
-      <w:r>
-        <w:t>\</w:t>
-      </w:r>
-      <w:proofErr w:type="spellStart"/>
-      <w:r>
-        <w:t>rag</w:t>
-      </w:r>
-      <w:proofErr w:type="spellEnd"/>
+        <w:t>\docs</w:t>
+      </w:r>
       <w:r>
         <w:t xml:space="preserve"> </w:t>
       </w:r>
@@ -2986,122 +2741,2999 @@
         <w:sym w:font="Wingdings" w:char="F0E0"/>
       </w:r>
       <w:r>
-        <w:t>arquivos a serem consumidos para o RAG</w:t>
-      </w:r>
-    </w:p>
-    <w:p>
-      <w:r>
-        <w:t>contém</w:t>
-      </w:r>
-      <w:r>
-        <w:t xml:space="preserve"> o </w:t>
-      </w:r>
-      <w:proofErr w:type="spellStart"/>
-      <w:r>
-        <w:t>Fundation</w:t>
-      </w:r>
-      <w:proofErr w:type="spellEnd"/>
-      <w:r>
-        <w:t xml:space="preserve"> Model</w:t>
-      </w:r>
-      <w:r>
+        <w:t xml:space="preserve"> documentação do projeto</w:t>
+      </w:r>
+    </w:p>
+    <w:p/>
+    <w:p>
+      <w:pPr>
+        <w:rPr>
+          <w:b/>
+          <w:bCs/>
+        </w:rPr>
+      </w:pPr>
+      <w:r>
+        <w:rPr>
+          <w:b/>
+          <w:bCs/>
+        </w:rPr>
+        <w:t>Arquivos gerados:</w:t>
+      </w:r>
+    </w:p>
+    <w:p>
+      <w:r>
+        <w:drawing>
+          <wp:inline distT="0" distB="0" distL="0" distR="0" wp14:anchorId="45B84015" wp14:editId="2E6998C5">
+            <wp:extent cx="5400040" cy="2408555"/>
+            <wp:effectExtent l="0" t="0" r="0" b="0"/>
+            <wp:docPr id="438861972" name="Imagem 1"/>
+            <wp:cNvGraphicFramePr>
+              <a:graphicFrameLocks xmlns:a="http://schemas.openxmlformats.org/drawingml/2006/main" noChangeAspect="1"/>
+            </wp:cNvGraphicFramePr>
+            <a:graphic xmlns:a="http://schemas.openxmlformats.org/drawingml/2006/main">
+              <a:graphicData uri="http://schemas.openxmlformats.org/drawingml/2006/picture">
+                <pic:pic xmlns:pic="http://schemas.openxmlformats.org/drawingml/2006/picture">
+                  <pic:nvPicPr>
+                    <pic:cNvPr id="438861972" name=""/>
+                    <pic:cNvPicPr/>
+                  </pic:nvPicPr>
+                  <pic:blipFill>
+                    <a:blip r:embed="rId15"/>
+                    <a:stretch>
+                      <a:fillRect/>
+                    </a:stretch>
+                  </pic:blipFill>
+                  <pic:spPr>
+                    <a:xfrm>
+                      <a:off x="0" y="0"/>
+                      <a:ext cx="5400040" cy="2408555"/>
+                    </a:xfrm>
+                    <a:prstGeom prst="rect">
+                      <a:avLst/>
+                    </a:prstGeom>
+                  </pic:spPr>
+                </pic:pic>
+              </a:graphicData>
+            </a:graphic>
+          </wp:inline>
+        </w:drawing>
+      </w:r>
+    </w:p>
+    <w:p>
+      <w:pPr>
+        <w:rPr>
+          <w:b/>
+          <w:bCs/>
+        </w:rPr>
+      </w:pPr>
+    </w:p>
+    <w:tbl>
+      <w:tblPr>
+        <w:tblW w:w="8080" w:type="dxa"/>
+        <w:tblCellMar>
+          <w:left w:w="70" w:type="dxa"/>
+          <w:right w:w="70" w:type="dxa"/>
+        </w:tblCellMar>
+        <w:tblLook w:val="04A0" w:firstRow="1" w:lastRow="0" w:firstColumn="1" w:lastColumn="0" w:noHBand="0" w:noVBand="1"/>
+      </w:tblPr>
+      <w:tblGrid>
+        <w:gridCol w:w="1000"/>
+        <w:gridCol w:w="2120"/>
+        <w:gridCol w:w="860"/>
+        <w:gridCol w:w="4100"/>
+      </w:tblGrid>
+      <w:tr>
+        <w:trPr>
+          <w:trHeight w:val="324"/>
+        </w:trPr>
+        <w:tc>
+          <w:tcPr>
+            <w:tcW w:w="1000" w:type="dxa"/>
+            <w:tcBorders>
+              <w:top w:val="single" w:sz="8" w:space="0" w:color="auto"/>
+              <w:left w:val="single" w:sz="8" w:space="0" w:color="auto"/>
+              <w:bottom w:val="single" w:sz="8" w:space="0" w:color="auto"/>
+              <w:right w:val="single" w:sz="8" w:space="0" w:color="auto"/>
+            </w:tcBorders>
+            <w:vAlign w:val="center"/>
+            <w:hideMark/>
+          </w:tcPr>
+          <w:p>
+            <w:pPr>
+              <w:spacing w:after="0" w:line="240" w:lineRule="auto"/>
+              <w:rPr>
+                <w:rFonts w:ascii="Aptos" w:eastAsia="Times New Roman" w:hAnsi="Aptos" w:cs="Calibri"/>
+                <w:b/>
+                <w:bCs/>
+                <w:color w:val="000000"/>
+                <w:kern w:val="0"/>
+                <w:lang w:eastAsia="pt-BR"/>
+                <w14:ligatures w14:val="none"/>
+              </w:rPr>
+            </w:pPr>
+            <w:r>
+              <w:rPr>
+                <w:rFonts w:ascii="Aptos" w:eastAsia="Times New Roman" w:hAnsi="Aptos" w:cs="Calibri"/>
+                <w:b/>
+                <w:bCs/>
+                <w:color w:val="000000"/>
+                <w:kern w:val="0"/>
+                <w:lang w:eastAsia="pt-BR"/>
+                <w14:ligatures w14:val="none"/>
+              </w:rPr>
+              <w:t>Ordem</w:t>
+            </w:r>
+          </w:p>
+        </w:tc>
+        <w:tc>
+          <w:tcPr>
+            <w:tcW w:w="2120" w:type="dxa"/>
+            <w:tcBorders>
+              <w:top w:val="single" w:sz="8" w:space="0" w:color="auto"/>
+              <w:left w:val="nil"/>
+              <w:bottom w:val="single" w:sz="8" w:space="0" w:color="auto"/>
+              <w:right w:val="single" w:sz="8" w:space="0" w:color="auto"/>
+            </w:tcBorders>
+            <w:vAlign w:val="center"/>
+            <w:hideMark/>
+          </w:tcPr>
+          <w:p>
+            <w:pPr>
+              <w:spacing w:after="0" w:line="240" w:lineRule="auto"/>
+              <w:rPr>
+                <w:rFonts w:ascii="Aptos" w:eastAsia="Times New Roman" w:hAnsi="Aptos" w:cs="Calibri"/>
+                <w:b/>
+                <w:bCs/>
+                <w:color w:val="000000"/>
+                <w:kern w:val="0"/>
+                <w:lang w:eastAsia="pt-BR"/>
+                <w14:ligatures w14:val="none"/>
+              </w:rPr>
+            </w:pPr>
+            <w:r>
+              <w:rPr>
+                <w:rFonts w:ascii="Aptos" w:eastAsia="Times New Roman" w:hAnsi="Aptos" w:cs="Calibri"/>
+                <w:b/>
+                <w:bCs/>
+                <w:color w:val="000000"/>
+                <w:kern w:val="0"/>
+                <w:lang w:eastAsia="pt-BR"/>
+                <w14:ligatures w14:val="none"/>
+              </w:rPr>
+              <w:t>Arquivo / destino</w:t>
+            </w:r>
+          </w:p>
+        </w:tc>
+        <w:tc>
+          <w:tcPr>
+            <w:tcW w:w="860" w:type="dxa"/>
+            <w:tcBorders>
+              <w:top w:val="single" w:sz="8" w:space="0" w:color="auto"/>
+              <w:left w:val="nil"/>
+              <w:bottom w:val="single" w:sz="8" w:space="0" w:color="auto"/>
+              <w:right w:val="single" w:sz="8" w:space="0" w:color="auto"/>
+            </w:tcBorders>
+            <w:vAlign w:val="center"/>
+            <w:hideMark/>
+          </w:tcPr>
+          <w:p>
+            <w:pPr>
+              <w:spacing w:after="0" w:line="240" w:lineRule="auto"/>
+              <w:rPr>
+                <w:rFonts w:ascii="Aptos" w:eastAsia="Times New Roman" w:hAnsi="Aptos" w:cs="Calibri"/>
+                <w:b/>
+                <w:bCs/>
+                <w:color w:val="000000"/>
+                <w:kern w:val="0"/>
+                <w:lang w:eastAsia="pt-BR"/>
+                <w14:ligatures w14:val="none"/>
+              </w:rPr>
+            </w:pPr>
+            <w:r>
+              <w:rPr>
+                <w:rFonts w:ascii="Aptos" w:eastAsia="Times New Roman" w:hAnsi="Aptos" w:cs="Calibri"/>
+                <w:b/>
+                <w:bCs/>
+                <w:color w:val="000000"/>
+                <w:kern w:val="0"/>
+                <w:lang w:eastAsia="pt-BR"/>
+                <w14:ligatures w14:val="none"/>
+              </w:rPr>
+              <w:t>Tipo</w:t>
+            </w:r>
+          </w:p>
+        </w:tc>
+        <w:tc>
+          <w:tcPr>
+            <w:tcW w:w="4100" w:type="dxa"/>
+            <w:tcBorders>
+              <w:top w:val="single" w:sz="8" w:space="0" w:color="auto"/>
+              <w:left w:val="nil"/>
+              <w:bottom w:val="single" w:sz="8" w:space="0" w:color="auto"/>
+              <w:right w:val="single" w:sz="8" w:space="0" w:color="auto"/>
+            </w:tcBorders>
+            <w:vAlign w:val="center"/>
+            <w:hideMark/>
+          </w:tcPr>
+          <w:p>
+            <w:pPr>
+              <w:spacing w:after="0" w:line="240" w:lineRule="auto"/>
+              <w:rPr>
+                <w:rFonts w:ascii="Aptos" w:eastAsia="Times New Roman" w:hAnsi="Aptos" w:cs="Calibri"/>
+                <w:b/>
+                <w:bCs/>
+                <w:color w:val="000000"/>
+                <w:kern w:val="0"/>
+                <w:lang w:eastAsia="pt-BR"/>
+                <w14:ligatures w14:val="none"/>
+              </w:rPr>
+            </w:pPr>
+            <w:r>
+              <w:rPr>
+                <w:rFonts w:ascii="Aptos" w:eastAsia="Times New Roman" w:hAnsi="Aptos" w:cs="Calibri"/>
+                <w:b/>
+                <w:bCs/>
+                <w:color w:val="000000"/>
+                <w:kern w:val="0"/>
+                <w:lang w:eastAsia="pt-BR"/>
+                <w14:ligatures w14:val="none"/>
+              </w:rPr>
+              <w:t>O que representa</w:t>
+            </w:r>
+          </w:p>
+        </w:tc>
+      </w:tr>
+      <w:tr>
+        <w:trPr>
+          <w:trHeight w:val="1116"/>
+        </w:trPr>
+        <w:tc>
+          <w:tcPr>
+            <w:tcW w:w="1000" w:type="dxa"/>
+            <w:tcBorders>
+              <w:top w:val="nil"/>
+              <w:left w:val="single" w:sz="8" w:space="0" w:color="auto"/>
+              <w:bottom w:val="single" w:sz="8" w:space="0" w:color="auto"/>
+              <w:right w:val="single" w:sz="8" w:space="0" w:color="auto"/>
+            </w:tcBorders>
+            <w:vAlign w:val="center"/>
+            <w:hideMark/>
+          </w:tcPr>
+          <w:p>
+            <w:pPr>
+              <w:spacing w:after="0" w:line="240" w:lineRule="auto"/>
+              <w:rPr>
+                <w:rFonts w:ascii="Aptos" w:eastAsia="Times New Roman" w:hAnsi="Aptos" w:cs="Calibri"/>
+                <w:b/>
+                <w:bCs/>
+                <w:color w:val="000000"/>
+                <w:kern w:val="0"/>
+                <w:sz w:val="20"/>
+                <w:szCs w:val="20"/>
+                <w:lang w:eastAsia="pt-BR"/>
+                <w14:ligatures w14:val="none"/>
+              </w:rPr>
+            </w:pPr>
+            <w:r>
+              <w:rPr>
+                <w:rFonts w:ascii="Aptos" w:eastAsia="Times New Roman" w:hAnsi="Aptos" w:cs="Calibri"/>
+                <w:b/>
+                <w:bCs/>
+                <w:color w:val="000000"/>
+                <w:kern w:val="0"/>
+                <w:sz w:val="20"/>
+                <w:szCs w:val="20"/>
+                <w:lang w:eastAsia="pt-BR"/>
+                <w14:ligatures w14:val="none"/>
+              </w:rPr>
+              <w:t>1</w:t>
+            </w:r>
+          </w:p>
+        </w:tc>
+        <w:tc>
+          <w:tcPr>
+            <w:tcW w:w="2120" w:type="dxa"/>
+            <w:tcBorders>
+              <w:top w:val="nil"/>
+              <w:left w:val="nil"/>
+              <w:bottom w:val="single" w:sz="8" w:space="0" w:color="auto"/>
+              <w:right w:val="single" w:sz="8" w:space="0" w:color="auto"/>
+            </w:tcBorders>
+            <w:vAlign w:val="center"/>
+            <w:hideMark/>
+          </w:tcPr>
+          <w:p>
+            <w:pPr>
+              <w:spacing w:after="0" w:line="240" w:lineRule="auto"/>
+              <w:rPr>
+                <w:rFonts w:ascii="Aptos" w:eastAsia="Times New Roman" w:hAnsi="Aptos" w:cs="Calibri"/>
+                <w:color w:val="000000"/>
+                <w:kern w:val="0"/>
+                <w:sz w:val="20"/>
+                <w:szCs w:val="20"/>
+                <w:lang w:eastAsia="pt-BR"/>
+                <w14:ligatures w14:val="none"/>
+              </w:rPr>
+            </w:pPr>
+            <w:r>
+              <w:rPr>
+                <w:rFonts w:ascii="Aptos" w:eastAsia="Times New Roman" w:hAnsi="Aptos" w:cs="Calibri"/>
+                <w:color w:val="000000"/>
+                <w:kern w:val="0"/>
+                <w:sz w:val="20"/>
+                <w:szCs w:val="20"/>
+                <w:lang w:eastAsia="pt-BR"/>
+                <w14:ligatures w14:val="none"/>
+              </w:rPr>
+              <w:t>--dataset-path</w:t>
+            </w:r>
+          </w:p>
+          <w:p>
+            <w:pPr>
+              <w:spacing w:after="0" w:line="240" w:lineRule="auto"/>
+              <w:rPr>
+                <w:rFonts w:ascii="Aptos" w:eastAsia="Times New Roman" w:hAnsi="Aptos" w:cs="Calibri"/>
+                <w:color w:val="000000"/>
+                <w:kern w:val="0"/>
+                <w:sz w:val="20"/>
+                <w:szCs w:val="20"/>
+                <w:lang w:eastAsia="pt-BR"/>
+                <w14:ligatures w14:val="none"/>
+              </w:rPr>
+            </w:pPr>
+            <w:r>
+              <w:rPr>
+                <w:rFonts w:ascii="Aptos" w:eastAsia="Times New Roman" w:hAnsi="Aptos" w:cs="Calibri"/>
+                <w:color w:val="000000"/>
+                <w:kern w:val="0"/>
+                <w:sz w:val="20"/>
+                <w:szCs w:val="20"/>
+                <w:lang w:eastAsia="pt-BR"/>
+                <w14:ligatures w14:val="none"/>
+              </w:rPr>
+              <w:t>(ex.: parquet do MedPT)</w:t>
+            </w:r>
+          </w:p>
+        </w:tc>
+        <w:tc>
+          <w:tcPr>
+            <w:tcW w:w="860" w:type="dxa"/>
+            <w:tcBorders>
+              <w:top w:val="nil"/>
+              <w:left w:val="nil"/>
+              <w:bottom w:val="single" w:sz="8" w:space="0" w:color="auto"/>
+              <w:right w:val="single" w:sz="8" w:space="0" w:color="auto"/>
+            </w:tcBorders>
+            <w:vAlign w:val="center"/>
+            <w:hideMark/>
+          </w:tcPr>
+          <w:p>
+            <w:pPr>
+              <w:spacing w:after="0" w:line="240" w:lineRule="auto"/>
+              <w:rPr>
+                <w:rFonts w:ascii="Aptos" w:eastAsia="Times New Roman" w:hAnsi="Aptos" w:cs="Calibri"/>
+                <w:b/>
+                <w:bCs/>
+                <w:color w:val="000000"/>
+                <w:kern w:val="0"/>
+                <w:sz w:val="20"/>
+                <w:szCs w:val="20"/>
+                <w:lang w:eastAsia="pt-BR"/>
+                <w14:ligatures w14:val="none"/>
+              </w:rPr>
+            </w:pPr>
+            <w:r>
+              <w:rPr>
+                <w:rFonts w:ascii="Aptos" w:eastAsia="Times New Roman" w:hAnsi="Aptos" w:cs="Calibri"/>
+                <w:b/>
+                <w:bCs/>
+                <w:color w:val="000000"/>
+                <w:kern w:val="0"/>
+                <w:sz w:val="20"/>
+                <w:szCs w:val="20"/>
+                <w:lang w:eastAsia="pt-BR"/>
+                <w14:ligatures w14:val="none"/>
+              </w:rPr>
+              <w:t>Entrada</w:t>
+            </w:r>
+          </w:p>
+        </w:tc>
+        <w:tc>
+          <w:tcPr>
+            <w:tcW w:w="4100" w:type="dxa"/>
+            <w:tcBorders>
+              <w:top w:val="nil"/>
+              <w:left w:val="nil"/>
+              <w:bottom w:val="single" w:sz="8" w:space="0" w:color="auto"/>
+              <w:right w:val="single" w:sz="8" w:space="0" w:color="auto"/>
+            </w:tcBorders>
+            <w:vAlign w:val="center"/>
+            <w:hideMark/>
+          </w:tcPr>
+          <w:p>
+            <w:pPr>
+              <w:spacing w:after="0" w:line="240" w:lineRule="auto"/>
+              <w:rPr>
+                <w:rFonts w:ascii="Aptos" w:eastAsia="Times New Roman" w:hAnsi="Aptos" w:cs="Calibri"/>
+                <w:b/>
+                <w:bCs/>
+                <w:i/>
+                <w:iCs/>
+                <w:color w:val="000000"/>
+                <w:kern w:val="0"/>
+                <w:sz w:val="20"/>
+                <w:szCs w:val="20"/>
+                <w:u w:val="single"/>
+                <w:lang w:eastAsia="pt-BR"/>
+                <w14:ligatures w14:val="none"/>
+              </w:rPr>
+            </w:pPr>
+            <w:r>
+              <w:rPr>
+                <w:rFonts w:ascii="Aptos" w:eastAsia="Times New Roman" w:hAnsi="Aptos" w:cs="Calibri"/>
+                <w:b/>
+                <w:bCs/>
+                <w:i/>
+                <w:iCs/>
+                <w:color w:val="000000"/>
+                <w:kern w:val="0"/>
+                <w:sz w:val="20"/>
+                <w:szCs w:val="20"/>
+                <w:u w:val="single"/>
+                <w:lang w:eastAsia="pt-BR"/>
+                <w14:ligatures w14:val="none"/>
+              </w:rPr>
+              <w:t>train-00000-of-00001.parquet</w:t>
+            </w:r>
+          </w:p>
+          <w:p>
+            <w:pPr>
+              <w:spacing w:after="0" w:line="240" w:lineRule="auto"/>
+              <w:rPr>
+                <w:rFonts w:ascii="Aptos" w:eastAsia="Times New Roman" w:hAnsi="Aptos" w:cs="Calibri"/>
+                <w:color w:val="000000"/>
+                <w:kern w:val="0"/>
+                <w:sz w:val="20"/>
+                <w:szCs w:val="20"/>
+                <w:lang w:eastAsia="pt-BR"/>
+                <w14:ligatures w14:val="none"/>
+              </w:rPr>
+            </w:pPr>
+            <w:r>
+              <w:rPr>
+                <w:rFonts w:ascii="Aptos" w:eastAsia="Times New Roman" w:hAnsi="Aptos" w:cs="Calibri"/>
+                <w:color w:val="000000"/>
+                <w:kern w:val="0"/>
+                <w:sz w:val="20"/>
+                <w:szCs w:val="20"/>
+                <w:lang w:eastAsia="pt-BR"/>
+                <w14:ligatures w14:val="none"/>
+              </w:rPr>
+              <w:t>Dataset bruto com pelo menos</w:t>
+            </w:r>
+            <w:r>
+              <w:rPr>
+                <w:rFonts w:ascii="Aptos" w:eastAsia="Times New Roman" w:hAnsi="Aptos" w:cs="Calibri"/>
+                <w:color w:val="000000"/>
+                <w:kern w:val="0"/>
+                <w:sz w:val="20"/>
+                <w:szCs w:val="20"/>
+                <w:lang w:eastAsia="pt-BR"/>
+                <w14:ligatures w14:val="none"/>
+              </w:rPr>
+              <w:t xml:space="preserve"> </w:t>
+            </w:r>
+            <w:r>
+              <w:rPr>
+                <w:rFonts w:ascii="Aptos" w:eastAsia="Times New Roman" w:hAnsi="Aptos" w:cs="Calibri"/>
+                <w:i/>
+                <w:iCs/>
+                <w:color w:val="000000"/>
+                <w:kern w:val="0"/>
+                <w:sz w:val="20"/>
+                <w:szCs w:val="20"/>
+                <w:lang w:eastAsia="pt-BR"/>
+                <w14:ligatures w14:val="none"/>
+              </w:rPr>
+              <w:t>question</w:t>
+            </w:r>
+            <w:r>
+              <w:rPr>
+                <w:rFonts w:ascii="Aptos" w:eastAsia="Times New Roman" w:hAnsi="Aptos" w:cs="Calibri"/>
+                <w:color w:val="000000"/>
+                <w:kern w:val="0"/>
+                <w:sz w:val="20"/>
+                <w:szCs w:val="20"/>
+                <w:lang w:eastAsia="pt-BR"/>
+                <w14:ligatures w14:val="none"/>
+              </w:rPr>
+              <w:t xml:space="preserve"> </w:t>
+            </w:r>
+            <w:r>
+              <w:rPr>
+                <w:rFonts w:ascii="Aptos" w:eastAsia="Times New Roman" w:hAnsi="Aptos" w:cs="Calibri"/>
+                <w:color w:val="000000"/>
+                <w:kern w:val="0"/>
+                <w:sz w:val="20"/>
+                <w:szCs w:val="20"/>
+                <w:lang w:eastAsia="pt-BR"/>
+                <w14:ligatures w14:val="none"/>
+              </w:rPr>
+              <w:t>e</w:t>
+            </w:r>
+            <w:r>
+              <w:rPr>
+                <w:rFonts w:ascii="Aptos" w:eastAsia="Times New Roman" w:hAnsi="Aptos" w:cs="Calibri"/>
+                <w:color w:val="000000"/>
+                <w:kern w:val="0"/>
+                <w:sz w:val="20"/>
+                <w:szCs w:val="20"/>
+                <w:lang w:eastAsia="pt-BR"/>
+                <w14:ligatures w14:val="none"/>
+              </w:rPr>
+              <w:t xml:space="preserve"> </w:t>
+            </w:r>
+            <w:r>
+              <w:rPr>
+                <w:rFonts w:ascii="Aptos" w:eastAsia="Times New Roman" w:hAnsi="Aptos" w:cs="Calibri"/>
+                <w:i/>
+                <w:iCs/>
+                <w:color w:val="000000"/>
+                <w:kern w:val="0"/>
+                <w:sz w:val="20"/>
+                <w:szCs w:val="20"/>
+                <w:lang w:eastAsia="pt-BR"/>
+                <w14:ligatures w14:val="none"/>
+              </w:rPr>
+              <w:t>answer</w:t>
+            </w:r>
+            <w:r>
+              <w:rPr>
+                <w:rFonts w:ascii="Aptos" w:eastAsia="Times New Roman" w:hAnsi="Aptos" w:cs="Calibri"/>
+                <w:color w:val="000000"/>
+                <w:kern w:val="0"/>
+                <w:sz w:val="20"/>
+                <w:szCs w:val="20"/>
+                <w:lang w:eastAsia="pt-BR"/>
+                <w14:ligatures w14:val="none"/>
+              </w:rPr>
+              <w:t>. É a fonte de todas as perguntas e respostas antes da limpeza e do split.</w:t>
+            </w:r>
+          </w:p>
+        </w:tc>
+      </w:tr>
+      <w:tr>
+        <w:trPr>
+          <w:trHeight w:val="1116"/>
+        </w:trPr>
+        <w:tc>
+          <w:tcPr>
+            <w:tcW w:w="1000" w:type="dxa"/>
+            <w:tcBorders>
+              <w:top w:val="nil"/>
+              <w:left w:val="single" w:sz="8" w:space="0" w:color="auto"/>
+              <w:bottom w:val="single" w:sz="8" w:space="0" w:color="auto"/>
+              <w:right w:val="single" w:sz="8" w:space="0" w:color="auto"/>
+            </w:tcBorders>
+            <w:vAlign w:val="center"/>
+            <w:hideMark/>
+          </w:tcPr>
+          <w:p>
+            <w:pPr>
+              <w:spacing w:after="0" w:line="240" w:lineRule="auto"/>
+              <w:rPr>
+                <w:rFonts w:ascii="Aptos" w:eastAsia="Times New Roman" w:hAnsi="Aptos" w:cs="Calibri"/>
+                <w:b/>
+                <w:bCs/>
+                <w:color w:val="000000"/>
+                <w:kern w:val="0"/>
+                <w:sz w:val="20"/>
+                <w:szCs w:val="20"/>
+                <w:lang w:eastAsia="pt-BR"/>
+                <w14:ligatures w14:val="none"/>
+              </w:rPr>
+            </w:pPr>
+            <w:r>
+              <w:rPr>
+                <w:rFonts w:ascii="Aptos" w:eastAsia="Times New Roman" w:hAnsi="Aptos" w:cs="Calibri"/>
+                <w:b/>
+                <w:bCs/>
+                <w:color w:val="000000"/>
+                <w:kern w:val="0"/>
+                <w:sz w:val="20"/>
+                <w:szCs w:val="20"/>
+                <w:lang w:eastAsia="pt-BR"/>
+                <w14:ligatures w14:val="none"/>
+              </w:rPr>
+              <w:t>2</w:t>
+            </w:r>
+          </w:p>
+        </w:tc>
+        <w:tc>
+          <w:tcPr>
+            <w:tcW w:w="2120" w:type="dxa"/>
+            <w:tcBorders>
+              <w:top w:val="nil"/>
+              <w:left w:val="nil"/>
+              <w:bottom w:val="single" w:sz="8" w:space="0" w:color="auto"/>
+              <w:right w:val="single" w:sz="8" w:space="0" w:color="auto"/>
+            </w:tcBorders>
+            <w:vAlign w:val="center"/>
+            <w:hideMark/>
+          </w:tcPr>
+          <w:p>
+            <w:pPr>
+              <w:spacing w:after="0" w:line="240" w:lineRule="auto"/>
+              <w:rPr>
+                <w:rFonts w:ascii="Aptos" w:eastAsia="Times New Roman" w:hAnsi="Aptos" w:cs="Calibri"/>
+                <w:color w:val="000000"/>
+                <w:kern w:val="0"/>
+                <w:sz w:val="20"/>
+                <w:szCs w:val="20"/>
+                <w:lang w:eastAsia="pt-BR"/>
+                <w14:ligatures w14:val="none"/>
+              </w:rPr>
+            </w:pPr>
+            <w:r>
+              <w:rPr>
+                <w:rFonts w:ascii="Aptos" w:eastAsia="Times New Roman" w:hAnsi="Aptos" w:cs="Calibri"/>
+                <w:color w:val="000000"/>
+                <w:kern w:val="0"/>
+                <w:sz w:val="20"/>
+                <w:szCs w:val="20"/>
+                <w:lang w:eastAsia="pt-BR"/>
+                <w14:ligatures w14:val="none"/>
+              </w:rPr>
+              <w:t>--output-dir</w:t>
+            </w:r>
+          </w:p>
+        </w:tc>
+        <w:tc>
+          <w:tcPr>
+            <w:tcW w:w="860" w:type="dxa"/>
+            <w:tcBorders>
+              <w:top w:val="nil"/>
+              <w:left w:val="nil"/>
+              <w:bottom w:val="single" w:sz="8" w:space="0" w:color="auto"/>
+              <w:right w:val="single" w:sz="8" w:space="0" w:color="auto"/>
+            </w:tcBorders>
+            <w:vAlign w:val="center"/>
+            <w:hideMark/>
+          </w:tcPr>
+          <w:p>
+            <w:pPr>
+              <w:spacing w:after="0" w:line="240" w:lineRule="auto"/>
+              <w:rPr>
+                <w:rFonts w:ascii="Aptos" w:eastAsia="Times New Roman" w:hAnsi="Aptos" w:cs="Calibri"/>
+                <w:b/>
+                <w:bCs/>
+                <w:color w:val="000000"/>
+                <w:kern w:val="0"/>
+                <w:sz w:val="20"/>
+                <w:szCs w:val="20"/>
+                <w:lang w:eastAsia="pt-BR"/>
+                <w14:ligatures w14:val="none"/>
+              </w:rPr>
+            </w:pPr>
+            <w:r>
+              <w:rPr>
+                <w:rFonts w:ascii="Aptos" w:eastAsia="Times New Roman" w:hAnsi="Aptos" w:cs="Calibri"/>
+                <w:b/>
+                <w:bCs/>
+                <w:color w:val="000000"/>
+                <w:kern w:val="0"/>
+                <w:sz w:val="20"/>
+                <w:szCs w:val="20"/>
+                <w:lang w:eastAsia="pt-BR"/>
+                <w14:ligatures w14:val="none"/>
+              </w:rPr>
+              <w:t>Saída</w:t>
+            </w:r>
+          </w:p>
+        </w:tc>
+        <w:tc>
+          <w:tcPr>
+            <w:tcW w:w="4100" w:type="dxa"/>
+            <w:tcBorders>
+              <w:top w:val="nil"/>
+              <w:left w:val="nil"/>
+              <w:bottom w:val="single" w:sz="8" w:space="0" w:color="auto"/>
+              <w:right w:val="single" w:sz="8" w:space="0" w:color="auto"/>
+            </w:tcBorders>
+            <w:vAlign w:val="center"/>
+            <w:hideMark/>
+          </w:tcPr>
+          <w:p>
+            <w:pPr>
+              <w:spacing w:after="0" w:line="240" w:lineRule="auto"/>
+              <w:rPr>
+                <w:rFonts w:ascii="Aptos" w:eastAsia="Times New Roman" w:hAnsi="Aptos" w:cs="Calibri"/>
+                <w:b/>
+                <w:bCs/>
+                <w:i/>
+                <w:iCs/>
+                <w:color w:val="000000"/>
+                <w:kern w:val="0"/>
+                <w:sz w:val="20"/>
+                <w:szCs w:val="20"/>
+                <w:lang w:eastAsia="pt-BR"/>
+                <w14:ligatures w14:val="none"/>
+              </w:rPr>
+            </w:pPr>
+            <w:r>
+              <w:rPr>
+                <w:rFonts w:ascii="Aptos" w:eastAsia="Times New Roman" w:hAnsi="Aptos" w:cs="Calibri"/>
+                <w:b/>
+                <w:bCs/>
+                <w:i/>
+                <w:iCs/>
+                <w:color w:val="000000"/>
+                <w:kern w:val="0"/>
+                <w:sz w:val="20"/>
+                <w:szCs w:val="20"/>
+                <w:lang w:eastAsia="pt-BR"/>
+                <w14:ligatures w14:val="none"/>
+              </w:rPr>
+              <w:t>data/processed/medpt_qa</w:t>
+            </w:r>
+          </w:p>
+          <w:p>
+            <w:pPr>
+              <w:spacing w:after="0" w:line="240" w:lineRule="auto"/>
+              <w:rPr>
+                <w:rFonts w:ascii="Aptos" w:eastAsia="Times New Roman" w:hAnsi="Aptos" w:cs="Calibri"/>
+                <w:color w:val="000000"/>
+                <w:kern w:val="0"/>
+                <w:sz w:val="20"/>
+                <w:szCs w:val="20"/>
+                <w:lang w:eastAsia="pt-BR"/>
+                <w14:ligatures w14:val="none"/>
+              </w:rPr>
+            </w:pPr>
+            <w:r>
+              <w:rPr>
+                <w:rFonts w:ascii="Aptos" w:eastAsia="Times New Roman" w:hAnsi="Aptos" w:cs="Calibri"/>
+                <w:color w:val="000000"/>
+                <w:kern w:val="0"/>
+                <w:sz w:val="20"/>
+                <w:szCs w:val="20"/>
+                <w:lang w:eastAsia="pt-BR"/>
+                <w14:ligatures w14:val="none"/>
+              </w:rPr>
+              <w:t>DatasetDict</w:t>
+            </w:r>
+            <w:r>
+              <w:rPr>
+                <w:rFonts w:ascii="Aptos" w:eastAsia="Times New Roman" w:hAnsi="Aptos" w:cs="Calibri"/>
+                <w:color w:val="000000"/>
+                <w:kern w:val="0"/>
+                <w:sz w:val="20"/>
+                <w:szCs w:val="20"/>
+                <w:lang w:eastAsia="pt-BR"/>
+                <w14:ligatures w14:val="none"/>
+              </w:rPr>
+              <w:t xml:space="preserve"> </w:t>
+            </w:r>
+            <w:r>
+              <w:rPr>
+                <w:rFonts w:ascii="Aptos" w:eastAsia="Times New Roman" w:hAnsi="Aptos" w:cs="Calibri"/>
+                <w:color w:val="000000"/>
+                <w:kern w:val="0"/>
+                <w:sz w:val="20"/>
+                <w:szCs w:val="20"/>
+                <w:lang w:eastAsia="pt-BR"/>
+                <w14:ligatures w14:val="none"/>
+              </w:rPr>
+              <w:t>salvo em disco pelo Hugging Face</w:t>
+            </w:r>
+            <w:r>
+              <w:rPr>
+                <w:rFonts w:ascii="Aptos" w:eastAsia="Times New Roman" w:hAnsi="Aptos" w:cs="Calibri"/>
+                <w:color w:val="000000"/>
+                <w:kern w:val="0"/>
+                <w:sz w:val="20"/>
+                <w:szCs w:val="20"/>
+                <w:lang w:eastAsia="pt-BR"/>
+                <w14:ligatures w14:val="none"/>
+              </w:rPr>
+              <w:t xml:space="preserve"> </w:t>
+            </w:r>
+            <w:r>
+              <w:rPr>
+                <w:rFonts w:ascii="Aptos" w:eastAsia="Times New Roman" w:hAnsi="Aptos" w:cs="Calibri"/>
+                <w:color w:val="000000"/>
+                <w:kern w:val="0"/>
+                <w:sz w:val="20"/>
+                <w:szCs w:val="20"/>
+                <w:lang w:eastAsia="pt-BR"/>
+                <w14:ligatures w14:val="none"/>
+              </w:rPr>
+              <w:t>datasets: pastas/arquivos com os splits</w:t>
+            </w:r>
+            <w:r>
+              <w:rPr>
+                <w:rFonts w:ascii="Aptos" w:eastAsia="Times New Roman" w:hAnsi="Aptos" w:cs="Calibri"/>
+                <w:color w:val="000000"/>
+                <w:kern w:val="0"/>
+                <w:sz w:val="20"/>
+                <w:szCs w:val="20"/>
+                <w:lang w:eastAsia="pt-BR"/>
+                <w14:ligatures w14:val="none"/>
+              </w:rPr>
+              <w:t xml:space="preserve"> </w:t>
+            </w:r>
+            <w:r>
+              <w:rPr>
+                <w:rFonts w:ascii="Aptos" w:eastAsia="Times New Roman" w:hAnsi="Aptos" w:cs="Calibri"/>
+                <w:b/>
+                <w:bCs/>
+                <w:color w:val="000000"/>
+                <w:kern w:val="0"/>
+                <w:sz w:val="20"/>
+                <w:szCs w:val="20"/>
+                <w:lang w:eastAsia="pt-BR"/>
+                <w14:ligatures w14:val="none"/>
+              </w:rPr>
+              <w:t>train</w:t>
+            </w:r>
+            <w:r>
+              <w:rPr>
+                <w:rFonts w:ascii="Aptos" w:eastAsia="Times New Roman" w:hAnsi="Aptos" w:cs="Calibri"/>
+                <w:color w:val="000000"/>
+                <w:kern w:val="0"/>
+                <w:sz w:val="20"/>
+                <w:szCs w:val="20"/>
+                <w:lang w:eastAsia="pt-BR"/>
+                <w14:ligatures w14:val="none"/>
+              </w:rPr>
+              <w:t>,</w:t>
+            </w:r>
+            <w:r>
+              <w:rPr>
+                <w:rFonts w:ascii="Aptos" w:eastAsia="Times New Roman" w:hAnsi="Aptos" w:cs="Calibri"/>
+                <w:color w:val="000000"/>
+                <w:kern w:val="0"/>
+                <w:sz w:val="20"/>
+                <w:szCs w:val="20"/>
+                <w:lang w:eastAsia="pt-BR"/>
+                <w14:ligatures w14:val="none"/>
+              </w:rPr>
+              <w:t xml:space="preserve"> </w:t>
+            </w:r>
+            <w:r>
+              <w:rPr>
+                <w:rFonts w:ascii="Aptos" w:eastAsia="Times New Roman" w:hAnsi="Aptos" w:cs="Calibri"/>
+                <w:b/>
+                <w:bCs/>
+                <w:color w:val="000000"/>
+                <w:kern w:val="0"/>
+                <w:sz w:val="20"/>
+                <w:szCs w:val="20"/>
+                <w:lang w:eastAsia="pt-BR"/>
+                <w14:ligatures w14:val="none"/>
+              </w:rPr>
+              <w:t>validation</w:t>
+            </w:r>
+            <w:r>
+              <w:rPr>
+                <w:rFonts w:ascii="Aptos" w:eastAsia="Times New Roman" w:hAnsi="Aptos" w:cs="Calibri"/>
+                <w:b/>
+                <w:bCs/>
+                <w:color w:val="000000"/>
+                <w:kern w:val="0"/>
+                <w:sz w:val="20"/>
+                <w:szCs w:val="20"/>
+                <w:lang w:eastAsia="pt-BR"/>
+                <w14:ligatures w14:val="none"/>
+              </w:rPr>
+              <w:t xml:space="preserve"> </w:t>
+            </w:r>
+            <w:r>
+              <w:rPr>
+                <w:rFonts w:ascii="Aptos" w:eastAsia="Times New Roman" w:hAnsi="Aptos" w:cs="Calibri"/>
+                <w:color w:val="000000"/>
+                <w:kern w:val="0"/>
+                <w:sz w:val="20"/>
+                <w:szCs w:val="20"/>
+                <w:lang w:eastAsia="pt-BR"/>
+                <w14:ligatures w14:val="none"/>
+              </w:rPr>
+              <w:t>e</w:t>
+            </w:r>
+            <w:r>
+              <w:rPr>
+                <w:rFonts w:ascii="Aptos" w:eastAsia="Times New Roman" w:hAnsi="Aptos" w:cs="Calibri"/>
+                <w:color w:val="000000"/>
+                <w:kern w:val="0"/>
+                <w:sz w:val="20"/>
+                <w:szCs w:val="20"/>
+                <w:lang w:eastAsia="pt-BR"/>
+                <w14:ligatures w14:val="none"/>
+              </w:rPr>
+              <w:t xml:space="preserve"> </w:t>
+            </w:r>
+            <w:r>
+              <w:rPr>
+                <w:rFonts w:ascii="Aptos" w:eastAsia="Times New Roman" w:hAnsi="Aptos" w:cs="Calibri"/>
+                <w:b/>
+                <w:bCs/>
+                <w:color w:val="000000"/>
+                <w:kern w:val="0"/>
+                <w:sz w:val="20"/>
+                <w:szCs w:val="20"/>
+                <w:lang w:eastAsia="pt-BR"/>
+                <w14:ligatures w14:val="none"/>
+              </w:rPr>
+              <w:t>test</w:t>
+            </w:r>
+            <w:r>
+              <w:rPr>
+                <w:rFonts w:ascii="Aptos" w:eastAsia="Times New Roman" w:hAnsi="Aptos" w:cs="Calibri"/>
+                <w:color w:val="000000"/>
+                <w:kern w:val="0"/>
+                <w:sz w:val="20"/>
+                <w:szCs w:val="20"/>
+                <w:lang w:eastAsia="pt-BR"/>
+                <w14:ligatures w14:val="none"/>
+              </w:rPr>
+              <w:t>, já pronto para fine-tuning.</w:t>
+            </w:r>
+          </w:p>
+        </w:tc>
+      </w:tr>
+      <w:tr>
+        <w:trPr>
+          <w:trHeight w:val="1392"/>
+        </w:trPr>
+        <w:tc>
+          <w:tcPr>
+            <w:tcW w:w="1000" w:type="dxa"/>
+            <w:tcBorders>
+              <w:top w:val="nil"/>
+              <w:left w:val="single" w:sz="8" w:space="0" w:color="auto"/>
+              <w:bottom w:val="single" w:sz="8" w:space="0" w:color="auto"/>
+              <w:right w:val="single" w:sz="8" w:space="0" w:color="auto"/>
+            </w:tcBorders>
+            <w:vAlign w:val="center"/>
+            <w:hideMark/>
+          </w:tcPr>
+          <w:p>
+            <w:pPr>
+              <w:spacing w:after="0" w:line="240" w:lineRule="auto"/>
+              <w:rPr>
+                <w:rFonts w:ascii="Aptos" w:eastAsia="Times New Roman" w:hAnsi="Aptos" w:cs="Calibri"/>
+                <w:b/>
+                <w:bCs/>
+                <w:color w:val="000000"/>
+                <w:kern w:val="0"/>
+                <w:sz w:val="20"/>
+                <w:szCs w:val="20"/>
+                <w:lang w:eastAsia="pt-BR"/>
+                <w14:ligatures w14:val="none"/>
+              </w:rPr>
+            </w:pPr>
+            <w:r>
+              <w:rPr>
+                <w:rFonts w:ascii="Aptos" w:eastAsia="Times New Roman" w:hAnsi="Aptos" w:cs="Calibri"/>
+                <w:b/>
+                <w:bCs/>
+                <w:color w:val="000000"/>
+                <w:kern w:val="0"/>
+                <w:sz w:val="20"/>
+                <w:szCs w:val="20"/>
+                <w:lang w:eastAsia="pt-BR"/>
+                <w14:ligatures w14:val="none"/>
+              </w:rPr>
+              <w:t>3</w:t>
+            </w:r>
+          </w:p>
+        </w:tc>
+        <w:tc>
+          <w:tcPr>
+            <w:tcW w:w="2120" w:type="dxa"/>
+            <w:tcBorders>
+              <w:top w:val="nil"/>
+              <w:left w:val="nil"/>
+              <w:bottom w:val="single" w:sz="8" w:space="0" w:color="auto"/>
+              <w:right w:val="single" w:sz="8" w:space="0" w:color="auto"/>
+            </w:tcBorders>
+            <w:vAlign w:val="center"/>
+            <w:hideMark/>
+          </w:tcPr>
+          <w:p>
+            <w:pPr>
+              <w:spacing w:after="0" w:line="240" w:lineRule="auto"/>
+              <w:rPr>
+                <w:rFonts w:ascii="Aptos" w:eastAsia="Times New Roman" w:hAnsi="Aptos" w:cs="Calibri"/>
+                <w:color w:val="000000"/>
+                <w:kern w:val="0"/>
+                <w:sz w:val="20"/>
+                <w:szCs w:val="20"/>
+                <w:lang w:eastAsia="pt-BR"/>
+                <w14:ligatures w14:val="none"/>
+              </w:rPr>
+            </w:pPr>
+            <w:r>
+              <w:rPr>
+                <w:rFonts w:ascii="Aptos" w:eastAsia="Times New Roman" w:hAnsi="Aptos" w:cs="Calibri"/>
+                <w:color w:val="000000"/>
+                <w:kern w:val="0"/>
+                <w:sz w:val="20"/>
+                <w:szCs w:val="20"/>
+                <w:lang w:eastAsia="pt-BR"/>
+                <w14:ligatures w14:val="none"/>
+              </w:rPr>
+              <w:t>--manifest-path</w:t>
+            </w:r>
+          </w:p>
+        </w:tc>
+        <w:tc>
+          <w:tcPr>
+            <w:tcW w:w="860" w:type="dxa"/>
+            <w:tcBorders>
+              <w:top w:val="nil"/>
+              <w:left w:val="nil"/>
+              <w:bottom w:val="single" w:sz="8" w:space="0" w:color="auto"/>
+              <w:right w:val="single" w:sz="8" w:space="0" w:color="auto"/>
+            </w:tcBorders>
+            <w:vAlign w:val="center"/>
+            <w:hideMark/>
+          </w:tcPr>
+          <w:p>
+            <w:pPr>
+              <w:spacing w:after="0" w:line="240" w:lineRule="auto"/>
+              <w:rPr>
+                <w:rFonts w:ascii="Aptos" w:eastAsia="Times New Roman" w:hAnsi="Aptos" w:cs="Calibri"/>
+                <w:b/>
+                <w:bCs/>
+                <w:color w:val="000000"/>
+                <w:kern w:val="0"/>
+                <w:sz w:val="20"/>
+                <w:szCs w:val="20"/>
+                <w:lang w:eastAsia="pt-BR"/>
+                <w14:ligatures w14:val="none"/>
+              </w:rPr>
+            </w:pPr>
+            <w:r>
+              <w:rPr>
+                <w:rFonts w:ascii="Aptos" w:eastAsia="Times New Roman" w:hAnsi="Aptos" w:cs="Calibri"/>
+                <w:b/>
+                <w:bCs/>
+                <w:color w:val="000000"/>
+                <w:kern w:val="0"/>
+                <w:sz w:val="20"/>
+                <w:szCs w:val="20"/>
+                <w:lang w:eastAsia="pt-BR"/>
+                <w14:ligatures w14:val="none"/>
+              </w:rPr>
+              <w:t>Saída</w:t>
+            </w:r>
+          </w:p>
+        </w:tc>
+        <w:tc>
+          <w:tcPr>
+            <w:tcW w:w="4100" w:type="dxa"/>
+            <w:tcBorders>
+              <w:top w:val="nil"/>
+              <w:left w:val="nil"/>
+              <w:bottom w:val="single" w:sz="8" w:space="0" w:color="auto"/>
+              <w:right w:val="single" w:sz="8" w:space="0" w:color="auto"/>
+            </w:tcBorders>
+            <w:vAlign w:val="center"/>
+            <w:hideMark/>
+          </w:tcPr>
+          <w:p>
+            <w:pPr>
+              <w:spacing w:after="0" w:line="240" w:lineRule="auto"/>
+              <w:rPr>
+                <w:rFonts w:ascii="Aptos" w:eastAsia="Times New Roman" w:hAnsi="Aptos" w:cs="Calibri"/>
+                <w:b/>
+                <w:bCs/>
+                <w:i/>
+                <w:iCs/>
+                <w:color w:val="000000"/>
+                <w:kern w:val="0"/>
+                <w:sz w:val="20"/>
+                <w:szCs w:val="20"/>
+                <w:lang w:eastAsia="pt-BR"/>
+                <w14:ligatures w14:val="none"/>
+              </w:rPr>
+            </w:pPr>
+            <w:r>
+              <w:rPr>
+                <w:rFonts w:ascii="Aptos" w:eastAsia="Times New Roman" w:hAnsi="Aptos" w:cs="Calibri"/>
+                <w:b/>
+                <w:bCs/>
+                <w:i/>
+                <w:iCs/>
+                <w:color w:val="000000"/>
+                <w:kern w:val="0"/>
+                <w:sz w:val="20"/>
+                <w:szCs w:val="20"/>
+                <w:lang w:eastAsia="pt-BR"/>
+                <w14:ligatures w14:val="none"/>
+              </w:rPr>
+              <w:t>data/processed/</w:t>
+            </w:r>
+            <w:r>
+              <w:rPr>
+                <w:rFonts w:ascii="Aptos" w:eastAsia="Times New Roman" w:hAnsi="Aptos" w:cs="Calibri"/>
+                <w:b/>
+                <w:bCs/>
+                <w:i/>
+                <w:iCs/>
+                <w:color w:val="000000"/>
+                <w:kern w:val="0"/>
+                <w:sz w:val="20"/>
+                <w:szCs w:val="20"/>
+                <w:lang w:eastAsia="pt-BR"/>
+                <w14:ligatures w14:val="none"/>
+              </w:rPr>
+              <w:t>medpt_qa_manifest.jsonl</w:t>
+            </w:r>
+          </w:p>
+          <w:p>
+            <w:pPr>
+              <w:spacing w:after="0" w:line="240" w:lineRule="auto"/>
+              <w:rPr>
+                <w:rFonts w:ascii="Aptos" w:eastAsia="Times New Roman" w:hAnsi="Aptos" w:cs="Calibri"/>
+                <w:color w:val="000000"/>
+                <w:kern w:val="0"/>
+                <w:sz w:val="20"/>
+                <w:szCs w:val="20"/>
+                <w:lang w:eastAsia="pt-BR"/>
+                <w14:ligatures w14:val="none"/>
+              </w:rPr>
+            </w:pPr>
+            <w:r>
+              <w:rPr>
+                <w:rFonts w:ascii="Aptos" w:eastAsia="Times New Roman" w:hAnsi="Aptos" w:cs="Calibri"/>
+                <w:color w:val="000000"/>
+                <w:kern w:val="0"/>
+                <w:sz w:val="20"/>
+                <w:szCs w:val="20"/>
+                <w:lang w:eastAsia="pt-BR"/>
+                <w14:ligatures w14:val="none"/>
+              </w:rPr>
+              <w:t>JSONL com</w:t>
+            </w:r>
+            <w:r>
+              <w:rPr>
+                <w:rFonts w:ascii="Aptos" w:eastAsia="Times New Roman" w:hAnsi="Aptos" w:cs="Calibri"/>
+                <w:color w:val="000000"/>
+                <w:kern w:val="0"/>
+                <w:sz w:val="20"/>
+                <w:szCs w:val="20"/>
+                <w:lang w:eastAsia="pt-BR"/>
+                <w14:ligatures w14:val="none"/>
+              </w:rPr>
+              <w:t xml:space="preserve"> </w:t>
+            </w:r>
+            <w:r>
+              <w:rPr>
+                <w:rFonts w:ascii="Aptos" w:eastAsia="Times New Roman" w:hAnsi="Aptos" w:cs="Calibri"/>
+                <w:b/>
+                <w:bCs/>
+                <w:color w:val="000000"/>
+                <w:kern w:val="0"/>
+                <w:sz w:val="20"/>
+                <w:szCs w:val="20"/>
+                <w:lang w:eastAsia="pt-BR"/>
+                <w14:ligatures w14:val="none"/>
+              </w:rPr>
+              <w:t>uma linha JSON por exemplo mantido</w:t>
+            </w:r>
+            <w:r>
+              <w:rPr>
+                <w:rFonts w:ascii="Aptos" w:eastAsia="Times New Roman" w:hAnsi="Aptos" w:cs="Calibri"/>
+                <w:color w:val="000000"/>
+                <w:kern w:val="0"/>
+                <w:sz w:val="20"/>
+                <w:szCs w:val="20"/>
+                <w:lang w:eastAsia="pt-BR"/>
+                <w14:ligatures w14:val="none"/>
+              </w:rPr>
+              <w:t xml:space="preserve">, com </w:t>
+            </w:r>
+            <w:r>
+              <w:rPr>
+                <w:rFonts w:ascii="Aptos" w:eastAsia="Times New Roman" w:hAnsi="Aptos" w:cs="Calibri"/>
+                <w:color w:val="000000"/>
+                <w:kern w:val="0"/>
+                <w:sz w:val="20"/>
+                <w:szCs w:val="20"/>
+                <w:lang w:eastAsia="pt-BR"/>
+                <w14:ligatures w14:val="none"/>
+              </w:rPr>
+              <w:t xml:space="preserve">os </w:t>
+            </w:r>
+            <w:r>
+              <w:rPr>
+                <w:rFonts w:ascii="Aptos" w:eastAsia="Times New Roman" w:hAnsi="Aptos" w:cs="Calibri"/>
+                <w:color w:val="000000"/>
+                <w:kern w:val="0"/>
+                <w:sz w:val="20"/>
+                <w:szCs w:val="20"/>
+                <w:lang w:eastAsia="pt-BR"/>
+                <w14:ligatures w14:val="none"/>
+              </w:rPr>
+              <w:t>campos</w:t>
+            </w:r>
+            <w:r>
+              <w:rPr>
+                <w:rFonts w:ascii="Aptos" w:eastAsia="Times New Roman" w:hAnsi="Aptos" w:cs="Calibri"/>
+                <w:color w:val="000000"/>
+                <w:kern w:val="0"/>
+                <w:sz w:val="20"/>
+                <w:szCs w:val="20"/>
+                <w:lang w:eastAsia="pt-BR"/>
+                <w14:ligatures w14:val="none"/>
+              </w:rPr>
+              <w:t xml:space="preserve">: </w:t>
+            </w:r>
+          </w:p>
+          <w:p>
+            <w:pPr>
+              <w:spacing w:after="0" w:line="240" w:lineRule="auto"/>
+              <w:rPr>
+                <w:rFonts w:ascii="Aptos" w:eastAsia="Times New Roman" w:hAnsi="Aptos" w:cs="Calibri"/>
+                <w:color w:val="000000"/>
+                <w:kern w:val="0"/>
+                <w:sz w:val="20"/>
+                <w:szCs w:val="20"/>
+                <w:lang w:eastAsia="pt-BR"/>
+                <w14:ligatures w14:val="none"/>
+              </w:rPr>
+            </w:pPr>
+            <w:r>
+              <w:rPr>
+                <w:rFonts w:ascii="Aptos" w:eastAsia="Times New Roman" w:hAnsi="Aptos" w:cs="Calibri"/>
+                <w:i/>
+                <w:iCs/>
+                <w:color w:val="000000"/>
+                <w:kern w:val="0"/>
+                <w:sz w:val="20"/>
+                <w:szCs w:val="20"/>
+                <w:lang w:eastAsia="pt-BR"/>
+                <w14:ligatures w14:val="none"/>
+              </w:rPr>
+              <w:t>question</w:t>
+            </w:r>
+            <w:r>
+              <w:rPr>
+                <w:rFonts w:ascii="Aptos" w:eastAsia="Times New Roman" w:hAnsi="Aptos" w:cs="Calibri"/>
+                <w:i/>
+                <w:iCs/>
+                <w:color w:val="000000"/>
+                <w:kern w:val="0"/>
+                <w:sz w:val="20"/>
+                <w:szCs w:val="20"/>
+                <w:lang w:eastAsia="pt-BR"/>
+                <w14:ligatures w14:val="none"/>
+              </w:rPr>
+              <w:t xml:space="preserve">, </w:t>
+            </w:r>
+            <w:r>
+              <w:rPr>
+                <w:rFonts w:ascii="Aptos" w:eastAsia="Times New Roman" w:hAnsi="Aptos" w:cs="Calibri"/>
+                <w:i/>
+                <w:iCs/>
+                <w:color w:val="000000"/>
+                <w:kern w:val="0"/>
+                <w:sz w:val="20"/>
+                <w:szCs w:val="20"/>
+                <w:lang w:eastAsia="pt-BR"/>
+                <w14:ligatures w14:val="none"/>
+              </w:rPr>
+              <w:t>answer</w:t>
+            </w:r>
+            <w:r>
+              <w:rPr>
+                <w:rFonts w:ascii="Aptos" w:eastAsia="Times New Roman" w:hAnsi="Aptos" w:cs="Calibri"/>
+                <w:i/>
+                <w:iCs/>
+                <w:color w:val="000000"/>
+                <w:kern w:val="0"/>
+                <w:sz w:val="20"/>
+                <w:szCs w:val="20"/>
+                <w:lang w:eastAsia="pt-BR"/>
+                <w14:ligatures w14:val="none"/>
+              </w:rPr>
+              <w:t xml:space="preserve">, </w:t>
+            </w:r>
+            <w:r>
+              <w:rPr>
+                <w:rFonts w:ascii="Aptos" w:eastAsia="Times New Roman" w:hAnsi="Aptos" w:cs="Calibri"/>
+                <w:i/>
+                <w:iCs/>
+                <w:color w:val="000000"/>
+                <w:kern w:val="0"/>
+                <w:sz w:val="20"/>
+                <w:szCs w:val="20"/>
+                <w:lang w:eastAsia="pt-BR"/>
+                <w14:ligatures w14:val="none"/>
+              </w:rPr>
+              <w:t>question</w:t>
+            </w:r>
+            <w:r>
+              <w:rPr>
+                <w:rFonts w:ascii="Aptos" w:eastAsia="Times New Roman" w:hAnsi="Aptos" w:cs="Calibri"/>
+                <w:i/>
+                <w:iCs/>
+                <w:color w:val="000000"/>
+                <w:kern w:val="0"/>
+                <w:sz w:val="20"/>
+                <w:szCs w:val="20"/>
+                <w:lang w:eastAsia="pt-BR"/>
+                <w14:ligatures w14:val="none"/>
+              </w:rPr>
+              <w:t>_</w:t>
+            </w:r>
+            <w:r>
+              <w:rPr>
+                <w:rFonts w:ascii="Aptos" w:eastAsia="Times New Roman" w:hAnsi="Aptos" w:cs="Calibri"/>
+                <w:i/>
+                <w:iCs/>
+                <w:color w:val="000000"/>
+                <w:kern w:val="0"/>
+                <w:sz w:val="20"/>
+                <w:szCs w:val="20"/>
+                <w:lang w:eastAsia="pt-BR"/>
+                <w14:ligatures w14:val="none"/>
+              </w:rPr>
+              <w:t>normaliz</w:t>
+            </w:r>
+            <w:r>
+              <w:rPr>
+                <w:rFonts w:ascii="Aptos" w:eastAsia="Times New Roman" w:hAnsi="Aptos" w:cs="Calibri"/>
+                <w:i/>
+                <w:iCs/>
+                <w:color w:val="000000"/>
+                <w:kern w:val="0"/>
+                <w:sz w:val="20"/>
+                <w:szCs w:val="20"/>
+                <w:lang w:eastAsia="pt-BR"/>
+                <w14:ligatures w14:val="none"/>
+              </w:rPr>
+              <w:t>e</w:t>
+            </w:r>
+            <w:r>
+              <w:rPr>
+                <w:rFonts w:ascii="Aptos" w:eastAsia="Times New Roman" w:hAnsi="Aptos" w:cs="Calibri"/>
+                <w:i/>
+                <w:iCs/>
+                <w:color w:val="000000"/>
+                <w:kern w:val="0"/>
+                <w:sz w:val="20"/>
+                <w:szCs w:val="20"/>
+                <w:lang w:eastAsia="pt-BR"/>
+                <w14:ligatures w14:val="none"/>
+              </w:rPr>
+              <w:t>d, split,</w:t>
+            </w:r>
+            <w:r>
+              <w:rPr>
+                <w:rFonts w:ascii="Aptos" w:eastAsia="Times New Roman" w:hAnsi="Aptos" w:cs="Calibri"/>
+                <w:i/>
+                <w:iCs/>
+                <w:color w:val="000000"/>
+                <w:kern w:val="0"/>
+                <w:sz w:val="20"/>
+                <w:szCs w:val="20"/>
+                <w:lang w:eastAsia="pt-BR"/>
+                <w14:ligatures w14:val="none"/>
+              </w:rPr>
+              <w:t xml:space="preserve"> </w:t>
+            </w:r>
+            <w:r>
+              <w:rPr>
+                <w:rFonts w:ascii="Aptos" w:eastAsia="Times New Roman" w:hAnsi="Aptos" w:cs="Calibri"/>
+                <w:i/>
+                <w:iCs/>
+                <w:color w:val="000000"/>
+                <w:kern w:val="0"/>
+                <w:sz w:val="20"/>
+                <w:szCs w:val="20"/>
+                <w:lang w:eastAsia="pt-BR"/>
+                <w14:ligatures w14:val="none"/>
+              </w:rPr>
+              <w:t>question_type,</w:t>
+            </w:r>
+            <w:r>
+              <w:rPr>
+                <w:rFonts w:ascii="Aptos" w:eastAsia="Times New Roman" w:hAnsi="Aptos" w:cs="Calibri"/>
+                <w:i/>
+                <w:iCs/>
+                <w:color w:val="000000"/>
+                <w:kern w:val="0"/>
+                <w:sz w:val="20"/>
+                <w:szCs w:val="20"/>
+                <w:lang w:eastAsia="pt-BR"/>
+                <w14:ligatures w14:val="none"/>
+              </w:rPr>
+              <w:t xml:space="preserve"> </w:t>
+            </w:r>
+            <w:r>
+              <w:rPr>
+                <w:rFonts w:ascii="Aptos" w:eastAsia="Times New Roman" w:hAnsi="Aptos" w:cs="Calibri"/>
+                <w:i/>
+                <w:iCs/>
+                <w:color w:val="000000"/>
+                <w:kern w:val="0"/>
+                <w:sz w:val="20"/>
+                <w:szCs w:val="20"/>
+                <w:lang w:eastAsia="pt-BR"/>
+                <w14:ligatures w14:val="none"/>
+              </w:rPr>
+              <w:t>condition</w:t>
+            </w:r>
+            <w:r>
+              <w:rPr>
+                <w:rFonts w:ascii="Aptos" w:eastAsia="Times New Roman" w:hAnsi="Aptos" w:cs="Calibri"/>
+                <w:color w:val="000000"/>
+                <w:kern w:val="0"/>
+                <w:sz w:val="20"/>
+                <w:szCs w:val="20"/>
+                <w:lang w:eastAsia="pt-BR"/>
+                <w14:ligatures w14:val="none"/>
+              </w:rPr>
+              <w:t xml:space="preserve"> </w:t>
+            </w:r>
+            <w:r>
+              <w:rPr>
+                <w:rFonts w:ascii="Aptos" w:eastAsia="Times New Roman" w:hAnsi="Aptos" w:cs="Calibri"/>
+                <w:color w:val="000000"/>
+                <w:kern w:val="0"/>
+                <w:sz w:val="20"/>
+                <w:szCs w:val="20"/>
+                <w:lang w:eastAsia="pt-BR"/>
+                <w14:ligatures w14:val="none"/>
+              </w:rPr>
+              <w:t>— útil para</w:t>
+            </w:r>
+            <w:r>
+              <w:rPr>
+                <w:rFonts w:ascii="Aptos" w:eastAsia="Times New Roman" w:hAnsi="Aptos" w:cs="Calibri"/>
+                <w:color w:val="000000"/>
+                <w:kern w:val="0"/>
+                <w:sz w:val="20"/>
+                <w:szCs w:val="20"/>
+                <w:lang w:eastAsia="pt-BR"/>
+                <w14:ligatures w14:val="none"/>
+              </w:rPr>
+              <w:t xml:space="preserve"> </w:t>
+            </w:r>
+            <w:r>
+              <w:rPr>
+                <w:rFonts w:ascii="Aptos" w:eastAsia="Times New Roman" w:hAnsi="Aptos" w:cs="Calibri"/>
+                <w:b/>
+                <w:bCs/>
+                <w:color w:val="000000"/>
+                <w:kern w:val="0"/>
+                <w:sz w:val="20"/>
+                <w:szCs w:val="20"/>
+                <w:lang w:eastAsia="pt-BR"/>
+                <w14:ligatures w14:val="none"/>
+              </w:rPr>
+              <w:t>auditoria</w:t>
+            </w:r>
+            <w:r>
+              <w:rPr>
+                <w:rFonts w:ascii="Aptos" w:eastAsia="Times New Roman" w:hAnsi="Aptos" w:cs="Calibri"/>
+                <w:b/>
+                <w:bCs/>
+                <w:color w:val="000000"/>
+                <w:kern w:val="0"/>
+                <w:sz w:val="20"/>
+                <w:szCs w:val="20"/>
+                <w:lang w:eastAsia="pt-BR"/>
+                <w14:ligatures w14:val="none"/>
+              </w:rPr>
+              <w:t xml:space="preserve"> </w:t>
+            </w:r>
+            <w:r>
+              <w:rPr>
+                <w:rFonts w:ascii="Aptos" w:eastAsia="Times New Roman" w:hAnsi="Aptos" w:cs="Calibri"/>
+                <w:color w:val="000000"/>
+                <w:kern w:val="0"/>
+                <w:sz w:val="20"/>
+                <w:szCs w:val="20"/>
+                <w:lang w:eastAsia="pt-BR"/>
+                <w14:ligatures w14:val="none"/>
+              </w:rPr>
+              <w:t>e analisar fatias.</w:t>
+            </w:r>
+          </w:p>
+        </w:tc>
+      </w:tr>
+      <w:tr>
+        <w:trPr>
+          <w:trHeight w:val="1392"/>
+        </w:trPr>
+        <w:tc>
+          <w:tcPr>
+            <w:tcW w:w="1000" w:type="dxa"/>
+            <w:tcBorders>
+              <w:top w:val="nil"/>
+              <w:left w:val="single" w:sz="8" w:space="0" w:color="auto"/>
+              <w:bottom w:val="single" w:sz="8" w:space="0" w:color="auto"/>
+              <w:right w:val="single" w:sz="8" w:space="0" w:color="auto"/>
+            </w:tcBorders>
+            <w:vAlign w:val="center"/>
+            <w:hideMark/>
+          </w:tcPr>
+          <w:p>
+            <w:pPr>
+              <w:spacing w:after="0" w:line="240" w:lineRule="auto"/>
+              <w:rPr>
+                <w:rFonts w:ascii="Aptos" w:eastAsia="Times New Roman" w:hAnsi="Aptos" w:cs="Calibri"/>
+                <w:b/>
+                <w:bCs/>
+                <w:color w:val="000000"/>
+                <w:kern w:val="0"/>
+                <w:sz w:val="20"/>
+                <w:szCs w:val="20"/>
+                <w:lang w:eastAsia="pt-BR"/>
+                <w14:ligatures w14:val="none"/>
+              </w:rPr>
+            </w:pPr>
+            <w:r>
+              <w:rPr>
+                <w:rFonts w:ascii="Aptos" w:eastAsia="Times New Roman" w:hAnsi="Aptos" w:cs="Calibri"/>
+                <w:b/>
+                <w:bCs/>
+                <w:color w:val="000000"/>
+                <w:kern w:val="0"/>
+                <w:sz w:val="20"/>
+                <w:szCs w:val="20"/>
+                <w:lang w:eastAsia="pt-BR"/>
+                <w14:ligatures w14:val="none"/>
+              </w:rPr>
+              <w:t>4</w:t>
+            </w:r>
+          </w:p>
+        </w:tc>
+        <w:tc>
+          <w:tcPr>
+            <w:tcW w:w="2120" w:type="dxa"/>
+            <w:tcBorders>
+              <w:top w:val="nil"/>
+              <w:left w:val="nil"/>
+              <w:bottom w:val="single" w:sz="8" w:space="0" w:color="auto"/>
+              <w:right w:val="single" w:sz="8" w:space="0" w:color="auto"/>
+            </w:tcBorders>
+            <w:vAlign w:val="center"/>
+            <w:hideMark/>
+          </w:tcPr>
+          <w:p>
+            <w:pPr>
+              <w:spacing w:after="0" w:line="240" w:lineRule="auto"/>
+              <w:rPr>
+                <w:rFonts w:ascii="Aptos" w:eastAsia="Times New Roman" w:hAnsi="Aptos" w:cs="Calibri"/>
+                <w:color w:val="000000"/>
+                <w:kern w:val="0"/>
+                <w:sz w:val="20"/>
+                <w:szCs w:val="20"/>
+                <w:lang w:eastAsia="pt-BR"/>
+                <w14:ligatures w14:val="none"/>
+              </w:rPr>
+            </w:pPr>
+            <w:r>
+              <w:rPr>
+                <w:rFonts w:ascii="Aptos" w:eastAsia="Times New Roman" w:hAnsi="Aptos" w:cs="Calibri"/>
+                <w:color w:val="000000"/>
+                <w:kern w:val="0"/>
+                <w:sz w:val="20"/>
+                <w:szCs w:val="20"/>
+                <w:lang w:eastAsia="pt-BR"/>
+                <w14:ligatures w14:val="none"/>
+              </w:rPr>
+              <w:t>--report-path</w:t>
+            </w:r>
+          </w:p>
+        </w:tc>
+        <w:tc>
+          <w:tcPr>
+            <w:tcW w:w="860" w:type="dxa"/>
+            <w:tcBorders>
+              <w:top w:val="nil"/>
+              <w:left w:val="nil"/>
+              <w:bottom w:val="single" w:sz="8" w:space="0" w:color="auto"/>
+              <w:right w:val="single" w:sz="8" w:space="0" w:color="auto"/>
+            </w:tcBorders>
+            <w:vAlign w:val="center"/>
+            <w:hideMark/>
+          </w:tcPr>
+          <w:p>
+            <w:pPr>
+              <w:spacing w:after="0" w:line="240" w:lineRule="auto"/>
+              <w:rPr>
+                <w:rFonts w:ascii="Aptos" w:eastAsia="Times New Roman" w:hAnsi="Aptos" w:cs="Calibri"/>
+                <w:b/>
+                <w:bCs/>
+                <w:color w:val="000000"/>
+                <w:kern w:val="0"/>
+                <w:sz w:val="20"/>
+                <w:szCs w:val="20"/>
+                <w:lang w:eastAsia="pt-BR"/>
+                <w14:ligatures w14:val="none"/>
+              </w:rPr>
+            </w:pPr>
+            <w:r>
+              <w:rPr>
+                <w:rFonts w:ascii="Aptos" w:eastAsia="Times New Roman" w:hAnsi="Aptos" w:cs="Calibri"/>
+                <w:b/>
+                <w:bCs/>
+                <w:color w:val="000000"/>
+                <w:kern w:val="0"/>
+                <w:sz w:val="20"/>
+                <w:szCs w:val="20"/>
+                <w:lang w:eastAsia="pt-BR"/>
+                <w14:ligatures w14:val="none"/>
+              </w:rPr>
+              <w:t>Saída</w:t>
+            </w:r>
+          </w:p>
+        </w:tc>
+        <w:tc>
+          <w:tcPr>
+            <w:tcW w:w="4100" w:type="dxa"/>
+            <w:tcBorders>
+              <w:top w:val="nil"/>
+              <w:left w:val="nil"/>
+              <w:bottom w:val="single" w:sz="8" w:space="0" w:color="auto"/>
+              <w:right w:val="single" w:sz="8" w:space="0" w:color="auto"/>
+            </w:tcBorders>
+            <w:vAlign w:val="center"/>
+            <w:hideMark/>
+          </w:tcPr>
+          <w:p>
+            <w:pPr>
+              <w:spacing w:after="0" w:line="240" w:lineRule="auto"/>
+              <w:rPr>
+                <w:rFonts w:ascii="Aptos" w:eastAsia="Times New Roman" w:hAnsi="Aptos" w:cs="Calibri"/>
+                <w:b/>
+                <w:bCs/>
+                <w:i/>
+                <w:iCs/>
+                <w:color w:val="000000"/>
+                <w:kern w:val="0"/>
+                <w:sz w:val="20"/>
+                <w:szCs w:val="20"/>
+                <w:lang w:eastAsia="pt-BR"/>
+                <w14:ligatures w14:val="none"/>
+              </w:rPr>
+            </w:pPr>
+            <w:r>
+              <w:rPr>
+                <w:rFonts w:ascii="Aptos" w:eastAsia="Times New Roman" w:hAnsi="Aptos" w:cs="Calibri"/>
+                <w:b/>
+                <w:bCs/>
+                <w:i/>
+                <w:iCs/>
+                <w:color w:val="000000"/>
+                <w:kern w:val="0"/>
+                <w:sz w:val="20"/>
+                <w:szCs w:val="20"/>
+                <w:lang w:eastAsia="pt-BR"/>
+                <w14:ligatures w14:val="none"/>
+              </w:rPr>
+              <w:t>data/processed/</w:t>
+            </w:r>
+            <w:r>
+              <w:rPr>
+                <w:rFonts w:ascii="Aptos" w:eastAsia="Times New Roman" w:hAnsi="Aptos" w:cs="Calibri"/>
+                <w:b/>
+                <w:bCs/>
+                <w:i/>
+                <w:iCs/>
+                <w:color w:val="000000"/>
+                <w:kern w:val="0"/>
+                <w:sz w:val="20"/>
+                <w:szCs w:val="20"/>
+                <w:lang w:eastAsia="pt-BR"/>
+                <w14:ligatures w14:val="none"/>
+              </w:rPr>
+              <w:t>medpt_qa_report.json</w:t>
+            </w:r>
+          </w:p>
+          <w:p>
+            <w:pPr>
+              <w:spacing w:after="0" w:line="240" w:lineRule="auto"/>
+              <w:rPr>
+                <w:rFonts w:ascii="Aptos" w:eastAsia="Times New Roman" w:hAnsi="Aptos" w:cs="Calibri"/>
+                <w:color w:val="000000"/>
+                <w:kern w:val="0"/>
+                <w:sz w:val="20"/>
+                <w:szCs w:val="20"/>
+                <w:lang w:eastAsia="pt-BR"/>
+                <w14:ligatures w14:val="none"/>
+              </w:rPr>
+            </w:pPr>
+            <w:r>
+              <w:rPr>
+                <w:rFonts w:ascii="Aptos" w:eastAsia="Times New Roman" w:hAnsi="Aptos" w:cs="Calibri"/>
+                <w:color w:val="000000"/>
+                <w:kern w:val="0"/>
+                <w:sz w:val="20"/>
+                <w:szCs w:val="20"/>
+                <w:lang w:eastAsia="pt-BR"/>
+                <w14:ligatures w14:val="none"/>
+              </w:rPr>
+              <w:t>JSON agregado: contagens totais, linhas removidas e motivos, distribuição por split, config usada (seed, razões de split, limites de tokens), top tipos de pergunta/condição — é o</w:t>
+            </w:r>
+            <w:r>
+              <w:rPr>
+                <w:rFonts w:ascii="Aptos" w:eastAsia="Times New Roman" w:hAnsi="Aptos" w:cs="Calibri"/>
+                <w:color w:val="000000"/>
+                <w:kern w:val="0"/>
+                <w:sz w:val="20"/>
+                <w:szCs w:val="20"/>
+                <w:lang w:eastAsia="pt-BR"/>
+                <w14:ligatures w14:val="none"/>
+              </w:rPr>
+              <w:t xml:space="preserve"> </w:t>
+            </w:r>
+            <w:r>
+              <w:rPr>
+                <w:rFonts w:ascii="Aptos" w:eastAsia="Times New Roman" w:hAnsi="Aptos" w:cs="Calibri"/>
+                <w:b/>
+                <w:bCs/>
+                <w:color w:val="000000"/>
+                <w:kern w:val="0"/>
+                <w:sz w:val="20"/>
+                <w:szCs w:val="20"/>
+                <w:lang w:eastAsia="pt-BR"/>
+                <w14:ligatures w14:val="none"/>
+              </w:rPr>
+              <w:t>relatório</w:t>
+            </w:r>
+            <w:r>
+              <w:rPr>
+                <w:rFonts w:ascii="Aptos" w:eastAsia="Times New Roman" w:hAnsi="Aptos" w:cs="Calibri"/>
+                <w:b/>
+                <w:bCs/>
+                <w:color w:val="000000"/>
+                <w:kern w:val="0"/>
+                <w:sz w:val="20"/>
+                <w:szCs w:val="20"/>
+                <w:lang w:eastAsia="pt-BR"/>
+                <w14:ligatures w14:val="none"/>
+              </w:rPr>
+              <w:t xml:space="preserve"> </w:t>
+            </w:r>
+            <w:r>
+              <w:rPr>
+                <w:rFonts w:ascii="Aptos" w:eastAsia="Times New Roman" w:hAnsi="Aptos" w:cs="Calibri"/>
+                <w:color w:val="000000"/>
+                <w:kern w:val="0"/>
+                <w:sz w:val="20"/>
+                <w:szCs w:val="20"/>
+                <w:lang w:eastAsia="pt-BR"/>
+                <w14:ligatures w14:val="none"/>
+              </w:rPr>
+              <w:t>da execução.</w:t>
+            </w:r>
+          </w:p>
+        </w:tc>
+      </w:tr>
+    </w:tbl>
+    <w:p>
+      <w:pPr>
+        <w:rPr>
+          <w:b/>
+          <w:bCs/>
+        </w:rPr>
+      </w:pPr>
+    </w:p>
+    <w:p>
+      <w:r>
+        <w:rPr>
+          <w:b/>
+          <w:bCs/>
+        </w:rPr>
+        <w:t>Ordem prática:</w:t>
+      </w:r>
+      <w:r>
+        <w:rPr>
+          <w:b/>
+          <w:bCs/>
+        </w:rPr>
         <w:t xml:space="preserve"> </w:t>
       </w:r>
       <w:r>
-        <w:t>os modelos intermediários</w:t>
-      </w:r>
-      <w:r>
-        <w:t xml:space="preserve"> gerados durante o treinamento.</w:t>
-      </w:r>
-    </w:p>
-    <w:p>
-      <w:r>
-        <w:rPr>
-          <w:i/>
-          <w:iCs/>
-          <w:color w:val="EE0000"/>
-        </w:rPr>
-        <w:t>&lt;base&gt;</w:t>
-      </w:r>
-      <w:r>
-        <w:t>\</w:t>
-      </w:r>
-      <w:proofErr w:type="spellStart"/>
-      <w:r>
-        <w:t>pre-trained</w:t>
-      </w:r>
-      <w:proofErr w:type="spellEnd"/>
+        <w:t>você aponta</w:t>
+      </w:r>
       <w:r>
         <w:t xml:space="preserve"> </w:t>
       </w:r>
       <w:r>
-        <w:sym w:font="Wingdings" w:char="F0E0"/>
+        <w:rPr>
+          <w:b/>
+          <w:bCs/>
+        </w:rPr>
+        <w:t>só o parquet de entrada</w:t>
+      </w:r>
+      <w:r>
+        <w:t>; o script produz</w:t>
       </w:r>
       <w:r>
         <w:t xml:space="preserve"> </w:t>
       </w:r>
-      <w:proofErr w:type="spellStart"/>
-      <w:proofErr w:type="gramStart"/>
-      <w:r>
-        <w:t>contem</w:t>
-      </w:r>
-      <w:proofErr w:type="spellEnd"/>
-      <w:proofErr w:type="gramEnd"/>
-      <w:r>
-        <w:t xml:space="preserve"> o modelo </w:t>
-      </w:r>
-      <w:proofErr w:type="spellStart"/>
-      <w:r>
-        <w:t>pré</w:t>
-      </w:r>
-      <w:proofErr w:type="spellEnd"/>
-      <w:r>
-        <w:t xml:space="preserve">-treinado é o </w:t>
-      </w:r>
-      <w:proofErr w:type="spellStart"/>
-      <w:r>
-        <w:t>tokenizer</w:t>
-      </w:r>
-      <w:proofErr w:type="spellEnd"/>
-      <w:r>
-        <w:t xml:space="preserve"> do modelo </w:t>
-      </w:r>
-      <w:proofErr w:type="spellStart"/>
-      <w:r>
-        <w:t>pre</w:t>
-      </w:r>
-      <w:proofErr w:type="spellEnd"/>
-      <w:r>
-        <w:t>-treinado.</w:t>
-      </w:r>
-    </w:p>
-    <w:p>
-      <w:r>
-        <w:rPr>
-          <w:i/>
-          <w:iCs/>
-          <w:color w:val="EE0000"/>
-        </w:rPr>
-        <w:t>&lt;base&gt;</w:t>
-      </w:r>
-      <w:r>
-        <w:t>\</w:t>
-      </w:r>
-      <w:proofErr w:type="spellStart"/>
-      <w:r>
-        <w:t>docs</w:t>
-      </w:r>
-      <w:proofErr w:type="spellEnd"/>
-      <w:r>
+      <w:r>
+        <w:rPr>
+          <w:b/>
+          <w:bCs/>
+        </w:rPr>
+        <w:t>as três saídas</w:t>
+      </w:r>
+      <w:r>
+        <w:rPr>
+          <w:b/>
+          <w:bCs/>
+        </w:rPr>
         <w:t xml:space="preserve"> </w:t>
       </w:r>
       <w:r>
-        <w:sym w:font="Wingdings" w:char="F0E0"/>
-      </w:r>
-      <w:r>
-        <w:t xml:space="preserve"> documentação do projeto</w:t>
-      </w:r>
-    </w:p>
+        <w:t xml:space="preserve">em paralelo a partir do mesmo processamento (não há dependência sequencial entre o manifest e o </w:t>
+      </w:r>
+      <w:r>
+        <w:t>report</w:t>
+      </w:r>
+      <w:r>
+        <w:t xml:space="preserve"> — ambos são derivados do mesmo pipeline).</w:t>
+      </w:r>
+    </w:p>
+    <w:p/>
+    <w:p>
+      <w:pPr>
+        <w:rPr>
+          <w:b/>
+          <w:bCs/>
+        </w:rPr>
+      </w:pPr>
+      <w:r>
+        <w:rPr>
+          <w:b/>
+          <w:bCs/>
+        </w:rPr>
+        <w:t>Estrutura comum em</w:t>
+      </w:r>
+      <w:r>
+        <w:rPr>
+          <w:b/>
+          <w:bCs/>
+        </w:rPr>
+        <w:t xml:space="preserve"> </w:t>
+      </w:r>
+      <w:r>
+        <w:rPr>
+          <w:b/>
+          <w:bCs/>
+        </w:rPr>
+        <w:t>train,</w:t>
+      </w:r>
+      <w:r>
+        <w:rPr>
+          <w:b/>
+          <w:bCs/>
+        </w:rPr>
+        <w:t xml:space="preserve"> </w:t>
+      </w:r>
+      <w:r>
+        <w:rPr>
+          <w:b/>
+          <w:bCs/>
+        </w:rPr>
+        <w:t>validation</w:t>
+      </w:r>
+      <w:r>
+        <w:rPr>
+          <w:b/>
+          <w:bCs/>
+        </w:rPr>
+        <w:t xml:space="preserve"> </w:t>
+      </w:r>
+      <w:r>
+        <w:rPr>
+          <w:b/>
+          <w:bCs/>
+        </w:rPr>
+        <w:t>e</w:t>
+      </w:r>
+      <w:r>
+        <w:rPr>
+          <w:b/>
+          <w:bCs/>
+        </w:rPr>
+        <w:t xml:space="preserve"> </w:t>
+      </w:r>
+      <w:r>
+        <w:rPr>
+          <w:b/>
+          <w:bCs/>
+        </w:rPr>
+        <w:t>test</w:t>
+      </w:r>
+    </w:p>
+    <w:tbl>
+      <w:tblPr>
+        <w:tblW w:w="8360" w:type="dxa"/>
+        <w:tblCellMar>
+          <w:left w:w="70" w:type="dxa"/>
+          <w:right w:w="70" w:type="dxa"/>
+        </w:tblCellMar>
+        <w:tblLook w:val="04A0" w:firstRow="1" w:lastRow="0" w:firstColumn="1" w:lastColumn="0" w:noHBand="0" w:noVBand="1"/>
+      </w:tblPr>
+      <w:tblGrid>
+        <w:gridCol w:w="2980"/>
+        <w:gridCol w:w="5380"/>
+      </w:tblGrid>
+      <w:tr>
+        <w:trPr>
+          <w:trHeight w:val="336"/>
+        </w:trPr>
+        <w:tc>
+          <w:tcPr>
+            <w:tcW w:w="2980" w:type="dxa"/>
+            <w:tcBorders>
+              <w:top w:val="single" w:sz="12" w:space="0" w:color="auto"/>
+              <w:left w:val="single" w:sz="12" w:space="0" w:color="auto"/>
+              <w:bottom w:val="single" w:sz="8" w:space="0" w:color="auto"/>
+              <w:right w:val="single" w:sz="8" w:space="0" w:color="auto"/>
+            </w:tcBorders>
+            <w:vAlign w:val="center"/>
+            <w:hideMark/>
+          </w:tcPr>
+          <w:p>
+            <w:pPr>
+              <w:spacing w:after="0" w:line="240" w:lineRule="auto"/>
+              <w:rPr>
+                <w:rFonts w:ascii="Aptos" w:eastAsia="Times New Roman" w:hAnsi="Aptos" w:cs="Calibri"/>
+                <w:b/>
+                <w:bCs/>
+                <w:color w:val="000000"/>
+                <w:kern w:val="0"/>
+                <w:lang w:eastAsia="pt-BR"/>
+                <w14:ligatures w14:val="none"/>
+              </w:rPr>
+            </w:pPr>
+            <w:r>
+              <w:rPr>
+                <w:rFonts w:ascii="Aptos" w:eastAsia="Times New Roman" w:hAnsi="Aptos" w:cs="Calibri"/>
+                <w:b/>
+                <w:bCs/>
+                <w:color w:val="000000"/>
+                <w:kern w:val="0"/>
+                <w:lang w:eastAsia="pt-BR"/>
+                <w14:ligatures w14:val="none"/>
+              </w:rPr>
+              <w:t>Arquivo</w:t>
+            </w:r>
+          </w:p>
+        </w:tc>
+        <w:tc>
+          <w:tcPr>
+            <w:tcW w:w="5380" w:type="dxa"/>
+            <w:tcBorders>
+              <w:top w:val="single" w:sz="12" w:space="0" w:color="auto"/>
+              <w:left w:val="nil"/>
+              <w:bottom w:val="single" w:sz="8" w:space="0" w:color="auto"/>
+              <w:right w:val="single" w:sz="12" w:space="0" w:color="auto"/>
+            </w:tcBorders>
+            <w:vAlign w:val="center"/>
+            <w:hideMark/>
+          </w:tcPr>
+          <w:p>
+            <w:pPr>
+              <w:spacing w:after="0" w:line="240" w:lineRule="auto"/>
+              <w:rPr>
+                <w:rFonts w:ascii="Aptos" w:eastAsia="Times New Roman" w:hAnsi="Aptos" w:cs="Calibri"/>
+                <w:b/>
+                <w:bCs/>
+                <w:color w:val="000000"/>
+                <w:kern w:val="0"/>
+                <w:lang w:eastAsia="pt-BR"/>
+                <w14:ligatures w14:val="none"/>
+              </w:rPr>
+            </w:pPr>
+            <w:r>
+              <w:rPr>
+                <w:rFonts w:ascii="Aptos" w:eastAsia="Times New Roman" w:hAnsi="Aptos" w:cs="Calibri"/>
+                <w:b/>
+                <w:bCs/>
+                <w:color w:val="000000"/>
+                <w:kern w:val="0"/>
+                <w:lang w:eastAsia="pt-BR"/>
+                <w14:ligatures w14:val="none"/>
+              </w:rPr>
+              <w:t>Função</w:t>
+            </w:r>
+          </w:p>
+        </w:tc>
+      </w:tr>
+      <w:tr>
+        <w:trPr>
+          <w:trHeight w:val="1470"/>
+        </w:trPr>
+        <w:tc>
+          <w:tcPr>
+            <w:tcW w:w="2980" w:type="dxa"/>
+            <w:tcBorders>
+              <w:top w:val="nil"/>
+              <w:left w:val="single" w:sz="12" w:space="0" w:color="auto"/>
+              <w:bottom w:val="single" w:sz="8" w:space="0" w:color="auto"/>
+              <w:right w:val="single" w:sz="8" w:space="0" w:color="auto"/>
+            </w:tcBorders>
+            <w:vAlign w:val="center"/>
+            <w:hideMark/>
+          </w:tcPr>
+          <w:p>
+            <w:pPr>
+              <w:spacing w:after="0" w:line="240" w:lineRule="auto"/>
+              <w:rPr>
+                <w:rFonts w:ascii="Aptos" w:eastAsia="Times New Roman" w:hAnsi="Aptos" w:cs="Calibri"/>
+                <w:b/>
+                <w:bCs/>
+                <w:color w:val="000000"/>
+                <w:kern w:val="0"/>
+                <w:sz w:val="20"/>
+                <w:szCs w:val="20"/>
+                <w:lang w:eastAsia="pt-BR"/>
+                <w14:ligatures w14:val="none"/>
+              </w:rPr>
+            </w:pPr>
+            <w:r>
+              <w:rPr>
+                <w:rFonts w:ascii="Aptos" w:eastAsia="Times New Roman" w:hAnsi="Aptos" w:cs="Calibri"/>
+                <w:b/>
+                <w:bCs/>
+                <w:color w:val="000000"/>
+                <w:kern w:val="0"/>
+                <w:sz w:val="20"/>
+                <w:szCs w:val="20"/>
+                <w:lang w:eastAsia="pt-BR"/>
+                <w14:ligatures w14:val="none"/>
+              </w:rPr>
+              <w:t>data-00000-of-00001.arrow</w:t>
+            </w:r>
+          </w:p>
+        </w:tc>
+        <w:tc>
+          <w:tcPr>
+            <w:tcW w:w="5380" w:type="dxa"/>
+            <w:tcBorders>
+              <w:top w:val="nil"/>
+              <w:left w:val="nil"/>
+              <w:bottom w:val="single" w:sz="8" w:space="0" w:color="auto"/>
+              <w:right w:val="single" w:sz="12" w:space="0" w:color="auto"/>
+            </w:tcBorders>
+            <w:vAlign w:val="center"/>
+            <w:hideMark/>
+          </w:tcPr>
+          <w:p>
+            <w:pPr>
+              <w:spacing w:after="0" w:line="240" w:lineRule="auto"/>
+              <w:rPr>
+                <w:rFonts w:ascii="Aptos" w:eastAsia="Times New Roman" w:hAnsi="Aptos" w:cs="Calibri"/>
+                <w:color w:val="000000"/>
+                <w:kern w:val="0"/>
+                <w:sz w:val="20"/>
+                <w:szCs w:val="20"/>
+                <w:lang w:eastAsia="pt-BR"/>
+                <w14:ligatures w14:val="none"/>
+              </w:rPr>
+            </w:pPr>
+            <w:r>
+              <w:rPr>
+                <w:rFonts w:ascii="Aptos" w:eastAsia="Times New Roman" w:hAnsi="Aptos" w:cs="Calibri"/>
+                <w:color w:val="000000"/>
+                <w:kern w:val="0"/>
+                <w:sz w:val="20"/>
+                <w:szCs w:val="20"/>
+                <w:lang w:eastAsia="pt-BR"/>
+                <w14:ligatures w14:val="none"/>
+              </w:rPr>
+              <w:t>Arquivo binário</w:t>
+            </w:r>
+            <w:r>
+              <w:rPr>
+                <w:rFonts w:ascii="Aptos" w:eastAsia="Times New Roman" w:hAnsi="Aptos" w:cs="Calibri"/>
+                <w:color w:val="000000"/>
+                <w:kern w:val="0"/>
+                <w:sz w:val="20"/>
+                <w:szCs w:val="20"/>
+                <w:lang w:eastAsia="pt-BR"/>
+                <w14:ligatures w14:val="none"/>
+              </w:rPr>
+              <w:t xml:space="preserve"> </w:t>
+            </w:r>
+            <w:r>
+              <w:rPr>
+                <w:rFonts w:ascii="Aptos" w:eastAsia="Times New Roman" w:hAnsi="Aptos" w:cs="Calibri"/>
+                <w:b/>
+                <w:bCs/>
+                <w:color w:val="000000"/>
+                <w:kern w:val="0"/>
+                <w:sz w:val="20"/>
+                <w:szCs w:val="20"/>
+                <w:lang w:eastAsia="pt-BR"/>
+                <w14:ligatures w14:val="none"/>
+              </w:rPr>
+              <w:t>Apache Arrow</w:t>
+            </w:r>
+            <w:r>
+              <w:rPr>
+                <w:rFonts w:ascii="Aptos" w:eastAsia="Times New Roman" w:hAnsi="Aptos" w:cs="Calibri"/>
+                <w:b/>
+                <w:bCs/>
+                <w:color w:val="000000"/>
+                <w:kern w:val="0"/>
+                <w:sz w:val="20"/>
+                <w:szCs w:val="20"/>
+                <w:lang w:eastAsia="pt-BR"/>
+                <w14:ligatures w14:val="none"/>
+              </w:rPr>
+              <w:t xml:space="preserve"> </w:t>
+            </w:r>
+            <w:r>
+              <w:rPr>
+                <w:rFonts w:ascii="Aptos" w:eastAsia="Times New Roman" w:hAnsi="Aptos" w:cs="Calibri"/>
+                <w:color w:val="000000"/>
+                <w:kern w:val="0"/>
+                <w:sz w:val="20"/>
+                <w:szCs w:val="20"/>
+                <w:lang w:eastAsia="pt-BR"/>
+                <w14:ligatures w14:val="none"/>
+              </w:rPr>
+              <w:t>com os</w:t>
+            </w:r>
+            <w:r>
+              <w:rPr>
+                <w:rFonts w:ascii="Aptos" w:eastAsia="Times New Roman" w:hAnsi="Aptos" w:cs="Calibri"/>
+                <w:color w:val="000000"/>
+                <w:kern w:val="0"/>
+                <w:sz w:val="20"/>
+                <w:szCs w:val="20"/>
+                <w:lang w:eastAsia="pt-BR"/>
+                <w14:ligatures w14:val="none"/>
+              </w:rPr>
+              <w:t xml:space="preserve"> </w:t>
+            </w:r>
+            <w:r>
+              <w:rPr>
+                <w:rFonts w:ascii="Aptos" w:eastAsia="Times New Roman" w:hAnsi="Aptos" w:cs="Calibri"/>
+                <w:b/>
+                <w:bCs/>
+                <w:color w:val="000000"/>
+                <w:kern w:val="0"/>
+                <w:sz w:val="20"/>
+                <w:szCs w:val="20"/>
+                <w:lang w:eastAsia="pt-BR"/>
+                <w14:ligatures w14:val="none"/>
+              </w:rPr>
+              <w:t>dados do split</w:t>
+            </w:r>
+            <w:r>
+              <w:rPr>
+                <w:rFonts w:ascii="Aptos" w:eastAsia="Times New Roman" w:hAnsi="Aptos" w:cs="Calibri"/>
+                <w:color w:val="000000"/>
+                <w:kern w:val="0"/>
+                <w:sz w:val="20"/>
+                <w:szCs w:val="20"/>
+                <w:lang w:eastAsia="pt-BR"/>
+                <w14:ligatures w14:val="none"/>
+              </w:rPr>
+              <w:t>: linhas da tabela com as colunas</w:t>
+            </w:r>
+            <w:r>
+              <w:rPr>
+                <w:rFonts w:ascii="Aptos" w:eastAsia="Times New Roman" w:hAnsi="Aptos" w:cs="Calibri"/>
+                <w:color w:val="000000"/>
+                <w:kern w:val="0"/>
+                <w:sz w:val="20"/>
+                <w:szCs w:val="20"/>
+                <w:lang w:eastAsia="pt-BR"/>
+                <w14:ligatures w14:val="none"/>
+              </w:rPr>
+              <w:t xml:space="preserve"> </w:t>
+            </w:r>
+            <w:r>
+              <w:rPr>
+                <w:rFonts w:ascii="Aptos" w:eastAsia="Times New Roman" w:hAnsi="Aptos" w:cs="Calibri"/>
+                <w:i/>
+                <w:iCs/>
+                <w:color w:val="000000"/>
+                <w:kern w:val="0"/>
+                <w:sz w:val="20"/>
+                <w:szCs w:val="20"/>
+                <w:lang w:eastAsia="pt-BR"/>
+                <w14:ligatures w14:val="none"/>
+              </w:rPr>
+              <w:t>question</w:t>
+            </w:r>
+            <w:r>
+              <w:rPr>
+                <w:rFonts w:ascii="Aptos" w:eastAsia="Times New Roman" w:hAnsi="Aptos" w:cs="Calibri"/>
+                <w:color w:val="000000"/>
+                <w:kern w:val="0"/>
+                <w:sz w:val="20"/>
+                <w:szCs w:val="20"/>
+                <w:lang w:eastAsia="pt-BR"/>
+                <w14:ligatures w14:val="none"/>
+              </w:rPr>
+              <w:t xml:space="preserve"> </w:t>
+            </w:r>
+            <w:r>
+              <w:rPr>
+                <w:rFonts w:ascii="Aptos" w:eastAsia="Times New Roman" w:hAnsi="Aptos" w:cs="Calibri"/>
+                <w:color w:val="000000"/>
+                <w:kern w:val="0"/>
+                <w:sz w:val="20"/>
+                <w:szCs w:val="20"/>
+                <w:lang w:eastAsia="pt-BR"/>
+                <w14:ligatures w14:val="none"/>
+              </w:rPr>
+              <w:t>e</w:t>
+            </w:r>
+            <w:r>
+              <w:rPr>
+                <w:rFonts w:ascii="Aptos" w:eastAsia="Times New Roman" w:hAnsi="Aptos" w:cs="Calibri"/>
+                <w:color w:val="000000"/>
+                <w:kern w:val="0"/>
+                <w:sz w:val="20"/>
+                <w:szCs w:val="20"/>
+                <w:lang w:eastAsia="pt-BR"/>
+                <w14:ligatures w14:val="none"/>
+              </w:rPr>
+              <w:t xml:space="preserve"> </w:t>
+            </w:r>
+            <w:r>
+              <w:rPr>
+                <w:rFonts w:ascii="Aptos" w:eastAsia="Times New Roman" w:hAnsi="Aptos" w:cs="Calibri"/>
+                <w:i/>
+                <w:iCs/>
+                <w:color w:val="000000"/>
+                <w:kern w:val="0"/>
+                <w:sz w:val="20"/>
+                <w:szCs w:val="20"/>
+                <w:lang w:eastAsia="pt-BR"/>
+                <w14:ligatures w14:val="none"/>
+              </w:rPr>
+              <w:t>answer</w:t>
+            </w:r>
+            <w:r>
+              <w:rPr>
+                <w:rFonts w:ascii="Aptos" w:eastAsia="Times New Roman" w:hAnsi="Aptos" w:cs="Calibri"/>
+                <w:color w:val="000000"/>
+                <w:kern w:val="0"/>
+                <w:sz w:val="20"/>
+                <w:szCs w:val="20"/>
+                <w:lang w:eastAsia="pt-BR"/>
+                <w14:ligatures w14:val="none"/>
+              </w:rPr>
+              <w:t>. É onde estão guardados os textos efetivamente usados nesse conjunto (treino / validação / teste). O nome pode incluir shards (data-00000-of-00002.arrow</w:t>
+            </w:r>
+            <w:r>
+              <w:rPr>
+                <w:rFonts w:ascii="Aptos" w:eastAsia="Times New Roman" w:hAnsi="Aptos" w:cs="Calibri"/>
+                <w:color w:val="000000"/>
+                <w:kern w:val="0"/>
+                <w:sz w:val="20"/>
+                <w:szCs w:val="20"/>
+                <w:lang w:eastAsia="pt-BR"/>
+                <w14:ligatures w14:val="none"/>
+              </w:rPr>
+              <w:t xml:space="preserve">, </w:t>
+            </w:r>
+            <w:r>
+              <w:rPr>
+                <w:rFonts w:ascii="Aptos" w:eastAsia="Times New Roman" w:hAnsi="Aptos" w:cs="Calibri"/>
+                <w:color w:val="000000"/>
+                <w:kern w:val="0"/>
+                <w:sz w:val="20"/>
+                <w:szCs w:val="20"/>
+                <w:lang w:eastAsia="pt-BR"/>
+                <w14:ligatures w14:val="none"/>
+              </w:rPr>
+              <w:t>etc.) se o conjunto for grande o bastante para vários fragmentos</w:t>
+            </w:r>
+            <w:r>
+              <w:rPr>
+                <w:rFonts w:ascii="Aptos" w:eastAsia="Times New Roman" w:hAnsi="Aptos" w:cs="Calibri"/>
+                <w:color w:val="000000"/>
+                <w:kern w:val="0"/>
+                <w:sz w:val="20"/>
+                <w:szCs w:val="20"/>
+                <w:lang w:eastAsia="pt-BR"/>
+                <w14:ligatures w14:val="none"/>
+              </w:rPr>
+              <w:t>.</w:t>
+            </w:r>
+          </w:p>
+        </w:tc>
+      </w:tr>
+      <w:tr>
+        <w:trPr>
+          <w:trHeight w:val="1116"/>
+        </w:trPr>
+        <w:tc>
+          <w:tcPr>
+            <w:tcW w:w="2980" w:type="dxa"/>
+            <w:tcBorders>
+              <w:top w:val="nil"/>
+              <w:left w:val="single" w:sz="12" w:space="0" w:color="auto"/>
+              <w:bottom w:val="single" w:sz="8" w:space="0" w:color="auto"/>
+              <w:right w:val="single" w:sz="8" w:space="0" w:color="auto"/>
+            </w:tcBorders>
+            <w:vAlign w:val="center"/>
+            <w:hideMark/>
+          </w:tcPr>
+          <w:p>
+            <w:pPr>
+              <w:spacing w:after="0" w:line="240" w:lineRule="auto"/>
+              <w:rPr>
+                <w:rFonts w:ascii="Aptos" w:eastAsia="Times New Roman" w:hAnsi="Aptos" w:cs="Calibri"/>
+                <w:b/>
+                <w:bCs/>
+                <w:color w:val="000000"/>
+                <w:kern w:val="0"/>
+                <w:sz w:val="20"/>
+                <w:szCs w:val="20"/>
+                <w:lang w:eastAsia="pt-BR"/>
+                <w14:ligatures w14:val="none"/>
+              </w:rPr>
+            </w:pPr>
+            <w:r>
+              <w:rPr>
+                <w:rFonts w:ascii="Aptos" w:eastAsia="Times New Roman" w:hAnsi="Aptos" w:cs="Calibri"/>
+                <w:b/>
+                <w:bCs/>
+                <w:color w:val="000000"/>
+                <w:kern w:val="0"/>
+                <w:sz w:val="20"/>
+                <w:szCs w:val="20"/>
+                <w:lang w:eastAsia="pt-BR"/>
+                <w14:ligatures w14:val="none"/>
+              </w:rPr>
+              <w:t>dataset_info.json</w:t>
+            </w:r>
+          </w:p>
+        </w:tc>
+        <w:tc>
+          <w:tcPr>
+            <w:tcW w:w="5380" w:type="dxa"/>
+            <w:tcBorders>
+              <w:top w:val="nil"/>
+              <w:left w:val="nil"/>
+              <w:bottom w:val="single" w:sz="8" w:space="0" w:color="auto"/>
+              <w:right w:val="single" w:sz="12" w:space="0" w:color="auto"/>
+            </w:tcBorders>
+            <w:vAlign w:val="center"/>
+            <w:hideMark/>
+          </w:tcPr>
+          <w:p>
+            <w:pPr>
+              <w:spacing w:after="0" w:line="240" w:lineRule="auto"/>
+              <w:rPr>
+                <w:rFonts w:ascii="Aptos" w:eastAsia="Times New Roman" w:hAnsi="Aptos" w:cs="Calibri"/>
+                <w:color w:val="000000"/>
+                <w:kern w:val="0"/>
+                <w:sz w:val="20"/>
+                <w:szCs w:val="20"/>
+                <w:lang w:eastAsia="pt-BR"/>
+                <w14:ligatures w14:val="none"/>
+              </w:rPr>
+            </w:pPr>
+            <w:r>
+              <w:rPr>
+                <w:rFonts w:ascii="Aptos" w:eastAsia="Times New Roman" w:hAnsi="Aptos" w:cs="Calibri"/>
+                <w:color w:val="000000"/>
+                <w:kern w:val="0"/>
+                <w:sz w:val="20"/>
+                <w:szCs w:val="20"/>
+                <w:lang w:eastAsia="pt-BR"/>
+                <w14:ligatures w14:val="none"/>
+              </w:rPr>
+              <w:t>Metadados do</w:t>
+            </w:r>
+            <w:r>
+              <w:rPr>
+                <w:rFonts w:ascii="Aptos" w:eastAsia="Times New Roman" w:hAnsi="Aptos" w:cs="Calibri"/>
+                <w:color w:val="000000"/>
+                <w:kern w:val="0"/>
+                <w:sz w:val="20"/>
+                <w:szCs w:val="20"/>
+                <w:lang w:eastAsia="pt-BR"/>
+                <w14:ligatures w14:val="none"/>
+              </w:rPr>
+              <w:t xml:space="preserve"> </w:t>
+            </w:r>
+            <w:r>
+              <w:rPr>
+                <w:rFonts w:ascii="Aptos" w:eastAsia="Times New Roman" w:hAnsi="Aptos" w:cs="Calibri"/>
+                <w:b/>
+                <w:bCs/>
+                <w:color w:val="000000"/>
+                <w:kern w:val="0"/>
+                <w:sz w:val="20"/>
+                <w:szCs w:val="20"/>
+                <w:lang w:eastAsia="pt-BR"/>
+                <w14:ligatures w14:val="none"/>
+              </w:rPr>
+              <w:t>esquema</w:t>
+            </w:r>
+            <w:r>
+              <w:rPr>
+                <w:rFonts w:ascii="Aptos" w:eastAsia="Times New Roman" w:hAnsi="Aptos" w:cs="Calibri"/>
+                <w:b/>
+                <w:bCs/>
+                <w:color w:val="000000"/>
+                <w:kern w:val="0"/>
+                <w:sz w:val="20"/>
+                <w:szCs w:val="20"/>
+                <w:lang w:eastAsia="pt-BR"/>
+                <w14:ligatures w14:val="none"/>
+              </w:rPr>
+              <w:t xml:space="preserve"> </w:t>
+            </w:r>
+            <w:r>
+              <w:rPr>
+                <w:rFonts w:ascii="Aptos" w:eastAsia="Times New Roman" w:hAnsi="Aptos" w:cs="Calibri"/>
+                <w:color w:val="000000"/>
+                <w:kern w:val="0"/>
+                <w:sz w:val="20"/>
+                <w:szCs w:val="20"/>
+                <w:lang w:eastAsia="pt-BR"/>
+                <w14:ligatures w14:val="none"/>
+              </w:rPr>
+              <w:t>do</w:t>
+            </w:r>
+            <w:r>
+              <w:rPr>
+                <w:rFonts w:ascii="Aptos" w:eastAsia="Times New Roman" w:hAnsi="Aptos" w:cs="Calibri"/>
+                <w:color w:val="000000"/>
+                <w:kern w:val="0"/>
+                <w:sz w:val="20"/>
+                <w:szCs w:val="20"/>
+                <w:lang w:eastAsia="pt-BR"/>
+                <w14:ligatures w14:val="none"/>
+              </w:rPr>
+              <w:t xml:space="preserve"> </w:t>
+            </w:r>
+            <w:r>
+              <w:rPr>
+                <w:rFonts w:ascii="Aptos" w:eastAsia="Times New Roman" w:hAnsi="Aptos" w:cs="Calibri"/>
+                <w:color w:val="000000"/>
+                <w:kern w:val="0"/>
+                <w:sz w:val="20"/>
+                <w:szCs w:val="20"/>
+                <w:lang w:eastAsia="pt-BR"/>
+                <w14:ligatures w14:val="none"/>
+              </w:rPr>
+              <w:t>Dataset: descrição das</w:t>
+            </w:r>
+            <w:r>
+              <w:rPr>
+                <w:rFonts w:ascii="Aptos" w:eastAsia="Times New Roman" w:hAnsi="Aptos" w:cs="Calibri"/>
+                <w:color w:val="000000"/>
+                <w:kern w:val="0"/>
+                <w:sz w:val="20"/>
+                <w:szCs w:val="20"/>
+                <w:lang w:eastAsia="pt-BR"/>
+                <w14:ligatures w14:val="none"/>
+              </w:rPr>
+              <w:t xml:space="preserve"> </w:t>
+            </w:r>
+            <w:r>
+              <w:rPr>
+                <w:rFonts w:ascii="Aptos" w:eastAsia="Times New Roman" w:hAnsi="Aptos" w:cs="Calibri"/>
+                <w:b/>
+                <w:bCs/>
+                <w:color w:val="000000"/>
+                <w:kern w:val="0"/>
+                <w:sz w:val="20"/>
+                <w:szCs w:val="20"/>
+                <w:lang w:eastAsia="pt-BR"/>
+                <w14:ligatures w14:val="none"/>
+              </w:rPr>
+              <w:t>features</w:t>
+            </w:r>
+            <w:r>
+              <w:rPr>
+                <w:rFonts w:ascii="Aptos" w:eastAsia="Times New Roman" w:hAnsi="Aptos" w:cs="Calibri"/>
+                <w:color w:val="000000"/>
+                <w:kern w:val="0"/>
+                <w:sz w:val="20"/>
+                <w:szCs w:val="20"/>
+                <w:lang w:eastAsia="pt-BR"/>
+                <w14:ligatures w14:val="none"/>
+              </w:rPr>
+              <w:t xml:space="preserve">. </w:t>
+            </w:r>
+            <w:r>
+              <w:rPr>
+                <w:rFonts w:ascii="Aptos" w:eastAsia="Times New Roman" w:hAnsi="Aptos" w:cs="Calibri"/>
+                <w:color w:val="000000"/>
+                <w:kern w:val="0"/>
+                <w:sz w:val="20"/>
+                <w:szCs w:val="20"/>
+                <w:lang w:val="en-US" w:eastAsia="pt-BR"/>
+                <w14:ligatures w14:val="none"/>
+              </w:rPr>
+              <w:t>D</w:t>
+            </w:r>
+            <w:r>
+              <w:rPr>
+                <w:rFonts w:ascii="Aptos" w:eastAsia="Times New Roman" w:hAnsi="Aptos" w:cs="Calibri"/>
+                <w:color w:val="000000"/>
+                <w:kern w:val="0"/>
+                <w:sz w:val="20"/>
+                <w:szCs w:val="20"/>
+                <w:lang w:val="en-US" w:eastAsia="pt-BR"/>
+                <w14:ligatures w14:val="none"/>
+              </w:rPr>
+              <w:t>efine</w:t>
+            </w:r>
+            <w:r>
+              <w:rPr>
+                <w:rFonts w:ascii="Aptos" w:eastAsia="Times New Roman" w:hAnsi="Aptos" w:cs="Calibri"/>
+                <w:color w:val="000000"/>
+                <w:kern w:val="0"/>
+                <w:sz w:val="20"/>
+                <w:szCs w:val="20"/>
+                <w:lang w:val="en-US" w:eastAsia="pt-BR"/>
+                <w14:ligatures w14:val="none"/>
+              </w:rPr>
+              <w:t xml:space="preserve"> </w:t>
+            </w:r>
+            <w:r>
+              <w:rPr>
+                <w:rFonts w:ascii="Aptos" w:eastAsia="Times New Roman" w:hAnsi="Aptos" w:cs="Calibri"/>
+                <w:i/>
+                <w:iCs/>
+                <w:color w:val="000000"/>
+                <w:kern w:val="0"/>
+                <w:sz w:val="20"/>
+                <w:szCs w:val="20"/>
+                <w:lang w:val="en-US" w:eastAsia="pt-BR"/>
+                <w14:ligatures w14:val="none"/>
+              </w:rPr>
+              <w:t>question</w:t>
+            </w:r>
+            <w:r>
+              <w:rPr>
+                <w:rFonts w:ascii="Aptos" w:eastAsia="Times New Roman" w:hAnsi="Aptos" w:cs="Calibri"/>
+                <w:color w:val="000000"/>
+                <w:kern w:val="0"/>
+                <w:sz w:val="20"/>
+                <w:szCs w:val="20"/>
+                <w:lang w:val="en-US" w:eastAsia="pt-BR"/>
+                <w14:ligatures w14:val="none"/>
+              </w:rPr>
+              <w:t xml:space="preserve"> </w:t>
+            </w:r>
+            <w:r>
+              <w:rPr>
+                <w:rFonts w:ascii="Aptos" w:eastAsia="Times New Roman" w:hAnsi="Aptos" w:cs="Calibri"/>
+                <w:color w:val="000000"/>
+                <w:kern w:val="0"/>
+                <w:sz w:val="20"/>
+                <w:szCs w:val="20"/>
+                <w:lang w:val="en-US" w:eastAsia="pt-BR"/>
+                <w14:ligatures w14:val="none"/>
+              </w:rPr>
+              <w:t>e</w:t>
+            </w:r>
+            <w:r>
+              <w:rPr>
+                <w:rFonts w:ascii="Aptos" w:eastAsia="Times New Roman" w:hAnsi="Aptos" w:cs="Calibri"/>
+                <w:color w:val="000000"/>
+                <w:kern w:val="0"/>
+                <w:sz w:val="20"/>
+                <w:szCs w:val="20"/>
+                <w:lang w:val="en-US" w:eastAsia="pt-BR"/>
+                <w14:ligatures w14:val="none"/>
+              </w:rPr>
+              <w:t xml:space="preserve"> </w:t>
+            </w:r>
+            <w:r>
+              <w:rPr>
+                <w:rFonts w:ascii="Aptos" w:eastAsia="Times New Roman" w:hAnsi="Aptos" w:cs="Calibri"/>
+                <w:i/>
+                <w:iCs/>
+                <w:color w:val="000000"/>
+                <w:kern w:val="0"/>
+                <w:sz w:val="20"/>
+                <w:szCs w:val="20"/>
+                <w:lang w:val="en-US" w:eastAsia="pt-BR"/>
+                <w14:ligatures w14:val="none"/>
+              </w:rPr>
+              <w:t>answer</w:t>
+            </w:r>
+            <w:r>
+              <w:rPr>
+                <w:rFonts w:ascii="Aptos" w:eastAsia="Times New Roman" w:hAnsi="Aptos" w:cs="Calibri"/>
+                <w:color w:val="000000"/>
+                <w:kern w:val="0"/>
+                <w:sz w:val="20"/>
+                <w:szCs w:val="20"/>
+                <w:lang w:val="en-US" w:eastAsia="pt-BR"/>
+                <w14:ligatures w14:val="none"/>
+              </w:rPr>
+              <w:t xml:space="preserve"> </w:t>
+            </w:r>
+            <w:r>
+              <w:rPr>
+                <w:rFonts w:ascii="Aptos" w:eastAsia="Times New Roman" w:hAnsi="Aptos" w:cs="Calibri"/>
+                <w:color w:val="000000"/>
+                <w:kern w:val="0"/>
+                <w:sz w:val="20"/>
+                <w:szCs w:val="20"/>
+                <w:lang w:val="en-US" w:eastAsia="pt-BR"/>
+                <w14:ligatures w14:val="none"/>
+              </w:rPr>
+              <w:t xml:space="preserve">como strings (dtype: string). </w:t>
+            </w:r>
+            <w:r>
+              <w:rPr>
+                <w:rFonts w:ascii="Aptos" w:eastAsia="Times New Roman" w:hAnsi="Aptos" w:cs="Calibri"/>
+                <w:color w:val="000000"/>
+                <w:kern w:val="0"/>
+                <w:sz w:val="20"/>
+                <w:szCs w:val="20"/>
+                <w:lang w:eastAsia="pt-BR"/>
+                <w14:ligatures w14:val="none"/>
+              </w:rPr>
+              <w:t>Ajuda ferramentas e</w:t>
+            </w:r>
+            <w:r>
+              <w:rPr>
+                <w:rFonts w:ascii="Aptos" w:eastAsia="Times New Roman" w:hAnsi="Aptos" w:cs="Calibri"/>
+                <w:color w:val="000000"/>
+                <w:kern w:val="0"/>
+                <w:sz w:val="20"/>
+                <w:szCs w:val="20"/>
+                <w:lang w:eastAsia="pt-BR"/>
+                <w14:ligatures w14:val="none"/>
+              </w:rPr>
+              <w:t xml:space="preserve"> </w:t>
+            </w:r>
+            <w:r>
+              <w:rPr>
+                <w:rFonts w:ascii="Aptos" w:eastAsia="Times New Roman" w:hAnsi="Aptos" w:cs="Calibri"/>
+                <w:i/>
+                <w:iCs/>
+                <w:color w:val="000000"/>
+                <w:kern w:val="0"/>
+                <w:sz w:val="20"/>
+                <w:szCs w:val="20"/>
+                <w:lang w:eastAsia="pt-BR"/>
+                <w14:ligatures w14:val="none"/>
+              </w:rPr>
+              <w:t>load_from_disk()</w:t>
+            </w:r>
+            <w:r>
+              <w:rPr>
+                <w:rFonts w:ascii="Aptos" w:eastAsia="Times New Roman" w:hAnsi="Aptos" w:cs="Calibri"/>
+                <w:color w:val="000000"/>
+                <w:kern w:val="0"/>
+                <w:sz w:val="20"/>
+                <w:szCs w:val="20"/>
+                <w:lang w:eastAsia="pt-BR"/>
+                <w14:ligatures w14:val="none"/>
+              </w:rPr>
+              <w:t xml:space="preserve"> </w:t>
+            </w:r>
+            <w:r>
+              <w:rPr>
+                <w:rFonts w:ascii="Aptos" w:eastAsia="Times New Roman" w:hAnsi="Aptos" w:cs="Calibri"/>
+                <w:color w:val="000000"/>
+                <w:kern w:val="0"/>
+                <w:sz w:val="20"/>
+                <w:szCs w:val="20"/>
+                <w:lang w:eastAsia="pt-BR"/>
+                <w14:ligatures w14:val="none"/>
+              </w:rPr>
+              <w:t>a saber formato e colunas esperadas.</w:t>
+            </w:r>
+          </w:p>
+        </w:tc>
+      </w:tr>
+      <w:tr>
+        <w:trPr>
+          <w:trHeight w:val="1116"/>
+        </w:trPr>
+        <w:tc>
+          <w:tcPr>
+            <w:tcW w:w="2980" w:type="dxa"/>
+            <w:tcBorders>
+              <w:top w:val="nil"/>
+              <w:left w:val="single" w:sz="12" w:space="0" w:color="auto"/>
+              <w:bottom w:val="single" w:sz="12" w:space="0" w:color="auto"/>
+              <w:right w:val="single" w:sz="8" w:space="0" w:color="auto"/>
+            </w:tcBorders>
+            <w:vAlign w:val="center"/>
+            <w:hideMark/>
+          </w:tcPr>
+          <w:p>
+            <w:pPr>
+              <w:spacing w:after="0" w:line="240" w:lineRule="auto"/>
+              <w:rPr>
+                <w:rFonts w:ascii="Aptos" w:eastAsia="Times New Roman" w:hAnsi="Aptos" w:cs="Calibri"/>
+                <w:b/>
+                <w:bCs/>
+                <w:color w:val="000000"/>
+                <w:kern w:val="0"/>
+                <w:sz w:val="20"/>
+                <w:szCs w:val="20"/>
+                <w:lang w:eastAsia="pt-BR"/>
+                <w14:ligatures w14:val="none"/>
+              </w:rPr>
+            </w:pPr>
+            <w:r>
+              <w:rPr>
+                <w:rFonts w:ascii="Aptos" w:eastAsia="Times New Roman" w:hAnsi="Aptos" w:cs="Calibri"/>
+                <w:b/>
+                <w:bCs/>
+                <w:color w:val="000000"/>
+                <w:kern w:val="0"/>
+                <w:sz w:val="20"/>
+                <w:szCs w:val="20"/>
+                <w:lang w:eastAsia="pt-BR"/>
+                <w14:ligatures w14:val="none"/>
+              </w:rPr>
+              <w:t>state.json</w:t>
+            </w:r>
+          </w:p>
+        </w:tc>
+        <w:tc>
+          <w:tcPr>
+            <w:tcW w:w="5380" w:type="dxa"/>
+            <w:tcBorders>
+              <w:top w:val="nil"/>
+              <w:left w:val="nil"/>
+              <w:bottom w:val="single" w:sz="12" w:space="0" w:color="auto"/>
+              <w:right w:val="single" w:sz="12" w:space="0" w:color="auto"/>
+            </w:tcBorders>
+            <w:vAlign w:val="center"/>
+            <w:hideMark/>
+          </w:tcPr>
+          <w:p>
+            <w:pPr>
+              <w:spacing w:after="0" w:line="240" w:lineRule="auto"/>
+              <w:rPr>
+                <w:rFonts w:ascii="Aptos" w:eastAsia="Times New Roman" w:hAnsi="Aptos" w:cs="Calibri"/>
+                <w:color w:val="000000"/>
+                <w:kern w:val="0"/>
+                <w:sz w:val="20"/>
+                <w:szCs w:val="20"/>
+                <w:lang w:eastAsia="pt-BR"/>
+                <w14:ligatures w14:val="none"/>
+              </w:rPr>
+            </w:pPr>
+            <w:r>
+              <w:rPr>
+                <w:rFonts w:ascii="Aptos" w:eastAsia="Times New Roman" w:hAnsi="Aptos" w:cs="Calibri"/>
+                <w:color w:val="000000"/>
+                <w:kern w:val="0"/>
+                <w:sz w:val="20"/>
+                <w:szCs w:val="20"/>
+                <w:lang w:eastAsia="pt-BR"/>
+                <w14:ligatures w14:val="none"/>
+              </w:rPr>
+              <w:t>Estado</w:t>
+            </w:r>
+            <w:r>
+              <w:rPr>
+                <w:rFonts w:ascii="Aptos" w:eastAsia="Times New Roman" w:hAnsi="Aptos" w:cs="Calibri"/>
+                <w:color w:val="000000"/>
+                <w:kern w:val="0"/>
+                <w:sz w:val="20"/>
+                <w:szCs w:val="20"/>
+                <w:lang w:eastAsia="pt-BR"/>
+                <w14:ligatures w14:val="none"/>
+              </w:rPr>
+              <w:t xml:space="preserve"> </w:t>
+            </w:r>
+            <w:r>
+              <w:rPr>
+                <w:rFonts w:ascii="Aptos" w:eastAsia="Times New Roman" w:hAnsi="Aptos" w:cs="Calibri"/>
+                <w:b/>
+                <w:bCs/>
+                <w:color w:val="000000"/>
+                <w:kern w:val="0"/>
+                <w:sz w:val="20"/>
+                <w:szCs w:val="20"/>
+                <w:lang w:eastAsia="pt-BR"/>
+                <w14:ligatures w14:val="none"/>
+              </w:rPr>
+              <w:t>interno</w:t>
+            </w:r>
+            <w:r>
+              <w:rPr>
+                <w:rFonts w:ascii="Aptos" w:eastAsia="Times New Roman" w:hAnsi="Aptos" w:cs="Calibri"/>
+                <w:b/>
+                <w:bCs/>
+                <w:color w:val="000000"/>
+                <w:kern w:val="0"/>
+                <w:sz w:val="20"/>
+                <w:szCs w:val="20"/>
+                <w:lang w:eastAsia="pt-BR"/>
+                <w14:ligatures w14:val="none"/>
+              </w:rPr>
+              <w:t xml:space="preserve"> </w:t>
+            </w:r>
+            <w:r>
+              <w:rPr>
+                <w:rFonts w:ascii="Aptos" w:eastAsia="Times New Roman" w:hAnsi="Aptos" w:cs="Calibri"/>
+                <w:color w:val="000000"/>
+                <w:kern w:val="0"/>
+                <w:sz w:val="20"/>
+                <w:szCs w:val="20"/>
+                <w:lang w:eastAsia="pt-BR"/>
+                <w14:ligatures w14:val="none"/>
+              </w:rPr>
+              <w:t>do</w:t>
+            </w:r>
+            <w:r>
+              <w:rPr>
+                <w:rFonts w:ascii="Aptos" w:eastAsia="Times New Roman" w:hAnsi="Aptos" w:cs="Calibri"/>
+                <w:color w:val="000000"/>
+                <w:kern w:val="0"/>
+                <w:sz w:val="20"/>
+                <w:szCs w:val="20"/>
+                <w:lang w:eastAsia="pt-BR"/>
+                <w14:ligatures w14:val="none"/>
+              </w:rPr>
+              <w:t xml:space="preserve"> </w:t>
+            </w:r>
+            <w:r>
+              <w:rPr>
+                <w:rFonts w:ascii="Aptos" w:eastAsia="Times New Roman" w:hAnsi="Aptos" w:cs="Calibri"/>
+                <w:color w:val="000000"/>
+                <w:kern w:val="0"/>
+                <w:sz w:val="20"/>
+                <w:szCs w:val="20"/>
+                <w:lang w:eastAsia="pt-BR"/>
+                <w14:ligatures w14:val="none"/>
+              </w:rPr>
+              <w:t>datasets: lista dos arquivos de dados (_data_files, apontando para o</w:t>
+            </w:r>
+            <w:r>
+              <w:rPr>
+                <w:rFonts w:ascii="Aptos" w:eastAsia="Times New Roman" w:hAnsi="Aptos" w:cs="Calibri"/>
+                <w:color w:val="000000"/>
+                <w:kern w:val="0"/>
+                <w:sz w:val="20"/>
+                <w:szCs w:val="20"/>
+                <w:lang w:eastAsia="pt-BR"/>
+                <w14:ligatures w14:val="none"/>
+              </w:rPr>
+              <w:t xml:space="preserve"> </w:t>
+            </w:r>
+            <w:r>
+              <w:rPr>
+                <w:rFonts w:ascii="Aptos" w:eastAsia="Times New Roman" w:hAnsi="Aptos" w:cs="Calibri"/>
+                <w:color w:val="000000"/>
+                <w:kern w:val="0"/>
+                <w:sz w:val="20"/>
+                <w:szCs w:val="20"/>
+                <w:lang w:eastAsia="pt-BR"/>
+                <w14:ligatures w14:val="none"/>
+              </w:rPr>
+              <w:t>.arrow),</w:t>
+            </w:r>
+            <w:r>
+              <w:rPr>
+                <w:rFonts w:ascii="Aptos" w:eastAsia="Times New Roman" w:hAnsi="Aptos" w:cs="Calibri"/>
+                <w:color w:val="000000"/>
+                <w:kern w:val="0"/>
+                <w:sz w:val="20"/>
+                <w:szCs w:val="20"/>
+                <w:lang w:eastAsia="pt-BR"/>
+                <w14:ligatures w14:val="none"/>
+              </w:rPr>
+              <w:t xml:space="preserve"> </w:t>
+            </w:r>
+            <w:r>
+              <w:rPr>
+                <w:rFonts w:ascii="Aptos" w:eastAsia="Times New Roman" w:hAnsi="Aptos" w:cs="Calibri"/>
+                <w:b/>
+                <w:bCs/>
+                <w:color w:val="000000"/>
+                <w:kern w:val="0"/>
+                <w:sz w:val="20"/>
+                <w:szCs w:val="20"/>
+                <w:lang w:eastAsia="pt-BR"/>
+                <w14:ligatures w14:val="none"/>
+              </w:rPr>
+              <w:t>fingerprint</w:t>
+            </w:r>
+            <w:r>
+              <w:rPr>
+                <w:rFonts w:ascii="Aptos" w:eastAsia="Times New Roman" w:hAnsi="Aptos" w:cs="Calibri"/>
+                <w:b/>
+                <w:bCs/>
+                <w:color w:val="000000"/>
+                <w:kern w:val="0"/>
+                <w:sz w:val="20"/>
+                <w:szCs w:val="20"/>
+                <w:lang w:eastAsia="pt-BR"/>
+                <w14:ligatures w14:val="none"/>
+              </w:rPr>
+              <w:t xml:space="preserve"> </w:t>
+            </w:r>
+            <w:r>
+              <w:rPr>
+                <w:rFonts w:ascii="Aptos" w:eastAsia="Times New Roman" w:hAnsi="Aptos" w:cs="Calibri"/>
+                <w:color w:val="000000"/>
+                <w:kern w:val="0"/>
+                <w:sz w:val="20"/>
+                <w:szCs w:val="20"/>
+                <w:lang w:eastAsia="pt-BR"/>
+                <w14:ligatures w14:val="none"/>
+              </w:rPr>
+              <w:t>do split, flags de formato. Serve para</w:t>
+            </w:r>
+            <w:r>
+              <w:rPr>
+                <w:rFonts w:ascii="Aptos" w:eastAsia="Times New Roman" w:hAnsi="Aptos" w:cs="Calibri"/>
+                <w:color w:val="000000"/>
+                <w:kern w:val="0"/>
+                <w:sz w:val="20"/>
+                <w:szCs w:val="20"/>
+                <w:lang w:eastAsia="pt-BR"/>
+                <w14:ligatures w14:val="none"/>
+              </w:rPr>
+              <w:t xml:space="preserve"> </w:t>
+            </w:r>
+            <w:r>
+              <w:rPr>
+                <w:rFonts w:ascii="Aptos" w:eastAsia="Times New Roman" w:hAnsi="Aptos" w:cs="Calibri"/>
+                <w:b/>
+                <w:bCs/>
+                <w:color w:val="000000"/>
+                <w:kern w:val="0"/>
+                <w:sz w:val="20"/>
+                <w:szCs w:val="20"/>
+                <w:lang w:eastAsia="pt-BR"/>
+                <w14:ligatures w14:val="none"/>
+              </w:rPr>
+              <w:t>reconstruir o mesmo objeto</w:t>
+            </w:r>
+            <w:r>
+              <w:rPr>
+                <w:rFonts w:ascii="Aptos" w:eastAsia="Times New Roman" w:hAnsi="Aptos" w:cs="Calibri"/>
+                <w:b/>
+                <w:bCs/>
+                <w:color w:val="000000"/>
+                <w:kern w:val="0"/>
+                <w:sz w:val="20"/>
+                <w:szCs w:val="20"/>
+                <w:lang w:eastAsia="pt-BR"/>
+                <w14:ligatures w14:val="none"/>
+              </w:rPr>
+              <w:t xml:space="preserve"> </w:t>
+            </w:r>
+            <w:r>
+              <w:rPr>
+                <w:rFonts w:ascii="Aptos" w:eastAsia="Times New Roman" w:hAnsi="Aptos" w:cs="Calibri"/>
+                <w:color w:val="000000"/>
+                <w:kern w:val="0"/>
+                <w:sz w:val="20"/>
+                <w:szCs w:val="20"/>
+                <w:lang w:eastAsia="pt-BR"/>
+                <w14:ligatures w14:val="none"/>
+              </w:rPr>
+              <w:t>ao carregar do disco (load_from_disk).</w:t>
+            </w:r>
+          </w:p>
+        </w:tc>
+      </w:tr>
+    </w:tbl>
+    <w:p/>
+    <w:p/>
     <w:p/>
     <w:p>
       <w:r>
@@ -3187,15 +5819,7 @@
       </w:pPr>
       <w:bookmarkStart w:id="10" w:name="_Toc227556094"/>
       <w:r>
-        <w:t>Fine-</w:t>
-      </w:r>
-      <w:proofErr w:type="spellStart"/>
-      <w:r>
-        <w:t>tuning</w:t>
-      </w:r>
-      <w:proofErr w:type="spellEnd"/>
-      <w:r>
-        <w:t xml:space="preserve"> de LLM com dados médicos internos</w:t>
+        <w:t>Fine-tuning de LLM com dados médicos internos</w:t>
       </w:r>
       <w:bookmarkEnd w:id="10"/>
     </w:p>
@@ -3204,23 +5828,7 @@
         <w:spacing w:after="210"/>
       </w:pPr>
       <w:r>
-        <w:t>Realizar o fine-</w:t>
-      </w:r>
-      <w:proofErr w:type="spellStart"/>
-      <w:r>
-        <w:t>tuning</w:t>
-      </w:r>
-      <w:proofErr w:type="spellEnd"/>
-      <w:r>
-        <w:t xml:space="preserve"> de um modelo LLM (como </w:t>
-      </w:r>
-      <w:proofErr w:type="spellStart"/>
-      <w:r>
-        <w:t>LLaMA</w:t>
-      </w:r>
-      <w:proofErr w:type="spellEnd"/>
-      <w:r>
-        <w:t xml:space="preserve">, Falcon ou um outro) utilizando: </w:t>
+        <w:t xml:space="preserve">Realizar o fine-tuning de um modelo LLM (como LLaMA, Falcon ou um outro) utilizando: </w:t>
       </w:r>
     </w:p>
     <w:p>
@@ -3279,21 +5887,13 @@
         <w:spacing w:after="210"/>
       </w:pPr>
       <w:r>
-        <w:t xml:space="preserve">Preparar os dados com técnicas de </w:t>
-      </w:r>
-      <w:proofErr w:type="spellStart"/>
-      <w:r>
-        <w:t>pre</w:t>
+        <w:t>Preparar os dados com técnicas de pre</w:t>
       </w:r>
       <w:r>
         <w:t>-</w:t>
       </w:r>
       <w:r>
-        <w:t>processing</w:t>
-      </w:r>
-      <w:proofErr w:type="spellEnd"/>
-      <w:r>
-        <w:t xml:space="preserve">, anonimização e curadoria. </w:t>
+        <w:t xml:space="preserve">processing, anonimização e curadoria. </w:t>
       </w:r>
     </w:p>
     <w:p>
@@ -3375,23 +5975,10 @@
         <w:t xml:space="preserve"> uma LLM </w:t>
       </w:r>
       <w:r>
-        <w:t>open-</w:t>
-      </w:r>
-      <w:proofErr w:type="spellStart"/>
-      <w:r>
-        <w:t>source</w:t>
-      </w:r>
-      <w:proofErr w:type="spellEnd"/>
-      <w:r>
-        <w:t xml:space="preserve"> </w:t>
-      </w:r>
-      <w:proofErr w:type="spellStart"/>
-      <w:r>
-        <w:t>pre</w:t>
-      </w:r>
-      <w:proofErr w:type="spellEnd"/>
-      <w:r>
-        <w:t xml:space="preserve">-treinada, de 7 – 11 </w:t>
+        <w:t xml:space="preserve">open-source </w:t>
+      </w:r>
+      <w:r>
+        <w:t xml:space="preserve">pre-treinada, de 7 – 11 </w:t>
       </w:r>
       <w:r>
         <w:t>bilhões</w:t>
@@ -3425,61 +6012,45 @@
           <w:lang w:val="en-US"/>
         </w:rPr>
       </w:pPr>
-      <w:proofErr w:type="spellStart"/>
       <w:r>
         <w:rPr>
           <w:lang w:val="en-US"/>
         </w:rPr>
-        <w:t>Realizar</w:t>
-      </w:r>
-      <w:proofErr w:type="spellEnd"/>
+        <w:t>Realizar o pre</w:t>
+      </w:r>
       <w:r>
         <w:rPr>
           <w:lang w:val="en-US"/>
         </w:rPr>
-        <w:t xml:space="preserve"> o pre</w:t>
+        <w:t>-</w:t>
       </w:r>
       <w:r>
         <w:rPr>
           <w:lang w:val="en-US"/>
         </w:rPr>
-        <w:t>-</w:t>
+        <w:t xml:space="preserve">training </w:t>
+      </w:r>
+      <w:r>
+        <w:sym w:font="Wingdings" w:char="F0E0"/>
       </w:r>
       <w:r>
         <w:rPr>
           <w:lang w:val="en-US"/>
         </w:rPr>
-        <w:t xml:space="preserve">training </w:t>
-      </w:r>
-      <w:r>
-        <w:sym w:font="Wingdings" w:char="F0E0"/>
+        <w:t xml:space="preserve"> </w:t>
       </w:r>
       <w:r>
         <w:rPr>
           <w:lang w:val="en-US"/>
         </w:rPr>
-        <w:t xml:space="preserve"> </w:t>
+        <w:t xml:space="preserve">1 </w:t>
       </w:r>
       <w:r>
         <w:rPr>
           <w:lang w:val="en-US"/>
         </w:rPr>
-        <w:t xml:space="preserve">1 </w:t>
-      </w:r>
-      <w:r>
-        <w:rPr>
-          <w:lang w:val="en-US"/>
-        </w:rPr>
-        <w:t xml:space="preserve">fine </w:t>
-      </w:r>
-      <w:proofErr w:type="gramStart"/>
-      <w:r>
-        <w:rPr>
-          <w:lang w:val="en-US"/>
-        </w:rPr>
-        <w:t>tunning</w:t>
-      </w:r>
-      <w:proofErr w:type="gramEnd"/>
+        <w:t>fine tunning</w:t>
+      </w:r>
     </w:p>
     <w:p>
       <w:pPr>
@@ -3494,13 +6065,8 @@
         <w:lastRenderedPageBreak/>
         <w:t xml:space="preserve">Usar o </w:t>
       </w:r>
-      <w:proofErr w:type="spellStart"/>
-      <w:r>
-        <w:t>Unsloth</w:t>
-      </w:r>
-      <w:proofErr w:type="spellEnd"/>
-      <w:r>
-        <w:t xml:space="preserve"> Studio</w:t>
+      <w:r>
+        <w:t>Unsloth Studio</w:t>
       </w:r>
     </w:p>
     <w:p>
@@ -3516,23 +6082,7 @@
         <w:t>I</w:t>
       </w:r>
       <w:r>
-        <w:t xml:space="preserve">nterface web para treinar e executar modelos abertos como Gemma 4, Qwen3.5, </w:t>
-      </w:r>
-      <w:proofErr w:type="spellStart"/>
-      <w:r>
-        <w:t>DeepSeek</w:t>
-      </w:r>
-      <w:proofErr w:type="spellEnd"/>
-      <w:r>
-        <w:t xml:space="preserve"> e </w:t>
-      </w:r>
-      <w:proofErr w:type="spellStart"/>
-      <w:r>
-        <w:t>gpt-oss</w:t>
-      </w:r>
-      <w:proofErr w:type="spellEnd"/>
-      <w:r>
-        <w:t xml:space="preserve"> localmente.</w:t>
+        <w:t>nterface web para treinar e executar modelos abertos como Gemma 4, Qwen3.5, DeepSeek e gpt-oss localmente.</w:t>
       </w:r>
     </w:p>
     <w:p>
@@ -3545,23 +6095,7 @@
         <w:spacing w:after="210"/>
       </w:pPr>
       <w:r>
-        <w:t xml:space="preserve">Apresenta modelos - </w:t>
-      </w:r>
-      <w:proofErr w:type="spellStart"/>
-      <w:r>
-        <w:t>pre</w:t>
-      </w:r>
-      <w:proofErr w:type="spellEnd"/>
-      <w:r>
-        <w:t>-treinados open-</w:t>
-      </w:r>
-      <w:proofErr w:type="spellStart"/>
-      <w:r>
-        <w:t>source</w:t>
-      </w:r>
-      <w:proofErr w:type="spellEnd"/>
-      <w:r>
-        <w:t xml:space="preserve"> para uso</w:t>
+        <w:t>Apresenta modelos - pre-treinados open-source para uso</w:t>
       </w:r>
     </w:p>
     <w:p>
@@ -3592,11 +6126,9 @@
         </w:numPr>
         <w:spacing w:after="210"/>
       </w:pPr>
-      <w:proofErr w:type="spellStart"/>
       <w:r>
         <w:t>Roblox</w:t>
       </w:r>
-      <w:proofErr w:type="spellEnd"/>
     </w:p>
     <w:p>
       <w:pPr>
@@ -3641,17 +6173,8 @@
           <w:b/>
           <w:bCs/>
         </w:rPr>
-        <w:t xml:space="preserve">Training </w:t>
-      </w:r>
-      <w:proofErr w:type="spellStart"/>
-      <w:r>
-        <w:rPr>
-          <w:b/>
-          <w:bCs/>
-        </w:rPr>
-        <w:t>Loss</w:t>
-      </w:r>
-      <w:proofErr w:type="spellEnd"/>
+        <w:t>Training Loss</w:t>
+      </w:r>
     </w:p>
     <w:p>
       <w:pPr>
@@ -3663,15 +6186,7 @@
         <w:spacing w:after="210"/>
       </w:pPr>
       <w:r>
-        <w:t>Durante o Fine-</w:t>
-      </w:r>
-      <w:proofErr w:type="spellStart"/>
-      <w:r>
-        <w:t>tunning</w:t>
-      </w:r>
-      <w:proofErr w:type="spellEnd"/>
-      <w:r>
-        <w:t>, s</w:t>
+        <w:t>Durante o Fine-tunning, s</w:t>
       </w:r>
       <w:r>
         <w:t xml:space="preserve">alvar versões intermediarias </w:t>
@@ -3732,13 +6247,8 @@
         <w:spacing w:after="210"/>
       </w:pPr>
       <w:r>
-        <w:t xml:space="preserve">Google </w:t>
-      </w:r>
-      <w:proofErr w:type="spellStart"/>
-      <w:r>
-        <w:t>Collab</w:t>
-      </w:r>
-      <w:proofErr w:type="spellEnd"/>
+        <w:t>Google Collab</w:t>
+      </w:r>
     </w:p>
     <w:p>
       <w:pPr>
@@ -3821,14 +6331,9 @@
       </w:pPr>
       <w:bookmarkStart w:id="11" w:name="_Toc227556095"/>
       <w:r>
-        <w:t xml:space="preserve">Criação de assistente médico com </w:t>
-      </w:r>
-      <w:proofErr w:type="spellStart"/>
-      <w:r>
-        <w:t>LangChain</w:t>
+        <w:t>Criação de assistente médico com LangChain</w:t>
       </w:r>
       <w:bookmarkEnd w:id="11"/>
-      <w:proofErr w:type="spellEnd"/>
       <w:r>
         <w:t xml:space="preserve"> </w:t>
       </w:r>
@@ -3840,21 +6345,12 @@
       <w:r>
         <w:t xml:space="preserve">Utilizar o </w:t>
       </w:r>
-      <w:proofErr w:type="spellStart"/>
       <w:r>
         <w:rPr>
           <w:b/>
           <w:bCs/>
         </w:rPr>
-        <w:t>LangChain</w:t>
-      </w:r>
-      <w:proofErr w:type="spellEnd"/>
-      <w:r>
-        <w:rPr>
-          <w:b/>
-          <w:bCs/>
-        </w:rPr>
-        <w:t xml:space="preserve"> </w:t>
+        <w:t xml:space="preserve">LangChain </w:t>
       </w:r>
       <w:r>
         <w:t xml:space="preserve">para: </w:t>
@@ -3944,16 +6440,11 @@
         <w:t xml:space="preserve"> </w:t>
       </w:r>
       <w:r>
-        <w:t xml:space="preserve">com </w:t>
-      </w:r>
-      <w:proofErr w:type="spellStart"/>
-      <w:r>
-        <w:t>LanChai</w:t>
+        <w:t>com LanChai</w:t>
       </w:r>
       <w:r>
         <w:t>n</w:t>
       </w:r>
-      <w:proofErr w:type="spellEnd"/>
     </w:p>
     <w:p>
       <w:pPr>
@@ -3973,11 +6464,9 @@
       <w:r>
         <w:t xml:space="preserve">os agentes com o </w:t>
       </w:r>
-      <w:proofErr w:type="spellStart"/>
       <w:r>
         <w:t>LangGraph</w:t>
       </w:r>
-      <w:proofErr w:type="spellEnd"/>
     </w:p>
     <w:p>
       <w:pPr>
@@ -4023,15 +6512,7 @@
         <w:spacing w:after="210"/>
       </w:pPr>
       <w:r>
-        <w:t xml:space="preserve">Ele vai na base vetorial e recupera os N </w:t>
-      </w:r>
-      <w:proofErr w:type="spellStart"/>
-      <w:r>
-        <w:t>chunks</w:t>
-      </w:r>
-      <w:proofErr w:type="spellEnd"/>
-      <w:r>
-        <w:t xml:space="preserve"> baseado em </w:t>
+        <w:t xml:space="preserve">Ele vai na base vetorial e recupera os N chunks baseado em </w:t>
       </w:r>
       <w:r>
         <w:t>semelhança</w:t>
@@ -4047,15 +6528,7 @@
         <w:spacing w:after="210"/>
       </w:pPr>
       <w:r>
-        <w:t xml:space="preserve">Adiciona os N </w:t>
-      </w:r>
-      <w:proofErr w:type="spellStart"/>
-      <w:r>
-        <w:t>chunks</w:t>
-      </w:r>
-      <w:proofErr w:type="spellEnd"/>
-      <w:r>
-        <w:t xml:space="preserve"> no prompt e passa para o modelo analisar.</w:t>
+        <w:t>Adiciona os N chunks no prompt e passa para o modelo analisar.</w:t>
       </w:r>
     </w:p>
     <w:p>
@@ -4114,15 +6587,7 @@
         <w:spacing w:after="210"/>
       </w:pPr>
       <w:r>
-        <w:t xml:space="preserve">Implementar </w:t>
-      </w:r>
-      <w:proofErr w:type="spellStart"/>
-      <w:r>
-        <w:t>logging</w:t>
-      </w:r>
-      <w:proofErr w:type="spellEnd"/>
-      <w:r>
-        <w:t xml:space="preserve"> detalhado para rastreamento e auditoria; </w:t>
+        <w:t xml:space="preserve">Implementar logging detalhado para rastreamento e auditoria; </w:t>
       </w:r>
     </w:p>
     <w:p>
@@ -4135,15 +6600,7 @@
         <w:spacing w:after="210"/>
       </w:pPr>
       <w:r>
-        <w:t xml:space="preserve">Garantir </w:t>
-      </w:r>
-      <w:proofErr w:type="spellStart"/>
-      <w:r>
-        <w:t>explainability</w:t>
-      </w:r>
-      <w:proofErr w:type="spellEnd"/>
-      <w:r>
-        <w:t xml:space="preserve"> das respostas da LLM (exemplo: indicar a fonte da informação utilizada na resposta). </w:t>
+        <w:t xml:space="preserve">Garantir explainability das respostas da LLM (exemplo: indicar a fonte da informação utilizada na resposta). </w:t>
       </w:r>
     </w:p>
     <w:p>
@@ -4165,13 +6622,8 @@
         </w:numPr>
       </w:pPr>
       <w:bookmarkStart w:id="13" w:name="_Toc227556097"/>
-      <w:proofErr w:type="gramStart"/>
-      <w:r>
-        <w:t>TITULO</w:t>
-      </w:r>
-      <w:proofErr w:type="gramEnd"/>
-      <w:r>
-        <w:t xml:space="preserve"> 2</w:t>
+      <w:r>
+        <w:t>TITULO 2</w:t>
       </w:r>
       <w:bookmarkEnd w:id="13"/>
     </w:p>
@@ -4185,11 +6637,9 @@
       <w:pPr>
         <w:pStyle w:val="CabealhodoSumrio"/>
       </w:pPr>
-      <w:proofErr w:type="spellStart"/>
       <w:r>
         <w:t>cabecalho</w:t>
       </w:r>
-      <w:proofErr w:type="spellEnd"/>
     </w:p>
     <w:p>
       <w:r>
@@ -4206,21 +6656,12 @@
         </w:rPr>
       </w:pPr>
       <w:bookmarkStart w:id="14" w:name="_Toc227556098"/>
-      <w:proofErr w:type="gramStart"/>
       <w:r>
         <w:rPr>
           <w:b/>
           <w:bCs/>
         </w:rPr>
-        <w:t>TITULO</w:t>
-      </w:r>
-      <w:proofErr w:type="gramEnd"/>
-      <w:r>
-        <w:rPr>
-          <w:b/>
-          <w:bCs/>
-        </w:rPr>
-        <w:t xml:space="preserve"> 3</w:t>
+        <w:t>TITULO 3</w:t>
       </w:r>
       <w:bookmarkEnd w:id="14"/>
     </w:p>
@@ -4306,13 +6747,8 @@
         <w:pStyle w:val="Ttulo1"/>
       </w:pPr>
       <w:bookmarkStart w:id="16" w:name="_Toc227556100"/>
-      <w:proofErr w:type="gramStart"/>
-      <w:r>
-        <w:t>TITULO</w:t>
-      </w:r>
-      <w:proofErr w:type="gramEnd"/>
-      <w:r>
-        <w:t xml:space="preserve"> 1</w:t>
+      <w:r>
+        <w:t>TITULO 1</w:t>
       </w:r>
       <w:bookmarkEnd w:id="16"/>
     </w:p>
@@ -4332,13 +6768,8 @@
         </w:numPr>
       </w:pPr>
       <w:bookmarkStart w:id="17" w:name="_Toc227556101"/>
-      <w:proofErr w:type="gramStart"/>
-      <w:r>
-        <w:t>TITULO</w:t>
-      </w:r>
-      <w:proofErr w:type="gramEnd"/>
-      <w:r>
-        <w:t xml:space="preserve"> 2</w:t>
+      <w:r>
+        <w:t>TITULO 2</w:t>
       </w:r>
       <w:bookmarkEnd w:id="17"/>
     </w:p>
@@ -4352,11 +6783,9 @@
       <w:pPr>
         <w:pStyle w:val="CabealhodoSumrio"/>
       </w:pPr>
-      <w:proofErr w:type="spellStart"/>
       <w:r>
         <w:t>cabecalho</w:t>
       </w:r>
-      <w:proofErr w:type="spellEnd"/>
     </w:p>
     <w:p>
       <w:r>
@@ -4373,21 +6802,12 @@
         </w:rPr>
       </w:pPr>
       <w:bookmarkStart w:id="18" w:name="_Toc227556102"/>
-      <w:proofErr w:type="gramStart"/>
       <w:r>
         <w:rPr>
           <w:b/>
           <w:bCs/>
         </w:rPr>
-        <w:t>TITULO</w:t>
-      </w:r>
-      <w:proofErr w:type="gramEnd"/>
-      <w:r>
-        <w:rPr>
-          <w:b/>
-          <w:bCs/>
-        </w:rPr>
-        <w:t xml:space="preserve"> 3</w:t>
+        <w:t>TITULO 3</w:t>
       </w:r>
       <w:bookmarkEnd w:id="18"/>
     </w:p>
@@ -4458,24 +6878,17 @@
         <w:pStyle w:val="Ttulo"/>
         <w:jc w:val="center"/>
       </w:pPr>
-      <w:proofErr w:type="gramStart"/>
       <w:r>
         <w:t>TITULO</w:t>
       </w:r>
-      <w:proofErr w:type="gramEnd"/>
     </w:p>
     <w:p>
       <w:pPr>
         <w:pStyle w:val="Ttulo1"/>
       </w:pPr>
       <w:bookmarkStart w:id="19" w:name="_Toc227556103"/>
-      <w:proofErr w:type="gramStart"/>
-      <w:r>
-        <w:t>TITULO</w:t>
-      </w:r>
-      <w:proofErr w:type="gramEnd"/>
-      <w:r>
-        <w:t xml:space="preserve"> 1</w:t>
+      <w:r>
+        <w:t>TITULO 1</w:t>
       </w:r>
       <w:bookmarkEnd w:id="19"/>
     </w:p>
@@ -4495,13 +6908,8 @@
         </w:numPr>
       </w:pPr>
       <w:bookmarkStart w:id="20" w:name="_Toc227556104"/>
-      <w:proofErr w:type="gramStart"/>
-      <w:r>
-        <w:t>TITULO</w:t>
-      </w:r>
-      <w:proofErr w:type="gramEnd"/>
-      <w:r>
-        <w:t xml:space="preserve"> 2</w:t>
+      <w:r>
+        <w:t>TITULO 2</w:t>
       </w:r>
       <w:bookmarkEnd w:id="20"/>
     </w:p>
@@ -4515,11 +6923,9 @@
       <w:pPr>
         <w:pStyle w:val="CabealhodoSumrio"/>
       </w:pPr>
-      <w:proofErr w:type="spellStart"/>
       <w:r>
         <w:t>cabecalho</w:t>
       </w:r>
-      <w:proofErr w:type="spellEnd"/>
     </w:p>
     <w:p>
       <w:r>
@@ -4536,21 +6942,12 @@
         </w:rPr>
       </w:pPr>
       <w:bookmarkStart w:id="21" w:name="_Toc227556105"/>
-      <w:proofErr w:type="gramStart"/>
       <w:r>
         <w:rPr>
           <w:b/>
           <w:bCs/>
         </w:rPr>
-        <w:t>TITULO</w:t>
-      </w:r>
-      <w:proofErr w:type="gramEnd"/>
-      <w:r>
-        <w:rPr>
-          <w:b/>
-          <w:bCs/>
-        </w:rPr>
-        <w:t xml:space="preserve"> 3</w:t>
+        <w:t>TITULO 3</w:t>
       </w:r>
       <w:bookmarkEnd w:id="21"/>
     </w:p>

</xml_diff>

<commit_message>
Adaptacao do Lanchain aos artefatos do Tunning
</commit_message>
<xml_diff>
--- a/docs/RELATORIO_TechChallenge_FASE3.docx
+++ b/docs/RELATORIO_TechChallenge_FASE3.docx
@@ -2356,10 +2356,10 @@
             <v:path o:extrusionok="f" gradientshapeok="t" o:connecttype="rect"/>
             <o:lock v:ext="edit" aspectratio="t"/>
           </v:shapetype>
-          <v:shape id="_x0000_i1026" type="#_x0000_t75" style="width:79.3pt;height:50.55pt" o:ole="">
+          <v:shape id="_x0000_i1026" type="#_x0000_t75" style="width:79.5pt;height:50.5pt" o:ole="">
             <v:imagedata r:id="rId11" o:title=""/>
           </v:shape>
-          <o:OLEObject Type="Embed" ProgID="Word.Document.12" ShapeID="_x0000_i1026" DrawAspect="Icon" ObjectID="_1840244394" r:id="rId12">
+          <o:OLEObject Type="Embed" ProgID="Word.Document.12" ShapeID="_x0000_i1026" DrawAspect="Icon" ObjectID="_1840286337" r:id="rId12">
             <o:FieldCodes>\s</o:FieldCodes>
           </o:OLEObject>
         </w:object>
@@ -3051,93 +3051,6 @@
           <w:b/>
           <w:bCs/>
         </w:rPr>
-        <w:t>Arquivos gerados:</w:t>
-      </w:r>
-    </w:p>
-    <w:p>
-      <w:pPr>
-        <w:keepNext/>
-      </w:pPr>
-      <w:r>
-        <w:rPr>
-          <w:noProof/>
-        </w:rPr>
-        <w:drawing>
-          <wp:inline distT="0" distB="0" distL="0" distR="0" wp14:anchorId="45B84015" wp14:editId="2E6998C5">
-            <wp:extent cx="5400040" cy="2408555"/>
-            <wp:effectExtent l="0" t="0" r="0" b="0"/>
-            <wp:docPr id="438861972" name="Imagem 1"/>
-            <wp:cNvGraphicFramePr>
-              <a:graphicFrameLocks xmlns:a="http://schemas.openxmlformats.org/drawingml/2006/main" noChangeAspect="1"/>
-            </wp:cNvGraphicFramePr>
-            <a:graphic xmlns:a="http://schemas.openxmlformats.org/drawingml/2006/main">
-              <a:graphicData uri="http://schemas.openxmlformats.org/drawingml/2006/picture">
-                <pic:pic xmlns:pic="http://schemas.openxmlformats.org/drawingml/2006/picture">
-                  <pic:nvPicPr>
-                    <pic:cNvPr id="438861972" name=""/>
-                    <pic:cNvPicPr/>
-                  </pic:nvPicPr>
-                  <pic:blipFill>
-                    <a:blip r:embed="rId15"/>
-                    <a:stretch>
-                      <a:fillRect/>
-                    </a:stretch>
-                  </pic:blipFill>
-                  <pic:spPr>
-                    <a:xfrm>
-                      <a:off x="0" y="0"/>
-                      <a:ext cx="5400040" cy="2408555"/>
-                    </a:xfrm>
-                    <a:prstGeom prst="rect">
-                      <a:avLst/>
-                    </a:prstGeom>
-                  </pic:spPr>
-                </pic:pic>
-              </a:graphicData>
-            </a:graphic>
-          </wp:inline>
-        </w:drawing>
-      </w:r>
-    </w:p>
-    <w:p>
-      <w:pPr>
-        <w:pStyle w:val="Legenda"/>
-      </w:pPr>
-      <w:r>
-        <w:t xml:space="preserve">Figura </w:t>
-      </w:r>
-      <w:r>
-        <w:fldChar w:fldCharType="begin"/>
-      </w:r>
-      <w:r>
-        <w:instrText xml:space="preserve"> SEQ Figura \* ARABIC </w:instrText>
-      </w:r>
-      <w:r>
-        <w:fldChar w:fldCharType="separate"/>
-      </w:r>
-      <w:r>
-        <w:rPr>
-          <w:noProof/>
-        </w:rPr>
-        <w:t>1</w:t>
-      </w:r>
-      <w:r>
-        <w:fldChar w:fldCharType="end"/>
-      </w:r>
-    </w:p>
-    <w:p/>
-    <w:p>
-      <w:pPr>
-        <w:rPr>
-          <w:b/>
-          <w:bCs/>
-        </w:rPr>
-      </w:pPr>
-      <w:r>
-        <w:rPr>
-          <w:b/>
-          <w:bCs/>
-        </w:rPr>
         <w:t>Parâmetros de entrada:</w:t>
       </w:r>
     </w:p>
@@ -4553,7 +4466,6 @@
                 <w:lang w:eastAsia="pt-BR"/>
                 <w14:ligatures w14:val="none"/>
               </w:rPr>
-              <w:lastRenderedPageBreak/>
               <w:t>4</w:t>
             </w:r>
           </w:p>
@@ -5074,6 +4986,7 @@
                 <w:lang w:eastAsia="pt-BR"/>
                 <w14:ligatures w14:val="none"/>
               </w:rPr>
+              <w:lastRenderedPageBreak/>
               <w:t>data-00000-of-00001.arrow</w:t>
             </w:r>
           </w:p>
@@ -5977,96 +5890,6 @@
       </w:r>
       <w:bookmarkEnd w:id="9"/>
     </w:p>
-    <w:p>
-      <w:pPr>
-        <w:rPr>
-          <w:b/>
-          <w:bCs/>
-        </w:rPr>
-      </w:pPr>
-      <w:r>
-        <w:rPr>
-          <w:b/>
-          <w:bCs/>
-        </w:rPr>
-        <w:t>Arquivos gerados:</w:t>
-      </w:r>
-    </w:p>
-    <w:p>
-      <w:pPr>
-        <w:keepNext/>
-        <w:jc w:val="center"/>
-      </w:pPr>
-      <w:r>
-        <w:rPr>
-          <w:noProof/>
-        </w:rPr>
-        <w:lastRenderedPageBreak/>
-        <w:drawing>
-          <wp:inline distT="0" distB="0" distL="0" distR="0" wp14:anchorId="28B09C68" wp14:editId="1A6D03A5">
-            <wp:extent cx="2600688" cy="6601746"/>
-            <wp:effectExtent l="0" t="0" r="9525" b="8890"/>
-            <wp:docPr id="1331113334" name="Imagem 1"/>
-            <wp:cNvGraphicFramePr>
-              <a:graphicFrameLocks xmlns:a="http://schemas.openxmlformats.org/drawingml/2006/main" noChangeAspect="1"/>
-            </wp:cNvGraphicFramePr>
-            <a:graphic xmlns:a="http://schemas.openxmlformats.org/drawingml/2006/main">
-              <a:graphicData uri="http://schemas.openxmlformats.org/drawingml/2006/picture">
-                <pic:pic xmlns:pic="http://schemas.openxmlformats.org/drawingml/2006/picture">
-                  <pic:nvPicPr>
-                    <pic:cNvPr id="1331113334" name=""/>
-                    <pic:cNvPicPr/>
-                  </pic:nvPicPr>
-                  <pic:blipFill>
-                    <a:blip r:embed="rId16"/>
-                    <a:stretch>
-                      <a:fillRect/>
-                    </a:stretch>
-                  </pic:blipFill>
-                  <pic:spPr>
-                    <a:xfrm>
-                      <a:off x="0" y="0"/>
-                      <a:ext cx="2600688" cy="6601746"/>
-                    </a:xfrm>
-                    <a:prstGeom prst="rect">
-                      <a:avLst/>
-                    </a:prstGeom>
-                  </pic:spPr>
-                </pic:pic>
-              </a:graphicData>
-            </a:graphic>
-          </wp:inline>
-        </w:drawing>
-      </w:r>
-    </w:p>
-    <w:p>
-      <w:pPr>
-        <w:pStyle w:val="Legenda"/>
-        <w:jc w:val="center"/>
-      </w:pPr>
-      <w:r>
-        <w:t xml:space="preserve">Figura </w:t>
-      </w:r>
-      <w:r>
-        <w:fldChar w:fldCharType="begin"/>
-      </w:r>
-      <w:r>
-        <w:instrText xml:space="preserve"> SEQ Figura \* ARABIC </w:instrText>
-      </w:r>
-      <w:r>
-        <w:fldChar w:fldCharType="separate"/>
-      </w:r>
-      <w:r>
-        <w:rPr>
-          <w:noProof/>
-        </w:rPr>
-        <w:t>2</w:t>
-      </w:r>
-      <w:r>
-        <w:fldChar w:fldCharType="end"/>
-      </w:r>
-    </w:p>
-    <w:p/>
     <w:p>
       <w:pPr>
         <w:rPr>
@@ -6578,7 +6401,6 @@
                 <w:lang w:eastAsia="pt-BR"/>
                 <w14:ligatures w14:val="none"/>
               </w:rPr>
-              <w:lastRenderedPageBreak/>
               <w:t>--base-model-name</w:t>
             </w:r>
           </w:p>
@@ -10786,6 +10608,7 @@
     </w:p>
     <w:p>
       <w:r>
+        <w:lastRenderedPageBreak/>
         <w:t>Os </w:t>
       </w:r>
       <w:r>
@@ -10877,7 +10700,6 @@
           <w:b/>
           <w:bCs/>
         </w:rPr>
-        <w:lastRenderedPageBreak/>
         <w:t>Configuração do tokenizer.</w:t>
       </w:r>
       <w:r>
@@ -10965,6 +10787,7 @@
           <w:b/>
           <w:bCs/>
         </w:rPr>
+        <w:lastRenderedPageBreak/>
         <w:t>Versão compilada e otimizada do tokenizer</w:t>
       </w:r>
       <w:r>
@@ -11068,7 +10891,6 @@
     </w:p>
     <w:p>
       <w:r>
-        <w:lastRenderedPageBreak/>
         <w:t>Isso permite que o Trainer, o tokenizer e o generate() saibam qual token usar para padding, fim de sequência, etc.</w:t>
       </w:r>
     </w:p>
@@ -11630,6 +11452,7 @@
           </w:tcPr>
           <w:p>
             <w:r>
+              <w:lastRenderedPageBreak/>
               <w:t>merges.txt</w:t>
             </w:r>
           </w:p>
@@ -12001,7 +11824,6 @@
     </w:p>
     <w:p>
       <w:r>
-        <w:lastRenderedPageBreak/>
         <w:t xml:space="preserve">Em </w:t>
       </w:r>
       <w:r>
@@ -12265,6 +12087,7 @@
         <w:rPr>
           <w:lang w:val="en-US"/>
         </w:rPr>
+        <w:lastRenderedPageBreak/>
         <w:t xml:space="preserve">    </w:t>
       </w:r>
       <w:r>
@@ -12582,7 +12405,6 @@
                 <w:b/>
                 <w:bCs/>
               </w:rPr>
-              <w:lastRenderedPageBreak/>
               <w:t>optimizer.pt</w:t>
             </w:r>
           </w:p>
@@ -12798,6 +12620,7 @@
                 <w:b/>
                 <w:bCs/>
               </w:rPr>
+              <w:lastRenderedPageBreak/>
               <w:t>trainer_state.json</w:t>
             </w:r>
           </w:p>
@@ -12942,7 +12765,6 @@
                 <w:b/>
                 <w:bCs/>
               </w:rPr>
-              <w:lastRenderedPageBreak/>
               <w:t>tokenizer_config.json</w:t>
             </w:r>
           </w:p>
@@ -13263,6 +13085,7 @@
     </w:p>
     <w:p>
       <w:r>
+        <w:lastRenderedPageBreak/>
         <w:t>Contém apenas o necessário para carregar e usar o modelo — </w:t>
       </w:r>
       <w:r>
@@ -13472,7 +13295,6 @@
           <w:b/>
           <w:bCs/>
         </w:rPr>
-        <w:lastRenderedPageBreak/>
         <w:t>Arquivos:</w:t>
       </w:r>
     </w:p>
@@ -13816,6 +13638,7 @@
                 <w:b/>
                 <w:bCs/>
               </w:rPr>
+              <w:lastRenderedPageBreak/>
               <w:t>training_args.bin</w:t>
             </w:r>
           </w:p>
@@ -13942,7 +13765,6 @@
           <w:b/>
           <w:bCs/>
         </w:rPr>
-        <w:lastRenderedPageBreak/>
         <w:t>Diferença-chave entre as duas pastas</w:t>
       </w:r>
     </w:p>
@@ -14378,6 +14200,7 @@
                 <w:b/>
                 <w:bCs/>
               </w:rPr>
+              <w:lastRenderedPageBreak/>
               <w:t>Pesos LoRA</w:t>
             </w:r>
           </w:p>
@@ -14487,6 +14310,2095 @@
         <w:t>03_evaluate_model.py</w:t>
       </w:r>
     </w:p>
+    <w:p>
+      <w:pPr>
+        <w:rPr>
+          <w:b/>
+          <w:bCs/>
+        </w:rPr>
+      </w:pPr>
+      <w:r>
+        <w:rPr>
+          <w:b/>
+          <w:bCs/>
+        </w:rPr>
+        <w:t>Parâmetros de entrada:</w:t>
+      </w:r>
+    </w:p>
+    <w:tbl>
+      <w:tblPr>
+        <w:tblW w:w="0" w:type="auto"/>
+        <w:tblBorders>
+          <w:top w:val="single" w:sz="12" w:space="0" w:color="auto"/>
+          <w:left w:val="single" w:sz="12" w:space="0" w:color="auto"/>
+          <w:bottom w:val="single" w:sz="12" w:space="0" w:color="auto"/>
+          <w:right w:val="single" w:sz="12" w:space="0" w:color="auto"/>
+          <w:insideH w:val="single" w:sz="12" w:space="0" w:color="auto"/>
+          <w:insideV w:val="single" w:sz="12" w:space="0" w:color="auto"/>
+        </w:tblBorders>
+        <w:shd w:val="clear" w:color="auto" w:fill="FFFFFF"/>
+        <w:tblCellMar>
+          <w:top w:w="15" w:type="dxa"/>
+          <w:left w:w="15" w:type="dxa"/>
+          <w:bottom w:w="15" w:type="dxa"/>
+          <w:right w:w="15" w:type="dxa"/>
+        </w:tblCellMar>
+        <w:tblLook w:val="04A0" w:firstRow="1" w:lastRow="0" w:firstColumn="1" w:lastColumn="0" w:noHBand="0" w:noVBand="1"/>
+      </w:tblPr>
+      <w:tblGrid>
+        <w:gridCol w:w="1708"/>
+        <w:gridCol w:w="809"/>
+        <w:gridCol w:w="5957"/>
+      </w:tblGrid>
+      <w:tr>
+        <w:trPr>
+          <w:tblHeader/>
+        </w:trPr>
+        <w:tc>
+          <w:tcPr>
+            <w:tcW w:w="0" w:type="auto"/>
+            <w:shd w:val="clear" w:color="auto" w:fill="FFFFFF"/>
+            <w:noWrap/>
+            <w:tcMar>
+              <w:top w:w="75" w:type="dxa"/>
+              <w:left w:w="135" w:type="dxa"/>
+              <w:bottom w:w="75" w:type="dxa"/>
+              <w:right w:w="135" w:type="dxa"/>
+            </w:tcMar>
+            <w:hideMark/>
+          </w:tcPr>
+          <w:p>
+            <w:pPr>
+              <w:spacing w:after="0" w:line="240" w:lineRule="auto"/>
+              <w:rPr>
+                <w:rFonts w:ascii="Segoe UI" w:eastAsia="Times New Roman" w:hAnsi="Segoe UI" w:cs="Segoe UI"/>
+                <w:b/>
+                <w:bCs/>
+                <w:color w:val="000000"/>
+                <w:kern w:val="0"/>
+                <w:sz w:val="16"/>
+                <w:szCs w:val="16"/>
+                <w:lang w:eastAsia="pt-BR"/>
+                <w14:ligatures w14:val="none"/>
+              </w:rPr>
+            </w:pPr>
+            <w:r>
+              <w:rPr>
+                <w:rFonts w:ascii="Segoe UI" w:eastAsia="Times New Roman" w:hAnsi="Segoe UI" w:cs="Segoe UI"/>
+                <w:b/>
+                <w:bCs/>
+                <w:color w:val="000000"/>
+                <w:kern w:val="0"/>
+                <w:sz w:val="16"/>
+                <w:szCs w:val="16"/>
+                <w:lang w:eastAsia="pt-BR"/>
+                <w14:ligatures w14:val="none"/>
+              </w:rPr>
+              <w:t>Flag</w:t>
+            </w:r>
+          </w:p>
+        </w:tc>
+        <w:tc>
+          <w:tcPr>
+            <w:tcW w:w="0" w:type="auto"/>
+            <w:shd w:val="clear" w:color="auto" w:fill="FFFFFF"/>
+            <w:noWrap/>
+            <w:tcMar>
+              <w:top w:w="75" w:type="dxa"/>
+              <w:left w:w="135" w:type="dxa"/>
+              <w:bottom w:w="75" w:type="dxa"/>
+              <w:right w:w="135" w:type="dxa"/>
+            </w:tcMar>
+            <w:hideMark/>
+          </w:tcPr>
+          <w:p>
+            <w:pPr>
+              <w:spacing w:after="0" w:line="240" w:lineRule="auto"/>
+              <w:rPr>
+                <w:rFonts w:ascii="Segoe UI" w:eastAsia="Times New Roman" w:hAnsi="Segoe UI" w:cs="Segoe UI"/>
+                <w:b/>
+                <w:bCs/>
+                <w:color w:val="000000"/>
+                <w:kern w:val="0"/>
+                <w:sz w:val="16"/>
+                <w:szCs w:val="16"/>
+                <w:lang w:eastAsia="pt-BR"/>
+                <w14:ligatures w14:val="none"/>
+              </w:rPr>
+            </w:pPr>
+            <w:r>
+              <w:rPr>
+                <w:rFonts w:ascii="Segoe UI" w:eastAsia="Times New Roman" w:hAnsi="Segoe UI" w:cs="Segoe UI"/>
+                <w:b/>
+                <w:bCs/>
+                <w:color w:val="000000"/>
+                <w:kern w:val="0"/>
+                <w:sz w:val="16"/>
+                <w:szCs w:val="16"/>
+                <w:lang w:eastAsia="pt-BR"/>
+                <w14:ligatures w14:val="none"/>
+              </w:rPr>
+              <w:t>Tipo</w:t>
+            </w:r>
+          </w:p>
+        </w:tc>
+        <w:tc>
+          <w:tcPr>
+            <w:tcW w:w="0" w:type="auto"/>
+            <w:shd w:val="clear" w:color="auto" w:fill="FFFFFF"/>
+            <w:noWrap/>
+            <w:tcMar>
+              <w:top w:w="75" w:type="dxa"/>
+              <w:left w:w="135" w:type="dxa"/>
+              <w:bottom w:w="75" w:type="dxa"/>
+              <w:right w:w="135" w:type="dxa"/>
+            </w:tcMar>
+            <w:hideMark/>
+          </w:tcPr>
+          <w:p>
+            <w:pPr>
+              <w:spacing w:after="0" w:line="240" w:lineRule="auto"/>
+              <w:rPr>
+                <w:rFonts w:ascii="Segoe UI" w:eastAsia="Times New Roman" w:hAnsi="Segoe UI" w:cs="Segoe UI"/>
+                <w:b/>
+                <w:bCs/>
+                <w:color w:val="000000"/>
+                <w:kern w:val="0"/>
+                <w:sz w:val="16"/>
+                <w:szCs w:val="16"/>
+                <w:lang w:eastAsia="pt-BR"/>
+                <w14:ligatures w14:val="none"/>
+              </w:rPr>
+            </w:pPr>
+            <w:r>
+              <w:rPr>
+                <w:rFonts w:ascii="Segoe UI" w:eastAsia="Times New Roman" w:hAnsi="Segoe UI" w:cs="Segoe UI"/>
+                <w:b/>
+                <w:bCs/>
+                <w:color w:val="000000"/>
+                <w:kern w:val="0"/>
+                <w:sz w:val="16"/>
+                <w:szCs w:val="16"/>
+                <w:lang w:eastAsia="pt-BR"/>
+                <w14:ligatures w14:val="none"/>
+              </w:rPr>
+              <w:t>O que representa</w:t>
+            </w:r>
+          </w:p>
+        </w:tc>
+      </w:tr>
+      <w:tr>
+        <w:tc>
+          <w:tcPr>
+            <w:tcW w:w="0" w:type="auto"/>
+            <w:shd w:val="clear" w:color="auto" w:fill="FFFFFF"/>
+            <w:tcMar>
+              <w:top w:w="75" w:type="dxa"/>
+              <w:left w:w="135" w:type="dxa"/>
+              <w:bottom w:w="75" w:type="dxa"/>
+              <w:right w:w="135" w:type="dxa"/>
+            </w:tcMar>
+            <w:hideMark/>
+          </w:tcPr>
+          <w:p>
+            <w:pPr>
+              <w:spacing w:after="0" w:line="240" w:lineRule="auto"/>
+              <w:rPr>
+                <w:rFonts w:ascii="Consolas" w:eastAsia="Times New Roman" w:hAnsi="Consolas" w:cs="Calibri"/>
+                <w:color w:val="000000"/>
+                <w:kern w:val="0"/>
+                <w:sz w:val="20"/>
+                <w:szCs w:val="20"/>
+                <w:lang w:eastAsia="pt-BR"/>
+                <w14:ligatures w14:val="none"/>
+              </w:rPr>
+            </w:pPr>
+            <w:r>
+              <w:rPr>
+                <w:rFonts w:ascii="Consolas" w:eastAsia="Times New Roman" w:hAnsi="Consolas" w:cs="Calibri"/>
+                <w:color w:val="000000"/>
+                <w:kern w:val="0"/>
+                <w:sz w:val="20"/>
+                <w:szCs w:val="20"/>
+                <w:lang w:eastAsia="pt-BR"/>
+                <w14:ligatures w14:val="none"/>
+              </w:rPr>
+              <w:t>--dataset-</w:t>
+            </w:r>
+            <w:proofErr w:type="spellStart"/>
+            <w:r>
+              <w:rPr>
+                <w:rFonts w:ascii="Consolas" w:eastAsia="Times New Roman" w:hAnsi="Consolas" w:cs="Calibri"/>
+                <w:color w:val="000000"/>
+                <w:kern w:val="0"/>
+                <w:sz w:val="20"/>
+                <w:szCs w:val="20"/>
+                <w:lang w:eastAsia="pt-BR"/>
+                <w14:ligatures w14:val="none"/>
+              </w:rPr>
+              <w:t>dir</w:t>
+            </w:r>
+            <w:proofErr w:type="spellEnd"/>
+          </w:p>
+        </w:tc>
+        <w:tc>
+          <w:tcPr>
+            <w:tcW w:w="0" w:type="auto"/>
+            <w:shd w:val="clear" w:color="auto" w:fill="FFFFFF"/>
+            <w:tcMar>
+              <w:top w:w="75" w:type="dxa"/>
+              <w:left w:w="135" w:type="dxa"/>
+              <w:bottom w:w="75" w:type="dxa"/>
+              <w:right w:w="135" w:type="dxa"/>
+            </w:tcMar>
+            <w:hideMark/>
+          </w:tcPr>
+          <w:p>
+            <w:pPr>
+              <w:spacing w:after="0" w:line="240" w:lineRule="auto"/>
+              <w:rPr>
+                <w:rFonts w:ascii="Segoe UI" w:eastAsia="Times New Roman" w:hAnsi="Segoe UI" w:cs="Segoe UI"/>
+                <w:color w:val="000000"/>
+                <w:kern w:val="0"/>
+                <w:sz w:val="16"/>
+                <w:szCs w:val="16"/>
+                <w:lang w:eastAsia="pt-BR"/>
+                <w14:ligatures w14:val="none"/>
+              </w:rPr>
+            </w:pPr>
+            <w:r>
+              <w:rPr>
+                <w:rFonts w:ascii="Segoe UI" w:eastAsia="Times New Roman" w:hAnsi="Segoe UI" w:cs="Segoe UI"/>
+                <w:color w:val="000000"/>
+                <w:kern w:val="0"/>
+                <w:sz w:val="16"/>
+                <w:szCs w:val="16"/>
+                <w:lang w:eastAsia="pt-BR"/>
+                <w14:ligatures w14:val="none"/>
+              </w:rPr>
+              <w:t>Entrada</w:t>
+            </w:r>
+          </w:p>
+        </w:tc>
+        <w:tc>
+          <w:tcPr>
+            <w:tcW w:w="0" w:type="auto"/>
+            <w:shd w:val="clear" w:color="auto" w:fill="FFFFFF"/>
+            <w:tcMar>
+              <w:top w:w="75" w:type="dxa"/>
+              <w:left w:w="135" w:type="dxa"/>
+              <w:bottom w:w="75" w:type="dxa"/>
+              <w:right w:w="135" w:type="dxa"/>
+            </w:tcMar>
+            <w:hideMark/>
+          </w:tcPr>
+          <w:p>
+            <w:pPr>
+              <w:rPr>
+                <w:sz w:val="18"/>
+                <w:szCs w:val="18"/>
+              </w:rPr>
+            </w:pPr>
+            <w:r>
+              <w:rPr>
+                <w:b/>
+                <w:bCs/>
+                <w:sz w:val="18"/>
+                <w:szCs w:val="18"/>
+              </w:rPr>
+              <w:t>Padrão</w:t>
+            </w:r>
+            <w:r>
+              <w:rPr>
+                <w:b/>
+                <w:bCs/>
+                <w:sz w:val="18"/>
+                <w:szCs w:val="18"/>
+              </w:rPr>
+              <w:t>:</w:t>
+            </w:r>
+            <w:r>
+              <w:rPr>
+                <w:sz w:val="18"/>
+                <w:szCs w:val="18"/>
+              </w:rPr>
+              <w:t> data/</w:t>
+            </w:r>
+            <w:proofErr w:type="spellStart"/>
+            <w:r>
+              <w:rPr>
+                <w:sz w:val="18"/>
+                <w:szCs w:val="18"/>
+              </w:rPr>
+              <w:t>processed</w:t>
+            </w:r>
+            <w:proofErr w:type="spellEnd"/>
+            <w:r>
+              <w:rPr>
+                <w:sz w:val="18"/>
+                <w:szCs w:val="18"/>
+              </w:rPr>
+              <w:t>/</w:t>
+            </w:r>
+            <w:proofErr w:type="spellStart"/>
+            <w:r>
+              <w:rPr>
+                <w:sz w:val="18"/>
+                <w:szCs w:val="18"/>
+              </w:rPr>
+              <w:t>medpt_qa</w:t>
+            </w:r>
+            <w:proofErr w:type="spellEnd"/>
+            <w:r>
+              <w:rPr>
+                <w:sz w:val="18"/>
+                <w:szCs w:val="18"/>
+              </w:rPr>
+              <w:br/>
+              <w:t>Caminho do </w:t>
+            </w:r>
+            <w:proofErr w:type="spellStart"/>
+            <w:r>
+              <w:rPr>
+                <w:sz w:val="18"/>
+                <w:szCs w:val="18"/>
+              </w:rPr>
+              <w:t>DatasetDict</w:t>
+            </w:r>
+            <w:proofErr w:type="spellEnd"/>
+            <w:r>
+              <w:rPr>
+                <w:sz w:val="18"/>
+                <w:szCs w:val="18"/>
+              </w:rPr>
+              <w:t> processado (split de teste usado na avaliação).</w:t>
+            </w:r>
+          </w:p>
+        </w:tc>
+      </w:tr>
+      <w:tr>
+        <w:tc>
+          <w:tcPr>
+            <w:tcW w:w="0" w:type="auto"/>
+            <w:shd w:val="clear" w:color="auto" w:fill="FFFFFF"/>
+            <w:tcMar>
+              <w:top w:w="75" w:type="dxa"/>
+              <w:left w:w="135" w:type="dxa"/>
+              <w:bottom w:w="75" w:type="dxa"/>
+              <w:right w:w="135" w:type="dxa"/>
+            </w:tcMar>
+            <w:hideMark/>
+          </w:tcPr>
+          <w:p>
+            <w:pPr>
+              <w:spacing w:after="0" w:line="240" w:lineRule="auto"/>
+              <w:rPr>
+                <w:rFonts w:ascii="Consolas" w:eastAsia="Times New Roman" w:hAnsi="Consolas" w:cs="Calibri"/>
+                <w:color w:val="000000"/>
+                <w:kern w:val="0"/>
+                <w:sz w:val="20"/>
+                <w:szCs w:val="20"/>
+                <w:lang w:eastAsia="pt-BR"/>
+                <w14:ligatures w14:val="none"/>
+              </w:rPr>
+            </w:pPr>
+            <w:r>
+              <w:rPr>
+                <w:rFonts w:ascii="Consolas" w:eastAsia="Times New Roman" w:hAnsi="Consolas" w:cs="Calibri"/>
+                <w:color w:val="000000"/>
+                <w:kern w:val="0"/>
+                <w:sz w:val="20"/>
+                <w:szCs w:val="20"/>
+                <w:lang w:eastAsia="pt-BR"/>
+                <w14:ligatures w14:val="none"/>
+              </w:rPr>
+              <w:t>--</w:t>
+            </w:r>
+            <w:proofErr w:type="spellStart"/>
+            <w:r>
+              <w:rPr>
+                <w:rFonts w:ascii="Consolas" w:eastAsia="Times New Roman" w:hAnsi="Consolas" w:cs="Calibri"/>
+                <w:color w:val="000000"/>
+                <w:kern w:val="0"/>
+                <w:sz w:val="20"/>
+                <w:szCs w:val="20"/>
+                <w:lang w:eastAsia="pt-BR"/>
+                <w14:ligatures w14:val="none"/>
+              </w:rPr>
+              <w:t>manifest</w:t>
+            </w:r>
+            <w:proofErr w:type="spellEnd"/>
+            <w:r>
+              <w:rPr>
+                <w:rFonts w:ascii="Consolas" w:eastAsia="Times New Roman" w:hAnsi="Consolas" w:cs="Calibri"/>
+                <w:color w:val="000000"/>
+                <w:kern w:val="0"/>
+                <w:sz w:val="20"/>
+                <w:szCs w:val="20"/>
+                <w:lang w:eastAsia="pt-BR"/>
+                <w14:ligatures w14:val="none"/>
+              </w:rPr>
+              <w:t>-path</w:t>
+            </w:r>
+          </w:p>
+        </w:tc>
+        <w:tc>
+          <w:tcPr>
+            <w:tcW w:w="0" w:type="auto"/>
+            <w:shd w:val="clear" w:color="auto" w:fill="FFFFFF"/>
+            <w:tcMar>
+              <w:top w:w="75" w:type="dxa"/>
+              <w:left w:w="135" w:type="dxa"/>
+              <w:bottom w:w="75" w:type="dxa"/>
+              <w:right w:w="135" w:type="dxa"/>
+            </w:tcMar>
+            <w:hideMark/>
+          </w:tcPr>
+          <w:p>
+            <w:pPr>
+              <w:spacing w:after="0" w:line="240" w:lineRule="auto"/>
+              <w:rPr>
+                <w:rFonts w:ascii="Segoe UI" w:eastAsia="Times New Roman" w:hAnsi="Segoe UI" w:cs="Segoe UI"/>
+                <w:color w:val="000000"/>
+                <w:kern w:val="0"/>
+                <w:sz w:val="16"/>
+                <w:szCs w:val="16"/>
+                <w:lang w:eastAsia="pt-BR"/>
+                <w14:ligatures w14:val="none"/>
+              </w:rPr>
+            </w:pPr>
+            <w:r>
+              <w:rPr>
+                <w:rFonts w:ascii="Segoe UI" w:eastAsia="Times New Roman" w:hAnsi="Segoe UI" w:cs="Segoe UI"/>
+                <w:color w:val="000000"/>
+                <w:kern w:val="0"/>
+                <w:sz w:val="16"/>
+                <w:szCs w:val="16"/>
+                <w:lang w:eastAsia="pt-BR"/>
+                <w14:ligatures w14:val="none"/>
+              </w:rPr>
+              <w:t>Entrada</w:t>
+            </w:r>
+          </w:p>
+        </w:tc>
+        <w:tc>
+          <w:tcPr>
+            <w:tcW w:w="0" w:type="auto"/>
+            <w:shd w:val="clear" w:color="auto" w:fill="FFFFFF"/>
+            <w:tcMar>
+              <w:top w:w="75" w:type="dxa"/>
+              <w:left w:w="135" w:type="dxa"/>
+              <w:bottom w:w="75" w:type="dxa"/>
+              <w:right w:w="135" w:type="dxa"/>
+            </w:tcMar>
+            <w:hideMark/>
+          </w:tcPr>
+          <w:p>
+            <w:pPr>
+              <w:rPr>
+                <w:sz w:val="18"/>
+                <w:szCs w:val="18"/>
+              </w:rPr>
+            </w:pPr>
+            <w:r>
+              <w:rPr>
+                <w:b/>
+                <w:bCs/>
+                <w:sz w:val="18"/>
+                <w:szCs w:val="18"/>
+              </w:rPr>
+              <w:t>Padrão</w:t>
+            </w:r>
+            <w:r>
+              <w:rPr>
+                <w:b/>
+                <w:bCs/>
+                <w:sz w:val="18"/>
+                <w:szCs w:val="18"/>
+              </w:rPr>
+              <w:t>:</w:t>
+            </w:r>
+            <w:r>
+              <w:rPr>
+                <w:sz w:val="18"/>
+                <w:szCs w:val="18"/>
+              </w:rPr>
+              <w:t> data/</w:t>
+            </w:r>
+            <w:proofErr w:type="spellStart"/>
+            <w:r>
+              <w:rPr>
+                <w:sz w:val="18"/>
+                <w:szCs w:val="18"/>
+              </w:rPr>
+              <w:t>processed</w:t>
+            </w:r>
+            <w:proofErr w:type="spellEnd"/>
+            <w:r>
+              <w:rPr>
+                <w:sz w:val="18"/>
+                <w:szCs w:val="18"/>
+              </w:rPr>
+              <w:t>/</w:t>
+            </w:r>
+            <w:proofErr w:type="spellStart"/>
+            <w:r>
+              <w:rPr>
+                <w:sz w:val="18"/>
+                <w:szCs w:val="18"/>
+              </w:rPr>
+              <w:t>medpt_qa_manifest.jsonl</w:t>
+            </w:r>
+            <w:proofErr w:type="spellEnd"/>
+            <w:r>
+              <w:rPr>
+                <w:sz w:val="18"/>
+                <w:szCs w:val="18"/>
+              </w:rPr>
+              <w:br/>
+              <w:t>Manifesto JSONL do script 01 (metadados por par pergunta/resposta, ex.: condição).</w:t>
+            </w:r>
+          </w:p>
+        </w:tc>
+      </w:tr>
+      <w:tr>
+        <w:tc>
+          <w:tcPr>
+            <w:tcW w:w="0" w:type="auto"/>
+            <w:shd w:val="clear" w:color="auto" w:fill="FFFFFF"/>
+            <w:tcMar>
+              <w:top w:w="75" w:type="dxa"/>
+              <w:left w:w="135" w:type="dxa"/>
+              <w:bottom w:w="75" w:type="dxa"/>
+              <w:right w:w="135" w:type="dxa"/>
+            </w:tcMar>
+            <w:hideMark/>
+          </w:tcPr>
+          <w:p>
+            <w:pPr>
+              <w:spacing w:after="0" w:line="240" w:lineRule="auto"/>
+              <w:rPr>
+                <w:rFonts w:ascii="Consolas" w:eastAsia="Times New Roman" w:hAnsi="Consolas" w:cs="Calibri"/>
+                <w:color w:val="000000"/>
+                <w:kern w:val="0"/>
+                <w:sz w:val="20"/>
+                <w:szCs w:val="20"/>
+                <w:lang w:eastAsia="pt-BR"/>
+                <w14:ligatures w14:val="none"/>
+              </w:rPr>
+            </w:pPr>
+            <w:r>
+              <w:rPr>
+                <w:rFonts w:ascii="Consolas" w:eastAsia="Times New Roman" w:hAnsi="Consolas" w:cs="Calibri"/>
+                <w:color w:val="000000"/>
+                <w:kern w:val="0"/>
+                <w:sz w:val="20"/>
+                <w:szCs w:val="20"/>
+                <w:lang w:eastAsia="pt-BR"/>
+                <w14:ligatures w14:val="none"/>
+              </w:rPr>
+              <w:t>--</w:t>
+            </w:r>
+            <w:proofErr w:type="spellStart"/>
+            <w:r>
+              <w:rPr>
+                <w:rFonts w:ascii="Consolas" w:eastAsia="Times New Roman" w:hAnsi="Consolas" w:cs="Calibri"/>
+                <w:color w:val="000000"/>
+                <w:kern w:val="0"/>
+                <w:sz w:val="20"/>
+                <w:szCs w:val="20"/>
+                <w:lang w:eastAsia="pt-BR"/>
+                <w14:ligatures w14:val="none"/>
+              </w:rPr>
+              <w:t>adapter-dir</w:t>
+            </w:r>
+            <w:proofErr w:type="spellEnd"/>
+          </w:p>
+        </w:tc>
+        <w:tc>
+          <w:tcPr>
+            <w:tcW w:w="0" w:type="auto"/>
+            <w:shd w:val="clear" w:color="auto" w:fill="FFFFFF"/>
+            <w:tcMar>
+              <w:top w:w="75" w:type="dxa"/>
+              <w:left w:w="135" w:type="dxa"/>
+              <w:bottom w:w="75" w:type="dxa"/>
+              <w:right w:w="135" w:type="dxa"/>
+            </w:tcMar>
+            <w:hideMark/>
+          </w:tcPr>
+          <w:p>
+            <w:pPr>
+              <w:spacing w:after="0" w:line="240" w:lineRule="auto"/>
+              <w:rPr>
+                <w:rFonts w:ascii="Segoe UI" w:eastAsia="Times New Roman" w:hAnsi="Segoe UI" w:cs="Segoe UI"/>
+                <w:color w:val="000000"/>
+                <w:kern w:val="0"/>
+                <w:sz w:val="16"/>
+                <w:szCs w:val="16"/>
+                <w:lang w:eastAsia="pt-BR"/>
+                <w14:ligatures w14:val="none"/>
+              </w:rPr>
+            </w:pPr>
+            <w:r>
+              <w:rPr>
+                <w:rFonts w:ascii="Segoe UI" w:eastAsia="Times New Roman" w:hAnsi="Segoe UI" w:cs="Segoe UI"/>
+                <w:color w:val="000000"/>
+                <w:kern w:val="0"/>
+                <w:sz w:val="16"/>
+                <w:szCs w:val="16"/>
+                <w:lang w:eastAsia="pt-BR"/>
+                <w14:ligatures w14:val="none"/>
+              </w:rPr>
+              <w:t>Entrada</w:t>
+            </w:r>
+          </w:p>
+        </w:tc>
+        <w:tc>
+          <w:tcPr>
+            <w:tcW w:w="0" w:type="auto"/>
+            <w:shd w:val="clear" w:color="auto" w:fill="FFFFFF"/>
+            <w:tcMar>
+              <w:top w:w="75" w:type="dxa"/>
+              <w:left w:w="135" w:type="dxa"/>
+              <w:bottom w:w="75" w:type="dxa"/>
+              <w:right w:w="135" w:type="dxa"/>
+            </w:tcMar>
+            <w:hideMark/>
+          </w:tcPr>
+          <w:p>
+            <w:pPr>
+              <w:rPr>
+                <w:sz w:val="18"/>
+                <w:szCs w:val="18"/>
+              </w:rPr>
+            </w:pPr>
+            <w:r>
+              <w:rPr>
+                <w:b/>
+                <w:bCs/>
+                <w:sz w:val="18"/>
+                <w:szCs w:val="18"/>
+              </w:rPr>
+              <w:t>Padrão</w:t>
+            </w:r>
+            <w:r>
+              <w:rPr>
+                <w:b/>
+                <w:bCs/>
+                <w:sz w:val="18"/>
+                <w:szCs w:val="18"/>
+              </w:rPr>
+              <w:t>:</w:t>
+            </w:r>
+            <w:r>
+              <w:rPr>
+                <w:sz w:val="18"/>
+                <w:szCs w:val="18"/>
+              </w:rPr>
+              <w:t> </w:t>
+            </w:r>
+            <w:proofErr w:type="spellStart"/>
+            <w:r>
+              <w:rPr>
+                <w:sz w:val="18"/>
+                <w:szCs w:val="18"/>
+              </w:rPr>
+              <w:t>pre-trained</w:t>
+            </w:r>
+            <w:proofErr w:type="spellEnd"/>
+            <w:r>
+              <w:rPr>
+                <w:sz w:val="18"/>
+                <w:szCs w:val="18"/>
+              </w:rPr>
+              <w:t>/qwen2.5-3b-medpt-lora</w:t>
+            </w:r>
+            <w:r>
+              <w:rPr>
+                <w:sz w:val="18"/>
+                <w:szCs w:val="18"/>
+              </w:rPr>
+              <w:br/>
+              <w:t xml:space="preserve">Diretório do </w:t>
+            </w:r>
+            <w:proofErr w:type="spellStart"/>
+            <w:r>
+              <w:rPr>
+                <w:sz w:val="18"/>
+                <w:szCs w:val="18"/>
+              </w:rPr>
+              <w:t>adapter</w:t>
+            </w:r>
+            <w:proofErr w:type="spellEnd"/>
+            <w:r>
+              <w:rPr>
+                <w:sz w:val="18"/>
+                <w:szCs w:val="18"/>
+              </w:rPr>
+              <w:t xml:space="preserve"> LoRA treinado (script 02) carregado sobre o modelo base.</w:t>
+            </w:r>
+          </w:p>
+        </w:tc>
+      </w:tr>
+      <w:tr>
+        <w:tc>
+          <w:tcPr>
+            <w:tcW w:w="0" w:type="auto"/>
+            <w:shd w:val="clear" w:color="auto" w:fill="FFFFFF"/>
+            <w:tcMar>
+              <w:top w:w="75" w:type="dxa"/>
+              <w:left w:w="135" w:type="dxa"/>
+              <w:bottom w:w="75" w:type="dxa"/>
+              <w:right w:w="135" w:type="dxa"/>
+            </w:tcMar>
+            <w:hideMark/>
+          </w:tcPr>
+          <w:p>
+            <w:pPr>
+              <w:spacing w:after="0" w:line="240" w:lineRule="auto"/>
+              <w:rPr>
+                <w:rFonts w:ascii="Consolas" w:eastAsia="Times New Roman" w:hAnsi="Consolas" w:cs="Calibri"/>
+                <w:color w:val="000000"/>
+                <w:kern w:val="0"/>
+                <w:sz w:val="20"/>
+                <w:szCs w:val="20"/>
+                <w:lang w:eastAsia="pt-BR"/>
+                <w14:ligatures w14:val="none"/>
+              </w:rPr>
+            </w:pPr>
+            <w:r>
+              <w:rPr>
+                <w:rFonts w:ascii="Consolas" w:eastAsia="Times New Roman" w:hAnsi="Consolas" w:cs="Calibri"/>
+                <w:color w:val="000000"/>
+                <w:kern w:val="0"/>
+                <w:sz w:val="20"/>
+                <w:szCs w:val="20"/>
+                <w:lang w:eastAsia="pt-BR"/>
+                <w14:ligatures w14:val="none"/>
+              </w:rPr>
+              <w:t>--base-model-</w:t>
+            </w:r>
+            <w:proofErr w:type="spellStart"/>
+            <w:r>
+              <w:rPr>
+                <w:rFonts w:ascii="Consolas" w:eastAsia="Times New Roman" w:hAnsi="Consolas" w:cs="Calibri"/>
+                <w:color w:val="000000"/>
+                <w:kern w:val="0"/>
+                <w:sz w:val="20"/>
+                <w:szCs w:val="20"/>
+                <w:lang w:eastAsia="pt-BR"/>
+                <w14:ligatures w14:val="none"/>
+              </w:rPr>
+              <w:t>name</w:t>
+            </w:r>
+            <w:proofErr w:type="spellEnd"/>
+          </w:p>
+        </w:tc>
+        <w:tc>
+          <w:tcPr>
+            <w:tcW w:w="0" w:type="auto"/>
+            <w:shd w:val="clear" w:color="auto" w:fill="FFFFFF"/>
+            <w:tcMar>
+              <w:top w:w="75" w:type="dxa"/>
+              <w:left w:w="135" w:type="dxa"/>
+              <w:bottom w:w="75" w:type="dxa"/>
+              <w:right w:w="135" w:type="dxa"/>
+            </w:tcMar>
+            <w:hideMark/>
+          </w:tcPr>
+          <w:p>
+            <w:pPr>
+              <w:spacing w:after="0" w:line="240" w:lineRule="auto"/>
+              <w:rPr>
+                <w:rFonts w:ascii="Segoe UI" w:eastAsia="Times New Roman" w:hAnsi="Segoe UI" w:cs="Segoe UI"/>
+                <w:color w:val="000000"/>
+                <w:kern w:val="0"/>
+                <w:sz w:val="16"/>
+                <w:szCs w:val="16"/>
+                <w:lang w:eastAsia="pt-BR"/>
+                <w14:ligatures w14:val="none"/>
+              </w:rPr>
+            </w:pPr>
+            <w:r>
+              <w:rPr>
+                <w:rFonts w:ascii="Segoe UI" w:eastAsia="Times New Roman" w:hAnsi="Segoe UI" w:cs="Segoe UI"/>
+                <w:color w:val="000000"/>
+                <w:kern w:val="0"/>
+                <w:sz w:val="16"/>
+                <w:szCs w:val="16"/>
+                <w:lang w:eastAsia="pt-BR"/>
+                <w14:ligatures w14:val="none"/>
+              </w:rPr>
+              <w:t>Entrada</w:t>
+            </w:r>
+          </w:p>
+        </w:tc>
+        <w:tc>
+          <w:tcPr>
+            <w:tcW w:w="0" w:type="auto"/>
+            <w:shd w:val="clear" w:color="auto" w:fill="FFFFFF"/>
+            <w:tcMar>
+              <w:top w:w="75" w:type="dxa"/>
+              <w:left w:w="135" w:type="dxa"/>
+              <w:bottom w:w="75" w:type="dxa"/>
+              <w:right w:w="135" w:type="dxa"/>
+            </w:tcMar>
+            <w:hideMark/>
+          </w:tcPr>
+          <w:p>
+            <w:pPr>
+              <w:rPr>
+                <w:sz w:val="18"/>
+                <w:szCs w:val="18"/>
+              </w:rPr>
+            </w:pPr>
+            <w:r>
+              <w:rPr>
+                <w:b/>
+                <w:bCs/>
+                <w:sz w:val="18"/>
+                <w:szCs w:val="18"/>
+              </w:rPr>
+              <w:t>Padrão</w:t>
+            </w:r>
+            <w:r>
+              <w:rPr>
+                <w:b/>
+                <w:bCs/>
+                <w:sz w:val="18"/>
+                <w:szCs w:val="18"/>
+              </w:rPr>
+              <w:t>:</w:t>
+            </w:r>
+            <w:r>
+              <w:rPr>
+                <w:sz w:val="18"/>
+                <w:szCs w:val="18"/>
+              </w:rPr>
+              <w:t> </w:t>
+            </w:r>
+            <w:proofErr w:type="spellStart"/>
+            <w:r>
+              <w:rPr>
+                <w:sz w:val="18"/>
+                <w:szCs w:val="18"/>
+              </w:rPr>
+              <w:t>Qwen</w:t>
+            </w:r>
+            <w:proofErr w:type="spellEnd"/>
+            <w:r>
+              <w:rPr>
+                <w:sz w:val="18"/>
+                <w:szCs w:val="18"/>
+              </w:rPr>
+              <w:t>/Qwen2.5-3B-Instruct</w:t>
+            </w:r>
+            <w:r>
+              <w:rPr>
+                <w:sz w:val="18"/>
+                <w:szCs w:val="18"/>
+              </w:rPr>
+              <w:br/>
+              <w:t xml:space="preserve">Identificador </w:t>
+            </w:r>
+            <w:proofErr w:type="spellStart"/>
+            <w:r>
+              <w:rPr>
+                <w:sz w:val="18"/>
+                <w:szCs w:val="18"/>
+              </w:rPr>
+              <w:t>Hugging</w:t>
+            </w:r>
+            <w:proofErr w:type="spellEnd"/>
+            <w:r>
+              <w:rPr>
+                <w:sz w:val="18"/>
+                <w:szCs w:val="18"/>
+              </w:rPr>
+              <w:t xml:space="preserve"> Face do modelo causal base usado com o </w:t>
+            </w:r>
+            <w:proofErr w:type="spellStart"/>
+            <w:r>
+              <w:rPr>
+                <w:sz w:val="18"/>
+                <w:szCs w:val="18"/>
+              </w:rPr>
+              <w:t>adapter</w:t>
+            </w:r>
+            <w:proofErr w:type="spellEnd"/>
+            <w:r>
+              <w:rPr>
+                <w:sz w:val="18"/>
+                <w:szCs w:val="18"/>
+              </w:rPr>
+              <w:t>.</w:t>
+            </w:r>
+          </w:p>
+        </w:tc>
+      </w:tr>
+      <w:tr>
+        <w:tc>
+          <w:tcPr>
+            <w:tcW w:w="0" w:type="auto"/>
+            <w:shd w:val="clear" w:color="auto" w:fill="FFFFFF"/>
+            <w:tcMar>
+              <w:top w:w="75" w:type="dxa"/>
+              <w:left w:w="135" w:type="dxa"/>
+              <w:bottom w:w="75" w:type="dxa"/>
+              <w:right w:w="135" w:type="dxa"/>
+            </w:tcMar>
+            <w:hideMark/>
+          </w:tcPr>
+          <w:p>
+            <w:pPr>
+              <w:spacing w:after="0" w:line="240" w:lineRule="auto"/>
+              <w:rPr>
+                <w:rFonts w:ascii="Consolas" w:eastAsia="Times New Roman" w:hAnsi="Consolas" w:cs="Calibri"/>
+                <w:color w:val="000000"/>
+                <w:kern w:val="0"/>
+                <w:sz w:val="20"/>
+                <w:szCs w:val="20"/>
+                <w:lang w:eastAsia="pt-BR"/>
+                <w14:ligatures w14:val="none"/>
+              </w:rPr>
+            </w:pPr>
+            <w:r>
+              <w:rPr>
+                <w:rFonts w:ascii="Consolas" w:eastAsia="Times New Roman" w:hAnsi="Consolas" w:cs="Calibri"/>
+                <w:color w:val="000000"/>
+                <w:kern w:val="0"/>
+                <w:sz w:val="20"/>
+                <w:szCs w:val="20"/>
+                <w:lang w:eastAsia="pt-BR"/>
+                <w14:ligatures w14:val="none"/>
+              </w:rPr>
+              <w:t>--output-</w:t>
+            </w:r>
+            <w:proofErr w:type="spellStart"/>
+            <w:r>
+              <w:rPr>
+                <w:rFonts w:ascii="Consolas" w:eastAsia="Times New Roman" w:hAnsi="Consolas" w:cs="Calibri"/>
+                <w:color w:val="000000"/>
+                <w:kern w:val="0"/>
+                <w:sz w:val="20"/>
+                <w:szCs w:val="20"/>
+                <w:lang w:eastAsia="pt-BR"/>
+                <w14:ligatures w14:val="none"/>
+              </w:rPr>
+              <w:t>dir</w:t>
+            </w:r>
+            <w:proofErr w:type="spellEnd"/>
+          </w:p>
+        </w:tc>
+        <w:tc>
+          <w:tcPr>
+            <w:tcW w:w="0" w:type="auto"/>
+            <w:shd w:val="clear" w:color="auto" w:fill="FFFFFF"/>
+            <w:tcMar>
+              <w:top w:w="75" w:type="dxa"/>
+              <w:left w:w="135" w:type="dxa"/>
+              <w:bottom w:w="75" w:type="dxa"/>
+              <w:right w:w="135" w:type="dxa"/>
+            </w:tcMar>
+            <w:hideMark/>
+          </w:tcPr>
+          <w:p>
+            <w:pPr>
+              <w:spacing w:after="0" w:line="240" w:lineRule="auto"/>
+              <w:rPr>
+                <w:rFonts w:ascii="Segoe UI" w:eastAsia="Times New Roman" w:hAnsi="Segoe UI" w:cs="Segoe UI"/>
+                <w:color w:val="000000"/>
+                <w:kern w:val="0"/>
+                <w:sz w:val="16"/>
+                <w:szCs w:val="16"/>
+                <w:lang w:eastAsia="pt-BR"/>
+                <w14:ligatures w14:val="none"/>
+              </w:rPr>
+            </w:pPr>
+            <w:r>
+              <w:rPr>
+                <w:rFonts w:ascii="Segoe UI" w:eastAsia="Times New Roman" w:hAnsi="Segoe UI" w:cs="Segoe UI"/>
+                <w:color w:val="000000"/>
+                <w:kern w:val="0"/>
+                <w:sz w:val="16"/>
+                <w:szCs w:val="16"/>
+                <w:lang w:eastAsia="pt-BR"/>
+                <w14:ligatures w14:val="none"/>
+              </w:rPr>
+              <w:t>Entrada</w:t>
+            </w:r>
+          </w:p>
+        </w:tc>
+        <w:tc>
+          <w:tcPr>
+            <w:tcW w:w="0" w:type="auto"/>
+            <w:shd w:val="clear" w:color="auto" w:fill="FFFFFF"/>
+            <w:tcMar>
+              <w:top w:w="75" w:type="dxa"/>
+              <w:left w:w="135" w:type="dxa"/>
+              <w:bottom w:w="75" w:type="dxa"/>
+              <w:right w:w="135" w:type="dxa"/>
+            </w:tcMar>
+            <w:hideMark/>
+          </w:tcPr>
+          <w:p>
+            <w:pPr>
+              <w:rPr>
+                <w:sz w:val="18"/>
+                <w:szCs w:val="18"/>
+              </w:rPr>
+            </w:pPr>
+            <w:r>
+              <w:rPr>
+                <w:b/>
+                <w:bCs/>
+                <w:sz w:val="18"/>
+                <w:szCs w:val="18"/>
+              </w:rPr>
+              <w:t>Padrão</w:t>
+            </w:r>
+            <w:r>
+              <w:rPr>
+                <w:b/>
+                <w:bCs/>
+                <w:sz w:val="18"/>
+                <w:szCs w:val="18"/>
+              </w:rPr>
+              <w:t>:</w:t>
+            </w:r>
+            <w:r>
+              <w:rPr>
+                <w:sz w:val="18"/>
+                <w:szCs w:val="18"/>
+              </w:rPr>
+              <w:t> data/</w:t>
+            </w:r>
+            <w:proofErr w:type="spellStart"/>
+            <w:r>
+              <w:rPr>
+                <w:sz w:val="18"/>
+                <w:szCs w:val="18"/>
+              </w:rPr>
+              <w:t>evaluation</w:t>
+            </w:r>
+            <w:proofErr w:type="spellEnd"/>
+            <w:r>
+              <w:rPr>
+                <w:sz w:val="18"/>
+                <w:szCs w:val="18"/>
+              </w:rPr>
+              <w:t>/qwen2.5-3b-medpt-lora</w:t>
+            </w:r>
+            <w:r>
+              <w:rPr>
+                <w:sz w:val="18"/>
+                <w:szCs w:val="18"/>
+              </w:rPr>
+              <w:br/>
+              <w:t>Diretório onde o script grava previsões, resumo e artefatos de avaliação (é o </w:t>
+            </w:r>
+            <w:r>
+              <w:rPr>
+                <w:i/>
+                <w:iCs/>
+                <w:sz w:val="18"/>
+                <w:szCs w:val="18"/>
+              </w:rPr>
+              <w:t>destino</w:t>
+            </w:r>
+            <w:r>
+              <w:rPr>
+                <w:sz w:val="18"/>
+                <w:szCs w:val="18"/>
+              </w:rPr>
+              <w:t> da execução, mas a flag em si é parâmetro de entrada).</w:t>
+            </w:r>
+          </w:p>
+        </w:tc>
+      </w:tr>
+      <w:tr>
+        <w:tc>
+          <w:tcPr>
+            <w:tcW w:w="0" w:type="auto"/>
+            <w:shd w:val="clear" w:color="auto" w:fill="FFFFFF"/>
+            <w:tcMar>
+              <w:top w:w="75" w:type="dxa"/>
+              <w:left w:w="135" w:type="dxa"/>
+              <w:bottom w:w="75" w:type="dxa"/>
+              <w:right w:w="135" w:type="dxa"/>
+            </w:tcMar>
+            <w:hideMark/>
+          </w:tcPr>
+          <w:p>
+            <w:pPr>
+              <w:spacing w:after="0" w:line="240" w:lineRule="auto"/>
+              <w:rPr>
+                <w:rFonts w:ascii="Consolas" w:eastAsia="Times New Roman" w:hAnsi="Consolas" w:cs="Calibri"/>
+                <w:color w:val="000000"/>
+                <w:kern w:val="0"/>
+                <w:sz w:val="20"/>
+                <w:szCs w:val="20"/>
+                <w:lang w:eastAsia="pt-BR"/>
+                <w14:ligatures w14:val="none"/>
+              </w:rPr>
+            </w:pPr>
+            <w:r>
+              <w:rPr>
+                <w:rFonts w:ascii="Consolas" w:eastAsia="Times New Roman" w:hAnsi="Consolas" w:cs="Calibri"/>
+                <w:color w:val="000000"/>
+                <w:kern w:val="0"/>
+                <w:sz w:val="20"/>
+                <w:szCs w:val="20"/>
+                <w:lang w:eastAsia="pt-BR"/>
+                <w14:ligatures w14:val="none"/>
+              </w:rPr>
+              <w:t>--</w:t>
+            </w:r>
+            <w:proofErr w:type="spellStart"/>
+            <w:r>
+              <w:rPr>
+                <w:rFonts w:ascii="Consolas" w:eastAsia="Times New Roman" w:hAnsi="Consolas" w:cs="Calibri"/>
+                <w:color w:val="000000"/>
+                <w:kern w:val="0"/>
+                <w:sz w:val="20"/>
+                <w:szCs w:val="20"/>
+                <w:lang w:eastAsia="pt-BR"/>
+                <w14:ligatures w14:val="none"/>
+              </w:rPr>
+              <w:t>max</w:t>
+            </w:r>
+            <w:proofErr w:type="spellEnd"/>
+            <w:r>
+              <w:rPr>
+                <w:rFonts w:ascii="Consolas" w:eastAsia="Times New Roman" w:hAnsi="Consolas" w:cs="Calibri"/>
+                <w:color w:val="000000"/>
+                <w:kern w:val="0"/>
+                <w:sz w:val="20"/>
+                <w:szCs w:val="20"/>
+                <w:lang w:eastAsia="pt-BR"/>
+                <w14:ligatures w14:val="none"/>
+              </w:rPr>
+              <w:t>-</w:t>
+            </w:r>
+            <w:proofErr w:type="spellStart"/>
+            <w:r>
+              <w:rPr>
+                <w:rFonts w:ascii="Consolas" w:eastAsia="Times New Roman" w:hAnsi="Consolas" w:cs="Calibri"/>
+                <w:color w:val="000000"/>
+                <w:kern w:val="0"/>
+                <w:sz w:val="20"/>
+                <w:szCs w:val="20"/>
+                <w:lang w:eastAsia="pt-BR"/>
+                <w14:ligatures w14:val="none"/>
+              </w:rPr>
+              <w:t>eval</w:t>
+            </w:r>
+            <w:proofErr w:type="spellEnd"/>
+            <w:r>
+              <w:rPr>
+                <w:rFonts w:ascii="Consolas" w:eastAsia="Times New Roman" w:hAnsi="Consolas" w:cs="Calibri"/>
+                <w:color w:val="000000"/>
+                <w:kern w:val="0"/>
+                <w:sz w:val="20"/>
+                <w:szCs w:val="20"/>
+                <w:lang w:eastAsia="pt-BR"/>
+                <w14:ligatures w14:val="none"/>
+              </w:rPr>
+              <w:t>-samples</w:t>
+            </w:r>
+          </w:p>
+        </w:tc>
+        <w:tc>
+          <w:tcPr>
+            <w:tcW w:w="0" w:type="auto"/>
+            <w:shd w:val="clear" w:color="auto" w:fill="FFFFFF"/>
+            <w:tcMar>
+              <w:top w:w="75" w:type="dxa"/>
+              <w:left w:w="135" w:type="dxa"/>
+              <w:bottom w:w="75" w:type="dxa"/>
+              <w:right w:w="135" w:type="dxa"/>
+            </w:tcMar>
+            <w:hideMark/>
+          </w:tcPr>
+          <w:p>
+            <w:pPr>
+              <w:spacing w:after="0" w:line="240" w:lineRule="auto"/>
+              <w:rPr>
+                <w:rFonts w:ascii="Segoe UI" w:eastAsia="Times New Roman" w:hAnsi="Segoe UI" w:cs="Segoe UI"/>
+                <w:color w:val="000000"/>
+                <w:kern w:val="0"/>
+                <w:sz w:val="16"/>
+                <w:szCs w:val="16"/>
+                <w:lang w:eastAsia="pt-BR"/>
+                <w14:ligatures w14:val="none"/>
+              </w:rPr>
+            </w:pPr>
+            <w:r>
+              <w:rPr>
+                <w:rFonts w:ascii="Segoe UI" w:eastAsia="Times New Roman" w:hAnsi="Segoe UI" w:cs="Segoe UI"/>
+                <w:color w:val="000000"/>
+                <w:kern w:val="0"/>
+                <w:sz w:val="16"/>
+                <w:szCs w:val="16"/>
+                <w:lang w:eastAsia="pt-BR"/>
+                <w14:ligatures w14:val="none"/>
+              </w:rPr>
+              <w:t>Entrada</w:t>
+            </w:r>
+          </w:p>
+        </w:tc>
+        <w:tc>
+          <w:tcPr>
+            <w:tcW w:w="0" w:type="auto"/>
+            <w:shd w:val="clear" w:color="auto" w:fill="FFFFFF"/>
+            <w:tcMar>
+              <w:top w:w="75" w:type="dxa"/>
+              <w:left w:w="135" w:type="dxa"/>
+              <w:bottom w:w="75" w:type="dxa"/>
+              <w:right w:w="135" w:type="dxa"/>
+            </w:tcMar>
+            <w:hideMark/>
+          </w:tcPr>
+          <w:p>
+            <w:pPr>
+              <w:rPr>
+                <w:sz w:val="18"/>
+                <w:szCs w:val="18"/>
+              </w:rPr>
+            </w:pPr>
+            <w:r>
+              <w:rPr>
+                <w:b/>
+                <w:bCs/>
+                <w:sz w:val="18"/>
+                <w:szCs w:val="18"/>
+              </w:rPr>
+              <w:t>Padrão</w:t>
+            </w:r>
+            <w:r>
+              <w:rPr>
+                <w:b/>
+                <w:bCs/>
+                <w:sz w:val="18"/>
+                <w:szCs w:val="18"/>
+              </w:rPr>
+              <w:t>:</w:t>
+            </w:r>
+            <w:r>
+              <w:rPr>
+                <w:sz w:val="18"/>
+                <w:szCs w:val="18"/>
+              </w:rPr>
+              <w:t> 200</w:t>
+            </w:r>
+            <w:r>
+              <w:rPr>
+                <w:sz w:val="18"/>
+                <w:szCs w:val="18"/>
+              </w:rPr>
+              <w:br/>
+              <w:t>Limite máximo de exemplos do split de teste para os quais o modelo gera respostas.</w:t>
+            </w:r>
+          </w:p>
+        </w:tc>
+      </w:tr>
+      <w:tr>
+        <w:tc>
+          <w:tcPr>
+            <w:tcW w:w="0" w:type="auto"/>
+            <w:shd w:val="clear" w:color="auto" w:fill="FFFFFF"/>
+            <w:tcMar>
+              <w:top w:w="75" w:type="dxa"/>
+              <w:left w:w="135" w:type="dxa"/>
+              <w:bottom w:w="75" w:type="dxa"/>
+              <w:right w:w="135" w:type="dxa"/>
+            </w:tcMar>
+            <w:hideMark/>
+          </w:tcPr>
+          <w:p>
+            <w:pPr>
+              <w:spacing w:after="0" w:line="240" w:lineRule="auto"/>
+              <w:rPr>
+                <w:rFonts w:ascii="Consolas" w:eastAsia="Times New Roman" w:hAnsi="Consolas" w:cs="Calibri"/>
+                <w:color w:val="000000"/>
+                <w:kern w:val="0"/>
+                <w:sz w:val="20"/>
+                <w:szCs w:val="20"/>
+                <w:lang w:eastAsia="pt-BR"/>
+                <w14:ligatures w14:val="none"/>
+              </w:rPr>
+            </w:pPr>
+            <w:r>
+              <w:rPr>
+                <w:rFonts w:ascii="Consolas" w:eastAsia="Times New Roman" w:hAnsi="Consolas" w:cs="Calibri"/>
+                <w:color w:val="000000"/>
+                <w:kern w:val="0"/>
+                <w:sz w:val="20"/>
+                <w:szCs w:val="20"/>
+                <w:lang w:eastAsia="pt-BR"/>
+                <w14:ligatures w14:val="none"/>
+              </w:rPr>
+              <w:t>--</w:t>
+            </w:r>
+            <w:proofErr w:type="spellStart"/>
+            <w:r>
+              <w:rPr>
+                <w:rFonts w:ascii="Consolas" w:eastAsia="Times New Roman" w:hAnsi="Consolas" w:cs="Calibri"/>
+                <w:color w:val="000000"/>
+                <w:kern w:val="0"/>
+                <w:sz w:val="20"/>
+                <w:szCs w:val="20"/>
+                <w:lang w:eastAsia="pt-BR"/>
+                <w14:ligatures w14:val="none"/>
+              </w:rPr>
+              <w:t>max</w:t>
+            </w:r>
+            <w:proofErr w:type="spellEnd"/>
+            <w:r>
+              <w:rPr>
+                <w:rFonts w:ascii="Consolas" w:eastAsia="Times New Roman" w:hAnsi="Consolas" w:cs="Calibri"/>
+                <w:color w:val="000000"/>
+                <w:kern w:val="0"/>
+                <w:sz w:val="20"/>
+                <w:szCs w:val="20"/>
+                <w:lang w:eastAsia="pt-BR"/>
+                <w14:ligatures w14:val="none"/>
+              </w:rPr>
+              <w:t>-new-tokens</w:t>
+            </w:r>
+          </w:p>
+        </w:tc>
+        <w:tc>
+          <w:tcPr>
+            <w:tcW w:w="0" w:type="auto"/>
+            <w:shd w:val="clear" w:color="auto" w:fill="FFFFFF"/>
+            <w:tcMar>
+              <w:top w:w="75" w:type="dxa"/>
+              <w:left w:w="135" w:type="dxa"/>
+              <w:bottom w:w="75" w:type="dxa"/>
+              <w:right w:w="135" w:type="dxa"/>
+            </w:tcMar>
+            <w:hideMark/>
+          </w:tcPr>
+          <w:p>
+            <w:pPr>
+              <w:spacing w:after="0" w:line="240" w:lineRule="auto"/>
+              <w:rPr>
+                <w:rFonts w:ascii="Segoe UI" w:eastAsia="Times New Roman" w:hAnsi="Segoe UI" w:cs="Segoe UI"/>
+                <w:color w:val="000000"/>
+                <w:kern w:val="0"/>
+                <w:sz w:val="16"/>
+                <w:szCs w:val="16"/>
+                <w:lang w:eastAsia="pt-BR"/>
+                <w14:ligatures w14:val="none"/>
+              </w:rPr>
+            </w:pPr>
+            <w:r>
+              <w:rPr>
+                <w:rFonts w:ascii="Segoe UI" w:eastAsia="Times New Roman" w:hAnsi="Segoe UI" w:cs="Segoe UI"/>
+                <w:color w:val="000000"/>
+                <w:kern w:val="0"/>
+                <w:sz w:val="16"/>
+                <w:szCs w:val="16"/>
+                <w:lang w:eastAsia="pt-BR"/>
+                <w14:ligatures w14:val="none"/>
+              </w:rPr>
+              <w:t>Entrada</w:t>
+            </w:r>
+          </w:p>
+        </w:tc>
+        <w:tc>
+          <w:tcPr>
+            <w:tcW w:w="0" w:type="auto"/>
+            <w:shd w:val="clear" w:color="auto" w:fill="FFFFFF"/>
+            <w:tcMar>
+              <w:top w:w="75" w:type="dxa"/>
+              <w:left w:w="135" w:type="dxa"/>
+              <w:bottom w:w="75" w:type="dxa"/>
+              <w:right w:w="135" w:type="dxa"/>
+            </w:tcMar>
+            <w:hideMark/>
+          </w:tcPr>
+          <w:p>
+            <w:pPr>
+              <w:rPr>
+                <w:sz w:val="18"/>
+                <w:szCs w:val="18"/>
+              </w:rPr>
+            </w:pPr>
+            <w:r>
+              <w:rPr>
+                <w:b/>
+                <w:bCs/>
+                <w:sz w:val="18"/>
+                <w:szCs w:val="18"/>
+              </w:rPr>
+              <w:t>Padrão</w:t>
+            </w:r>
+            <w:r>
+              <w:rPr>
+                <w:b/>
+                <w:bCs/>
+                <w:sz w:val="18"/>
+                <w:szCs w:val="18"/>
+              </w:rPr>
+              <w:t>:</w:t>
+            </w:r>
+            <w:r>
+              <w:rPr>
+                <w:sz w:val="18"/>
+                <w:szCs w:val="18"/>
+              </w:rPr>
+              <w:t> 256</w:t>
+            </w:r>
+            <w:r>
+              <w:rPr>
+                <w:sz w:val="18"/>
+                <w:szCs w:val="18"/>
+              </w:rPr>
+              <w:br/>
+              <w:t>Teto de tokens novos gerados por exemplo na inferência.</w:t>
+            </w:r>
+          </w:p>
+        </w:tc>
+      </w:tr>
+      <w:tr>
+        <w:tc>
+          <w:tcPr>
+            <w:tcW w:w="0" w:type="auto"/>
+            <w:shd w:val="clear" w:color="auto" w:fill="FFFFFF"/>
+            <w:tcMar>
+              <w:top w:w="75" w:type="dxa"/>
+              <w:left w:w="135" w:type="dxa"/>
+              <w:bottom w:w="75" w:type="dxa"/>
+              <w:right w:w="135" w:type="dxa"/>
+            </w:tcMar>
+            <w:hideMark/>
+          </w:tcPr>
+          <w:p>
+            <w:pPr>
+              <w:spacing w:after="0" w:line="240" w:lineRule="auto"/>
+              <w:rPr>
+                <w:rFonts w:ascii="Consolas" w:eastAsia="Times New Roman" w:hAnsi="Consolas" w:cs="Calibri"/>
+                <w:color w:val="000000"/>
+                <w:kern w:val="0"/>
+                <w:sz w:val="20"/>
+                <w:szCs w:val="20"/>
+                <w:lang w:eastAsia="pt-BR"/>
+                <w14:ligatures w14:val="none"/>
+              </w:rPr>
+            </w:pPr>
+            <w:r>
+              <w:rPr>
+                <w:rFonts w:ascii="Consolas" w:eastAsia="Times New Roman" w:hAnsi="Consolas" w:cs="Calibri"/>
+                <w:color w:val="000000"/>
+                <w:kern w:val="0"/>
+                <w:sz w:val="20"/>
+                <w:szCs w:val="20"/>
+                <w:lang w:eastAsia="pt-BR"/>
+                <w14:ligatures w14:val="none"/>
+              </w:rPr>
+              <w:t>--</w:t>
+            </w:r>
+            <w:proofErr w:type="spellStart"/>
+            <w:r>
+              <w:rPr>
+                <w:rFonts w:ascii="Consolas" w:eastAsia="Times New Roman" w:hAnsi="Consolas" w:cs="Calibri"/>
+                <w:color w:val="000000"/>
+                <w:kern w:val="0"/>
+                <w:sz w:val="20"/>
+                <w:szCs w:val="20"/>
+                <w:lang w:eastAsia="pt-BR"/>
+                <w14:ligatures w14:val="none"/>
+              </w:rPr>
+              <w:t>temperature</w:t>
+            </w:r>
+            <w:proofErr w:type="spellEnd"/>
+          </w:p>
+        </w:tc>
+        <w:tc>
+          <w:tcPr>
+            <w:tcW w:w="0" w:type="auto"/>
+            <w:shd w:val="clear" w:color="auto" w:fill="FFFFFF"/>
+            <w:tcMar>
+              <w:top w:w="75" w:type="dxa"/>
+              <w:left w:w="135" w:type="dxa"/>
+              <w:bottom w:w="75" w:type="dxa"/>
+              <w:right w:w="135" w:type="dxa"/>
+            </w:tcMar>
+            <w:hideMark/>
+          </w:tcPr>
+          <w:p>
+            <w:pPr>
+              <w:spacing w:after="0" w:line="240" w:lineRule="auto"/>
+              <w:rPr>
+                <w:rFonts w:ascii="Segoe UI" w:eastAsia="Times New Roman" w:hAnsi="Segoe UI" w:cs="Segoe UI"/>
+                <w:color w:val="000000"/>
+                <w:kern w:val="0"/>
+                <w:sz w:val="16"/>
+                <w:szCs w:val="16"/>
+                <w:lang w:eastAsia="pt-BR"/>
+                <w14:ligatures w14:val="none"/>
+              </w:rPr>
+            </w:pPr>
+            <w:r>
+              <w:rPr>
+                <w:rFonts w:ascii="Segoe UI" w:eastAsia="Times New Roman" w:hAnsi="Segoe UI" w:cs="Segoe UI"/>
+                <w:color w:val="000000"/>
+                <w:kern w:val="0"/>
+                <w:sz w:val="16"/>
+                <w:szCs w:val="16"/>
+                <w:lang w:eastAsia="pt-BR"/>
+                <w14:ligatures w14:val="none"/>
+              </w:rPr>
+              <w:t>Entrada</w:t>
+            </w:r>
+          </w:p>
+        </w:tc>
+        <w:tc>
+          <w:tcPr>
+            <w:tcW w:w="0" w:type="auto"/>
+            <w:shd w:val="clear" w:color="auto" w:fill="FFFFFF"/>
+            <w:tcMar>
+              <w:top w:w="75" w:type="dxa"/>
+              <w:left w:w="135" w:type="dxa"/>
+              <w:bottom w:w="75" w:type="dxa"/>
+              <w:right w:w="135" w:type="dxa"/>
+            </w:tcMar>
+            <w:hideMark/>
+          </w:tcPr>
+          <w:p>
+            <w:pPr>
+              <w:rPr>
+                <w:sz w:val="18"/>
+                <w:szCs w:val="18"/>
+              </w:rPr>
+            </w:pPr>
+            <w:r>
+              <w:rPr>
+                <w:b/>
+                <w:bCs/>
+                <w:sz w:val="18"/>
+                <w:szCs w:val="18"/>
+              </w:rPr>
+              <w:t>Padrão</w:t>
+            </w:r>
+            <w:r>
+              <w:rPr>
+                <w:b/>
+                <w:bCs/>
+                <w:sz w:val="18"/>
+                <w:szCs w:val="18"/>
+              </w:rPr>
+              <w:t>:</w:t>
+            </w:r>
+            <w:r>
+              <w:rPr>
+                <w:sz w:val="18"/>
+                <w:szCs w:val="18"/>
+              </w:rPr>
+              <w:t> 0.0</w:t>
+            </w:r>
+            <w:r>
+              <w:rPr>
+                <w:sz w:val="18"/>
+                <w:szCs w:val="18"/>
+              </w:rPr>
+              <w:br/>
+              <w:t>Temperatura do </w:t>
+            </w:r>
+            <w:proofErr w:type="spellStart"/>
+            <w:r>
+              <w:rPr>
+                <w:sz w:val="18"/>
+                <w:szCs w:val="18"/>
+              </w:rPr>
+              <w:t>generate</w:t>
+            </w:r>
+            <w:proofErr w:type="spellEnd"/>
+            <w:r>
+              <w:rPr>
+                <w:sz w:val="18"/>
+                <w:szCs w:val="18"/>
+              </w:rPr>
+              <w:t xml:space="preserve">; 0.0 corresponde a decodificação </w:t>
+            </w:r>
+            <w:proofErr w:type="spellStart"/>
+            <w:r>
+              <w:rPr>
+                <w:sz w:val="18"/>
+                <w:szCs w:val="18"/>
+              </w:rPr>
+              <w:t>greedy</w:t>
+            </w:r>
+            <w:proofErr w:type="spellEnd"/>
+            <w:r>
+              <w:rPr>
+                <w:sz w:val="18"/>
+                <w:szCs w:val="18"/>
+              </w:rPr>
+              <w:t>.</w:t>
+            </w:r>
+          </w:p>
+        </w:tc>
+      </w:tr>
+      <w:tr>
+        <w:tc>
+          <w:tcPr>
+            <w:tcW w:w="0" w:type="auto"/>
+            <w:shd w:val="clear" w:color="auto" w:fill="FFFFFF"/>
+            <w:tcMar>
+              <w:top w:w="75" w:type="dxa"/>
+              <w:left w:w="135" w:type="dxa"/>
+              <w:bottom w:w="75" w:type="dxa"/>
+              <w:right w:w="135" w:type="dxa"/>
+            </w:tcMar>
+            <w:hideMark/>
+          </w:tcPr>
+          <w:p>
+            <w:pPr>
+              <w:spacing w:after="0" w:line="240" w:lineRule="auto"/>
+              <w:rPr>
+                <w:rFonts w:ascii="Consolas" w:eastAsia="Times New Roman" w:hAnsi="Consolas" w:cs="Calibri"/>
+                <w:color w:val="000000"/>
+                <w:kern w:val="0"/>
+                <w:sz w:val="20"/>
+                <w:szCs w:val="20"/>
+                <w:lang w:eastAsia="pt-BR"/>
+                <w14:ligatures w14:val="none"/>
+              </w:rPr>
+            </w:pPr>
+            <w:r>
+              <w:rPr>
+                <w:rFonts w:ascii="Consolas" w:eastAsia="Times New Roman" w:hAnsi="Consolas" w:cs="Calibri"/>
+                <w:color w:val="000000"/>
+                <w:kern w:val="0"/>
+                <w:sz w:val="20"/>
+                <w:szCs w:val="20"/>
+                <w:lang w:eastAsia="pt-BR"/>
+                <w14:ligatures w14:val="none"/>
+              </w:rPr>
+              <w:t>--compute-</w:t>
+            </w:r>
+            <w:proofErr w:type="spellStart"/>
+            <w:r>
+              <w:rPr>
+                <w:rFonts w:ascii="Consolas" w:eastAsia="Times New Roman" w:hAnsi="Consolas" w:cs="Calibri"/>
+                <w:color w:val="000000"/>
+                <w:kern w:val="0"/>
+                <w:sz w:val="20"/>
+                <w:szCs w:val="20"/>
+                <w:lang w:eastAsia="pt-BR"/>
+                <w14:ligatures w14:val="none"/>
+              </w:rPr>
+              <w:t>bertscore</w:t>
+            </w:r>
+            <w:proofErr w:type="spellEnd"/>
+          </w:p>
+        </w:tc>
+        <w:tc>
+          <w:tcPr>
+            <w:tcW w:w="0" w:type="auto"/>
+            <w:shd w:val="clear" w:color="auto" w:fill="FFFFFF"/>
+            <w:tcMar>
+              <w:top w:w="75" w:type="dxa"/>
+              <w:left w:w="135" w:type="dxa"/>
+              <w:bottom w:w="75" w:type="dxa"/>
+              <w:right w:w="135" w:type="dxa"/>
+            </w:tcMar>
+            <w:hideMark/>
+          </w:tcPr>
+          <w:p>
+            <w:pPr>
+              <w:spacing w:after="0" w:line="240" w:lineRule="auto"/>
+              <w:rPr>
+                <w:rFonts w:ascii="Segoe UI" w:eastAsia="Times New Roman" w:hAnsi="Segoe UI" w:cs="Segoe UI"/>
+                <w:color w:val="000000"/>
+                <w:kern w:val="0"/>
+                <w:sz w:val="16"/>
+                <w:szCs w:val="16"/>
+                <w:lang w:eastAsia="pt-BR"/>
+                <w14:ligatures w14:val="none"/>
+              </w:rPr>
+            </w:pPr>
+            <w:r>
+              <w:rPr>
+                <w:rFonts w:ascii="Segoe UI" w:eastAsia="Times New Roman" w:hAnsi="Segoe UI" w:cs="Segoe UI"/>
+                <w:color w:val="000000"/>
+                <w:kern w:val="0"/>
+                <w:sz w:val="16"/>
+                <w:szCs w:val="16"/>
+                <w:lang w:eastAsia="pt-BR"/>
+                <w14:ligatures w14:val="none"/>
+              </w:rPr>
+              <w:t>Entrada</w:t>
+            </w:r>
+          </w:p>
+        </w:tc>
+        <w:tc>
+          <w:tcPr>
+            <w:tcW w:w="0" w:type="auto"/>
+            <w:shd w:val="clear" w:color="auto" w:fill="FFFFFF"/>
+            <w:tcMar>
+              <w:top w:w="75" w:type="dxa"/>
+              <w:left w:w="135" w:type="dxa"/>
+              <w:bottom w:w="75" w:type="dxa"/>
+              <w:right w:w="135" w:type="dxa"/>
+            </w:tcMar>
+            <w:hideMark/>
+          </w:tcPr>
+          <w:p>
+            <w:pPr>
+              <w:rPr>
+                <w:sz w:val="18"/>
+                <w:szCs w:val="18"/>
+              </w:rPr>
+            </w:pPr>
+            <w:r>
+              <w:rPr>
+                <w:b/>
+                <w:bCs/>
+                <w:sz w:val="18"/>
+                <w:szCs w:val="18"/>
+              </w:rPr>
+              <w:t>Padrão</w:t>
+            </w:r>
+            <w:r>
+              <w:rPr>
+                <w:b/>
+                <w:bCs/>
+                <w:sz w:val="18"/>
+                <w:szCs w:val="18"/>
+              </w:rPr>
+              <w:t>:</w:t>
+            </w:r>
+            <w:r>
+              <w:rPr>
+                <w:sz w:val="18"/>
+                <w:szCs w:val="18"/>
+              </w:rPr>
+              <w:t> False (só vira </w:t>
+            </w:r>
+            <w:proofErr w:type="spellStart"/>
+            <w:r>
+              <w:rPr>
+                <w:sz w:val="18"/>
+                <w:szCs w:val="18"/>
+              </w:rPr>
+              <w:t>True</w:t>
+            </w:r>
+            <w:proofErr w:type="spellEnd"/>
+            <w:r>
+              <w:rPr>
+                <w:sz w:val="18"/>
+                <w:szCs w:val="18"/>
+              </w:rPr>
+              <w:t> se a flag for passada)</w:t>
+            </w:r>
+            <w:r>
+              <w:rPr>
+                <w:sz w:val="18"/>
+                <w:szCs w:val="18"/>
+              </w:rPr>
+              <w:br/>
+              <w:t xml:space="preserve">Se ativada, calcula </w:t>
+            </w:r>
+            <w:proofErr w:type="spellStart"/>
+            <w:r>
+              <w:rPr>
+                <w:sz w:val="18"/>
+                <w:szCs w:val="18"/>
+              </w:rPr>
+              <w:t>BERTScore</w:t>
+            </w:r>
+            <w:proofErr w:type="spellEnd"/>
+            <w:r>
+              <w:rPr>
+                <w:sz w:val="18"/>
+                <w:szCs w:val="18"/>
+              </w:rPr>
+              <w:t xml:space="preserve"> quando a biblioteca estiver disponível.</w:t>
+            </w:r>
+          </w:p>
+        </w:tc>
+      </w:tr>
+    </w:tbl>
+    <w:p/>
+    <w:p>
+      <w:r>
+        <w:rPr>
+          <w:b/>
+          <w:bCs/>
+        </w:rPr>
+        <w:t>Arquivos gerados</w:t>
+      </w:r>
+    </w:p>
+    <w:tbl>
+      <w:tblPr>
+        <w:tblW w:w="0" w:type="auto"/>
+        <w:tblBorders>
+          <w:top w:val="single" w:sz="12" w:space="0" w:color="auto"/>
+          <w:left w:val="single" w:sz="12" w:space="0" w:color="auto"/>
+          <w:bottom w:val="single" w:sz="12" w:space="0" w:color="auto"/>
+          <w:right w:val="single" w:sz="12" w:space="0" w:color="auto"/>
+          <w:insideH w:val="single" w:sz="12" w:space="0" w:color="auto"/>
+          <w:insideV w:val="single" w:sz="12" w:space="0" w:color="auto"/>
+        </w:tblBorders>
+        <w:shd w:val="clear" w:color="auto" w:fill="FFFFFF"/>
+        <w:tblCellMar>
+          <w:top w:w="15" w:type="dxa"/>
+          <w:left w:w="15" w:type="dxa"/>
+          <w:bottom w:w="15" w:type="dxa"/>
+          <w:right w:w="15" w:type="dxa"/>
+        </w:tblCellMar>
+        <w:tblLook w:val="04A0" w:firstRow="1" w:lastRow="0" w:firstColumn="1" w:lastColumn="0" w:noHBand="0" w:noVBand="1"/>
+      </w:tblPr>
+      <w:tblGrid>
+        <w:gridCol w:w="2930"/>
+        <w:gridCol w:w="5544"/>
+      </w:tblGrid>
+      <w:tr>
+        <w:trPr>
+          <w:tblHeader/>
+        </w:trPr>
+        <w:tc>
+          <w:tcPr>
+            <w:tcW w:w="0" w:type="auto"/>
+            <w:shd w:val="clear" w:color="auto" w:fill="FFFFFF"/>
+            <w:noWrap/>
+            <w:tcMar>
+              <w:top w:w="75" w:type="dxa"/>
+              <w:left w:w="135" w:type="dxa"/>
+              <w:bottom w:w="75" w:type="dxa"/>
+              <w:right w:w="135" w:type="dxa"/>
+            </w:tcMar>
+            <w:hideMark/>
+          </w:tcPr>
+          <w:p>
+            <w:pPr>
+              <w:rPr>
+                <w:b/>
+                <w:bCs/>
+              </w:rPr>
+            </w:pPr>
+            <w:r>
+              <w:rPr>
+                <w:b/>
+                <w:bCs/>
+              </w:rPr>
+              <w:lastRenderedPageBreak/>
+              <w:t>Arquivo</w:t>
+            </w:r>
+          </w:p>
+        </w:tc>
+        <w:tc>
+          <w:tcPr>
+            <w:tcW w:w="0" w:type="auto"/>
+            <w:shd w:val="clear" w:color="auto" w:fill="FFFFFF"/>
+            <w:noWrap/>
+            <w:tcMar>
+              <w:top w:w="75" w:type="dxa"/>
+              <w:left w:w="135" w:type="dxa"/>
+              <w:bottom w:w="75" w:type="dxa"/>
+              <w:right w:w="135" w:type="dxa"/>
+            </w:tcMar>
+            <w:hideMark/>
+          </w:tcPr>
+          <w:p>
+            <w:pPr>
+              <w:rPr>
+                <w:b/>
+                <w:bCs/>
+              </w:rPr>
+            </w:pPr>
+            <w:r>
+              <w:rPr>
+                <w:b/>
+                <w:bCs/>
+              </w:rPr>
+              <w:t>Função</w:t>
+            </w:r>
+          </w:p>
+        </w:tc>
+      </w:tr>
+      <w:tr>
+        <w:tc>
+          <w:tcPr>
+            <w:tcW w:w="0" w:type="auto"/>
+            <w:shd w:val="clear" w:color="auto" w:fill="FFFFFF"/>
+            <w:tcMar>
+              <w:top w:w="75" w:type="dxa"/>
+              <w:left w:w="135" w:type="dxa"/>
+              <w:bottom w:w="75" w:type="dxa"/>
+              <w:right w:w="135" w:type="dxa"/>
+            </w:tcMar>
+            <w:hideMark/>
+          </w:tcPr>
+          <w:p>
+            <w:proofErr w:type="spellStart"/>
+            <w:r>
+              <w:t>evaluation_</w:t>
+            </w:r>
+            <w:proofErr w:type="gramStart"/>
+            <w:r>
+              <w:t>summary.json</w:t>
+            </w:r>
+            <w:proofErr w:type="spellEnd"/>
+            <w:proofErr w:type="gramEnd"/>
+          </w:p>
+        </w:tc>
+        <w:tc>
+          <w:tcPr>
+            <w:tcW w:w="0" w:type="auto"/>
+            <w:shd w:val="clear" w:color="auto" w:fill="FFFFFF"/>
+            <w:tcMar>
+              <w:top w:w="75" w:type="dxa"/>
+              <w:left w:w="135" w:type="dxa"/>
+              <w:bottom w:w="75" w:type="dxa"/>
+              <w:right w:w="135" w:type="dxa"/>
+            </w:tcMar>
+            <w:hideMark/>
+          </w:tcPr>
+          <w:p>
+            <w:r>
+              <w:t>Relatório agregado da avaliação: identificação do modelo (</w:t>
+            </w:r>
+            <w:proofErr w:type="spellStart"/>
+            <w:r>
+              <w:t>adapter_dir</w:t>
+            </w:r>
+            <w:proofErr w:type="spellEnd"/>
+            <w:r>
+              <w:t>, </w:t>
+            </w:r>
+            <w:proofErr w:type="spellStart"/>
+            <w:r>
+              <w:t>base_model_name</w:t>
+            </w:r>
+            <w:proofErr w:type="spellEnd"/>
+            <w:r>
+              <w:t>), dataset (</w:t>
+            </w:r>
+            <w:proofErr w:type="spellStart"/>
+            <w:r>
+              <w:t>dataset_dir</w:t>
+            </w:r>
+            <w:proofErr w:type="spellEnd"/>
+            <w:r>
+              <w:t>, </w:t>
+            </w:r>
+            <w:proofErr w:type="spellStart"/>
+            <w:r>
+              <w:t>manifest_path</w:t>
+            </w:r>
+            <w:proofErr w:type="spellEnd"/>
+            <w:r>
+              <w:t>, </w:t>
+            </w:r>
+            <w:proofErr w:type="spellStart"/>
+            <w:r>
+              <w:t>evaluated_samples</w:t>
+            </w:r>
+            <w:proofErr w:type="spellEnd"/>
+            <w:r>
+              <w:t xml:space="preserve">), métricas médias (Token-F1, ROUGE-L, bloco opcional de </w:t>
+            </w:r>
+            <w:proofErr w:type="spellStart"/>
+            <w:r>
+              <w:t>BERTScore</w:t>
+            </w:r>
+            <w:proofErr w:type="spellEnd"/>
+            <w:r>
+              <w:t>), indicadores de segurança (taxas de cautela e excesso de confiança, casos de alto risco, cobertura de cautela) e médias de ROUGE-L por fatias (</w:t>
+            </w:r>
+            <w:proofErr w:type="spellStart"/>
+            <w:r>
+              <w:t>question_type</w:t>
+            </w:r>
+            <w:proofErr w:type="spellEnd"/>
+            <w:r>
+              <w:t xml:space="preserve">, comprimento da pergunta, </w:t>
+            </w:r>
+            <w:proofErr w:type="spellStart"/>
+            <w:r>
+              <w:t>bucket</w:t>
+            </w:r>
+            <w:proofErr w:type="spellEnd"/>
+            <w:r>
+              <w:t xml:space="preserve"> de condição).</w:t>
+            </w:r>
+          </w:p>
+        </w:tc>
+      </w:tr>
+      <w:tr>
+        <w:tc>
+          <w:tcPr>
+            <w:tcW w:w="0" w:type="auto"/>
+            <w:shd w:val="clear" w:color="auto" w:fill="FFFFFF"/>
+            <w:tcMar>
+              <w:top w:w="75" w:type="dxa"/>
+              <w:left w:w="135" w:type="dxa"/>
+              <w:bottom w:w="75" w:type="dxa"/>
+              <w:right w:w="135" w:type="dxa"/>
+            </w:tcMar>
+            <w:hideMark/>
+          </w:tcPr>
+          <w:p>
+            <w:proofErr w:type="spellStart"/>
+            <w:proofErr w:type="gramStart"/>
+            <w:r>
+              <w:t>predictions.jsonl</w:t>
+            </w:r>
+            <w:proofErr w:type="spellEnd"/>
+            <w:proofErr w:type="gramEnd"/>
+          </w:p>
+        </w:tc>
+        <w:tc>
+          <w:tcPr>
+            <w:tcW w:w="0" w:type="auto"/>
+            <w:shd w:val="clear" w:color="auto" w:fill="FFFFFF"/>
+            <w:tcMar>
+              <w:top w:w="75" w:type="dxa"/>
+              <w:left w:w="135" w:type="dxa"/>
+              <w:bottom w:w="75" w:type="dxa"/>
+              <w:right w:w="135" w:type="dxa"/>
+            </w:tcMar>
+            <w:hideMark/>
+          </w:tcPr>
+          <w:p>
+            <w:r>
+              <w:t>Uma linha JSON por exemplo avaliado: pergunta, resposta de referência, resposta gerada, Token-F1 e ROUGE-L daquele par, metadados (</w:t>
+            </w:r>
+            <w:proofErr w:type="spellStart"/>
+            <w:r>
+              <w:t>question_type</w:t>
+            </w:r>
+            <w:proofErr w:type="spellEnd"/>
+            <w:r>
+              <w:t>, </w:t>
+            </w:r>
+            <w:proofErr w:type="spellStart"/>
+            <w:r>
+              <w:t>condition</w:t>
+            </w:r>
+            <w:proofErr w:type="spellEnd"/>
+            <w:r>
+              <w:t xml:space="preserve">, </w:t>
+            </w:r>
+            <w:proofErr w:type="spellStart"/>
+            <w:r>
+              <w:t>buckets</w:t>
+            </w:r>
+            <w:proofErr w:type="spellEnd"/>
+            <w:r>
+              <w:t>), categorias de risco detectadas na pergunta e flags booleanas de linguagem de cautela e de excesso de confiança na predição.</w:t>
+            </w:r>
+          </w:p>
+        </w:tc>
+      </w:tr>
+    </w:tbl>
+    <w:p/>
     <w:p/>
     <w:p>
       <w:r>
@@ -19548,7 +21460,7 @@
   <w:style w:type="paragraph" w:default="1" w:styleId="Normal">
     <w:name w:val="Normal"/>
     <w:qFormat/>
-    <w:rsid w:val="00BC2B1D"/>
+    <w:rsid w:val="00297F1C"/>
   </w:style>
   <w:style w:type="paragraph" w:styleId="Ttulo1">
     <w:name w:val="heading 1"/>

</xml_diff>